<commit_message>
LDM sociale : template corrige (fichier Word invalide)
Deux bugs de construction du template corrompaient le .docx genere :
1. Les 2 controles "entreprise" etaient des sdt de niveau BLOC (englobant
   tout le paragraphe) : remplaces par un run nu -> run orphelin au niveau
   du body, structure OOXML invalide.
2. La borne de depart du remplacement CP+ville utilisait rfind("<w:r") qui
   matchait aussi <w:rPr> -> coupure au milieu d'un run.

Reconstruction avec appariement sdt equilibre, reconstruction de paragraphe
complet (pPr conserve) pour les sdt bloc, et frontiere de run stricte.
Valide : XML bien forme, body sans enfant illegal, et OUVERTURE REELLE dans
Word via COM (180 paragraphes, salutation/adresse/denomination correctes).
</commit_message>
<xml_diff>
--- a/lib/templates/ldm-sociale.docx
+++ b/lib/templates/ldm-sociale.docx
@@ -1,6 +1,3178 @@
 
-<file path=word/document.xml><?xml version="1.0" encoding="UTF-8" standalone="yes"?>
-<w:document xmlns:wpc="http://schemas.microsoft.com/office/word/2010/wordprocessingCanvas" xmlns:cx="http://schemas.microsoft.com/office/drawing/2014/chartex" xmlns:cx1="http://schemas.microsoft.com/office/drawing/2015/9/8/chartex" xmlns:cx2="http://schemas.microsoft.com/office/drawing/2015/10/21/chartex" xmlns:cx3="http://schemas.microsoft.com/office/drawing/2016/5/9/chartex" xmlns:cx4="http://schemas.microsoft.com/office/drawing/2016/5/10/chartex" xmlns:cx5="http://schemas.microsoft.com/office/drawing/2016/5/11/chartex" xmlns:cx6="http://schemas.microsoft.com/office/drawing/2016/5/12/chartex" xmlns:cx7="http://schemas.microsoft.com/office/drawing/2016/5/13/chartex" xmlns:cx8="http://schemas.microsoft.com/office/drawing/2016/5/14/chartex" xmlns:mc="http://schemas.openxmlformats.org/markup-compatibility/2006" xmlns:aink="http://schemas.microsoft.com/office/drawing/2016/ink" xmlns:am3d="http://schemas.microsoft.com/office/drawing/2017/model3d" xmlns:o="urn:schemas-microsoft-com:office:office" xmlns:oel="http://schemas.microsoft.com/office/2019/extlst" xmlns:r="http://schemas.openxmlformats.org/officeDocument/2006/relationships" xmlns:m="http://schemas.openxmlformats.org/officeDocument/2006/math" xmlns:v="urn:schemas-microsoft-com:vml" xmlns:wp14="http://schemas.microsoft.com/office/word/2010/wordprocessingDrawing" xmlns:wp="http://schemas.openxmlformats.org/drawingml/2006/wordprocessingDrawing" xmlns:w10="urn:schemas-microsoft-com:office:word" xmlns:w="http://schemas.openxmlformats.org/wordprocessingml/2006/main" xmlns:w14="http://schemas.microsoft.com/office/word/2010/wordml" xmlns:w15="http://schemas.microsoft.com/office/word/2012/wordml" xmlns:w16cex="http://schemas.microsoft.com/office/word/2018/wordml/cex" xmlns:w16cid="http://schemas.microsoft.com/office/word/2016/wordml/cid" xmlns:w16="http://schemas.microsoft.com/office/word/2018/wordml" xmlns:w16du="http://schemas.microsoft.com/office/word/2023/wordml/word16du" xmlns:w16sdtdh="http://schemas.microsoft.com/office/word/2020/wordml/sdtdatahash" xmlns:w16sdtfl="http://schemas.microsoft.com/office/word/2024/wordml/sdtformatlock" xmlns:w16se="http://schemas.microsoft.com/office/word/2015/wordml/symex" xmlns:wpg="http://schemas.microsoft.com/office/word/2010/wordprocessingGroup" xmlns:wpi="http://schemas.microsoft.com/office/word/2010/wordprocessingInk" xmlns:wne="http://schemas.microsoft.com/office/word/2006/wordml" xmlns:wps="http://schemas.microsoft.com/office/word/2010/wordprocessingShape" mc:Ignorable="w14 w15 w16se w16cid w16 w16cex w16sdtdh w16sdtfl w16du wp14"><w:body><w:p><w:pPr><w:rPr><w:rFonts w:cstheme="majorHAnsi"/></w:rPr></w:pPr><w:r><w:rPr><w:rFonts w:cstheme="majorHAnsi"/><w:noProof/></w:rPr><w:drawing><wp:anchor distT="0" distB="0" distL="114300" distR="114300" simplePos="0" relativeHeight="251655171" behindDoc="0" locked="0" layoutInCell="1" allowOverlap="1" wp14:anchorId="52F6E983" wp14:editId="36D5844A"><wp:simplePos x="0" y="0"/><wp:positionH relativeFrom="column"><wp:posOffset>537</wp:posOffset></wp:positionH><wp:positionV relativeFrom="paragraph"><wp:posOffset>-76835</wp:posOffset></wp:positionV><wp:extent cx="971522" cy="971522"/><wp:effectExtent l="0" t="0" r="635" b="635"/><wp:wrapNone/><wp:docPr id="1981114389" name="Image 1571138217"/><wp:cNvGraphicFramePr><a:graphicFrameLocks xmlns:a="http://schemas.openxmlformats.org/drawingml/2006/main" noChangeAspect="1"/></wp:cNvGraphicFramePr><a:graphic xmlns:a="http://schemas.openxmlformats.org/drawingml/2006/main"><a:graphicData uri="http://schemas.openxmlformats.org/drawingml/2006/picture"><pic:pic xmlns:pic="http://schemas.openxmlformats.org/drawingml/2006/picture"><pic:nvPicPr><pic:cNvPr id="1981114389" name="Image 1571138217"/><pic:cNvPicPr><a:picLocks noChangeAspect="1"/></pic:cNvPicPr></pic:nvPicPr><pic:blipFill><a:blip r:embed="rId12"/><a:srcRect/><a:stretch/></pic:blipFill><pic:spPr bwMode="auto"><a:xfrm><a:off x="0" y="0"/><a:ext cx="971522" cy="971522"/></a:xfrm><a:prstGeom prst="rect"><a:avLst/></a:prstGeom><a:noFill/><a:ln><a:noFill/></a:ln></pic:spPr></pic:pic></a:graphicData></a:graphic></wp:anchor></w:drawing></w:r></w:p><w:p><w:pPr><w:rPr><w:rFonts w:cstheme="majorHAnsi"/></w:rPr></w:pPr></w:p><w:p><w:pPr><w:rPr><w:rFonts w:cstheme="majorHAnsi"/></w:rPr></w:pPr></w:p><w:p><w:pPr><w:rPr><w:rFonts w:cstheme="majorHAnsi"/></w:rPr></w:pPr></w:p><w:p><w:pPr><w:rPr><w:rFonts w:cstheme="majorHAnsi"/></w:rPr></w:pPr></w:p><w:p><w:pPr><w:rPr><w:rFonts w:cstheme="majorHAnsi"/></w:rPr></w:pPr></w:p><w:p><w:pPr><w:tabs><w:tab w:val="center" w:pos="4537"/></w:tabs><w:rPr><w:rFonts w:cstheme="majorHAnsi"/><w:b/><w:bCs/><w:sz w:val="24"/><w:szCs w:val="22"/></w:rPr></w:pPr><w:r><w:rPr><w:rFonts w:cstheme="majorHAnsi"/><w:b/><w:bCs/><w:sz w:val="24"/><w:szCs w:val="22"/></w:rPr><w:t>MOON Expertise</w:t></w:r><w:r><w:rPr><w:rFonts w:cstheme="majorHAnsi"/><w:b/><w:bCs/><w:sz w:val="24"/><w:szCs w:val="22"/></w:rPr><w:tab/></w:r></w:p><w:p><w:pPr><w:rPr><w:rFonts w:cstheme="majorHAnsi"/><w:sz w:val="24"/><w:szCs w:val="22"/></w:rPr></w:pPr><w:r><w:rPr><w:rFonts w:cstheme="majorHAnsi"/><w:sz w:val="24"/><w:szCs w:val="22"/></w:rPr><w:t xml:space="preserve">6 rue Adolphe Yvon, </w:t></w:r></w:p><w:p><w:pPr><w:rPr><w:rFonts w:cstheme="majorHAnsi"/><w:sz w:val="24"/><w:szCs w:val="22"/></w:rPr></w:pPr><w:r><w:rPr><w:rFonts w:cstheme="majorHAnsi"/><w:sz w:val="24"/><w:szCs w:val="22"/></w:rPr><w:t>75116 Paris</w:t></w:r></w:p><w:p><w:pPr><w:rPr><w:rFonts w:cstheme="majorHAnsi"/></w:rPr></w:pPr></w:p><w:r><w:rPr><w:rFonts w:cstheme="majorHAnsi"/><w:b/><w:bCs/></w:rPr><w:t xml:space="preserve">{Societe}</w:t></w:r><w:p><w:pPr><w:rPr><w:rFonts w:cstheme="majorHAnsi"/><w:b/><w:bCs/></w:rPr></w:pPr><w:r><w:rPr><w:rFonts w:cstheme="majorHAnsi"/></w:rPr><w:tab/></w:r><w:r><w:rPr><w:rFonts w:cstheme="majorHAnsi"/></w:rPr><w:tab/></w:r><w:r><w:rPr><w:rFonts w:cstheme="majorHAnsi"/></w:rPr><w:tab/></w:r><w:r><w:rPr><w:rFonts w:cstheme="majorHAnsi"/></w:rPr><w:tab/></w:r><w:r><w:rPr><w:rFonts w:cstheme="majorHAnsi"/></w:rPr><w:tab/></w:r><w:r><w:rPr><w:rFonts w:cstheme="majorHAnsi"/></w:rPr><w:tab/></w:r><w:r><w:rPr><w:rFonts w:cstheme="majorHAnsi"/><w:b/><w:bCs/></w:rPr><w:t xml:space="preserve">{Prenom} {Nom}</w:t></w:r><w:r><w:rPr><w:rFonts w:cstheme="majorHAnsi"/><w:b/><w:bCs/></w:rPr><w:t>,</w:t></w:r></w:p><w:p><w:pPr><w:rPr><w:rFonts w:cstheme="majorHAnsi"/></w:rPr></w:pPr><w:r><w:rPr><w:rFonts w:cstheme="majorHAnsi"/></w:rPr><w:tab/></w:r><w:r><w:rPr><w:rFonts w:cstheme="majorHAnsi"/></w:rPr><w:tab/></w:r><w:r><w:rPr><w:rFonts w:cstheme="majorHAnsi"/></w:rPr><w:tab/></w:r><w:r><w:rPr><w:rFonts w:cstheme="majorHAnsi"/></w:rPr><w:tab/></w:r><w:r><w:rPr><w:rFonts w:cstheme="majorHAnsi"/></w:rPr><w:tab/></w:r><w:r><w:rPr><w:rFonts w:cstheme="majorHAnsi"/></w:rPr><w:tab/></w:r><w:r><w:rPr><w:rFonts w:cstheme="majorHAnsi"/></w:rPr><w:t xml:space="preserve">{Adresse_Siege},</w:t></w:r></w:p><w:p><w:pPr><w:rPr><w:rFonts w:cstheme="majorHAnsi"/></w:rPr></w:pPr><w:r><w:rPr><w:rFonts w:cstheme="majorHAnsi"/></w:rPr><w:tab/></w:r><w:r><w:rPr><w:rFonts w:cstheme="majorHAnsi"/></w:rPr><w:tab/></w:r><w:r><w:rPr><w:rFonts w:cstheme="majorHAnsi"/></w:rPr><w:tab/></w:r><w:r><w:rPr><w:rFonts w:cstheme="majorHAnsi"/></w:rPr><w:tab/></w:r><w:r><w:rPr><w:rFonts w:cstheme="majorHAnsi"/></w:rPr><w:tab/></w:r><w:r><w:rPr><w:rFonts w:cstheme="majorHAnsi"/></w:rPr><w:tab/></w:r><w:r><w:rPr><w:r><w:rPr><w:rFonts w:cstheme="majorHAnsi"/></w:rPr><w:t xml:space="preserve">{Code_postal} {Ville}</w:t></w:r></w:p><w:p><w:pPr><w:rPr><w:rFonts w:cstheme="majorHAnsi"/></w:rPr></w:pPr></w:p><w:p><w:pPr><w:rPr><w:rFonts w:cstheme="majorHAnsi"/></w:rPr></w:pPr><w:r><w:rPr><w:rFonts w:cstheme="majorHAnsi"/></w:rPr><w:tab/></w:r><w:r><w:rPr><w:rFonts w:cstheme="majorHAnsi"/></w:rPr><w:tab/></w:r><w:r><w:rPr><w:rFonts w:cstheme="majorHAnsi"/></w:rPr><w:tab/></w:r><w:r><w:rPr><w:rFonts w:cstheme="majorHAnsi"/></w:rPr><w:tab/></w:r><w:r><w:rPr><w:rFonts w:cstheme="majorHAnsi"/></w:rPr><w:tab/></w:r><w:r><w:rPr><w:rFonts w:cstheme="majorHAnsi"/></w:rPr><w:tab/></w:r><w:r><w:rPr><w:rFonts w:cstheme="majorHAnsi"/></w:rPr><w:t>A Paris</w:t></w:r><w:r><w:rPr><w:rFonts w:cstheme="majorHAnsi"/></w:rPr><w:t xml:space="preserve">, le </w:t></w:r><w:r><w:rPr><w:rFonts w:cstheme="majorHAnsi"/></w:rPr><w:fldChar w:fldCharType="begin"/></w:r><w:r><w:rPr><w:rFonts w:cstheme="majorHAnsi"/></w:rPr><w:instrText xml:space="preserve"> DATE  \@ "d MMMM yyyy"  \* MERGEFORMAT </w:instrText></w:r><w:r><w:rPr><w:rFonts w:cstheme="majorHAnsi"/></w:rPr><w:fldChar w:fldCharType="separate"/></w:r><w:r><w:rPr><w:rFonts w:cstheme="majorHAnsi"/><w:noProof/></w:rPr><w:t>23 juillet 2026</w:t></w:r><w:r><w:rPr><w:rFonts w:cstheme="majorHAnsi"/></w:rPr><w:fldChar w:fldCharType="end"/></w:r><w:r><w:rPr><w:rFonts w:cstheme="majorHAnsi"/></w:rPr><w:t>,</w:t></w:r></w:p><w:p><w:pPr><w:rPr><w:rFonts w:cstheme="majorHAnsi"/></w:rPr></w:pPr></w:p><w:p><w:pPr><w:rPr><w:rFonts w:cstheme="majorHAnsi"/></w:rPr></w:pPr></w:p><w:p><w:pPr><w:rPr><w:rFonts w:cstheme="majorHAnsi"/></w:rPr></w:pPr><w:r><w:rPr><w:rFonts w:cstheme="majorHAnsi"/></w:rPr><w:t>{Cher}</w:t></w:r><w:r><w:rPr><w:rFonts w:cstheme="majorHAnsi"/></w:rPr><w:t xml:space="preserve"> </w:t></w:r><w:r><w:rPr><w:rFonts w:cstheme="majorHAnsi"/></w:rPr><w:t xml:space="preserve">{Titre}</w:t></w:r><w:r><w:rPr><w:rFonts w:cstheme="majorHAnsi"/></w:rPr><w:t> </w:t></w:r><w:r><w:rPr><w:rFonts w:cstheme="majorHAnsi"/></w:rPr><w:t xml:space="preserve">{Prenom} {Nom}</w:t></w:r><w:r><w:rPr><w:rFonts w:cstheme="majorHAnsi"/></w:rPr><w:t>,</w:t></w:r></w:p><w:p><w:pPr><w:rPr><w:rFonts w:cstheme="majorHAnsi"/></w:rPr></w:pPr></w:p><w:p><w:pPr><w:rPr><w:rFonts w:cstheme="majorHAnsi"/></w:rPr></w:pPr><w:r><w:rPr><w:rFonts w:cstheme="majorHAnsi"/></w:rPr><w:t>Pour donner suite</w:t></w:r><w:r><w:rPr><w:rFonts w:cstheme="majorHAnsi"/></w:rPr><w:t xml:space="preserve"> à no</w:t></w:r><w:r><w:rPr><w:rFonts w:cstheme="majorHAnsi"/></w:rPr><w:t>s différents échanges</w:t></w:r><w:r><w:rPr><w:rFonts w:cstheme="majorHAnsi"/></w:rPr><w:t>, je vous adresse cette lettre de mission qui a pour objet de définir les diverses interventions que nous serions amenés à effectuer, et de préciser d’un commun accord les conditions de notre collaboration.</w:t></w:r></w:p><w:p><w:pPr><w:rPr><w:rFonts w:cstheme="majorHAnsi"/></w:rPr></w:pPr></w:p><w:p><w:pPr><w:rPr><w:rFonts w:cstheme="majorHAnsi"/></w:rPr></w:pPr><w:r><w:rPr><w:rFonts w:cstheme="majorHAnsi"/></w:rPr><w:t>Il est bien entendu que la mission ainsi fixée pourra, sur votre demande, être étendue à des interventions complémentaires.</w:t></w:r></w:p><w:p><w:pPr><w:rPr><w:rFonts w:cstheme="majorHAnsi"/></w:rPr></w:pPr></w:p><w:p><w:pPr><w:pBdr><w:bottom w:val="single" w:sz="4" w:space="1" w:color="auto"/></w:pBdr><w:rPr><w:rFonts w:cstheme="majorHAnsi"/></w:rPr></w:pPr><w:r><w:rPr><w:rFonts w:cstheme="majorHAnsi"/><w:b/><w:bCs/><w:color w:val="0D1122"/><w:sz w:val="72"/><w:szCs w:val="56"/></w:rPr><w:t>LETTRE DE MISSION</w:t></w:r></w:p><w:p><w:pPr><w:pStyle w:val="Titre1"/></w:pPr><w:r><w:t>I. OBJET DE LA MISSION</w:t></w:r></w:p><w:p><w:r><w:t>La mission que vous envisagez de nous confier est une mission de gestion de la Paie. Celle-ci comprend l’établissement des bulletins de salaires et les déclarations auprès des différents organismes sociaux (URSSAF, Retraite, Prévoyance, Mutuelle, DGFIP) par le biais des déclarations sociales nominatives (DSN).</w:t></w:r></w:p><w:p/><w:p><w:r><w:t>Cette mission comporte :</w:t></w:r></w:p><w:p><w:r><w:t>- De notre part, des obligations de moyens et de diligences ;</w:t></w:r></w:p><w:p><w:r><w:t>- De votre part, un devoir d’information et de coopération.</w:t></w:r></w:p><w:p/><w:p><w:r><w:t>Les obligations réciproques sont résumées dans le tableau figurant en annexe.</w:t></w:r></w:p><w:p><w:pPr><w:pStyle w:val="Titre1"/></w:pPr><w:r><w:t>II</w:t></w:r><w:r><w:t>. Durée de la mission</w:t></w:r></w:p><w:p><w:pPr><w:rPr><w:rFonts w:eastAsia="Verdana" w:cs="Nadeem"/><w:b/><w:bCs/><w:color w:val="C4BEB2"/></w:rPr></w:pPr><w:r><w:t>La mission est conclue pour la durée de l’année civile. Pour cette première année, la mission couvre la période comprise entre la date d’effet de la lettre de mission et la date de clôture de l’année civile, date d’échéance du contrat.</w:t></w:r><w:r><w:t xml:space="preserve"> </w:t></w:r><w:r><w:t>La mission est renouvelée par tacite reconduction, à chaque fois pour l’exercice suivant, sauf dénonciation par lettre recommandée avec accusé de réception 3 mois avant la date de clôture de l’année civile.</w:t></w:r><w:r><w:br w:type="page"/></w:r></w:p><w:p><w:pPr><w:pStyle w:val="Titre1"/></w:pPr><w:r><w:lastRenderedPageBreak/><w:t>III</w:t></w:r><w:r><w:t xml:space="preserve">. </w:t></w:r><w:r><w:t>Missions complémentaires</w:t></w:r></w:p><w:p><w:r><w:t>Cette mission pourra être étendue à des missions complémentaires, de conseil et d’assistance, qui pourront porter notamment, sur l’établissement de projets de contrats de travail, le suivi de procédures de rupture de contrat de travail (Rupture conventionnelle, licenciement, démission, départ à la retraite,...), la définition et le choix d’une politique salariale, l’assistance et la représentation en cas de contrôle administrative d’organismes sociaux.</w:t></w:r></w:p><w:p/><w:p><w:r><w:t>Ces travaux seront réalisés dans les conditions définies au sein de l’Annexe 1.</w:t></w:r><w:r><w:t xml:space="preserve"> </w:t></w:r><w:r><w:t>Ils ne feront pas l’objet, d’une lettre de mission spécifique.</w:t></w:r></w:p><w:p><w:pPr><w:pStyle w:val="Titre1"/></w:pPr><w:r><w:t>IV</w:t></w:r><w:r><w:t>. Modalités relationnelles</w:t></w:r></w:p><w:p><w:r><w:t>Nos relations seront réglées sur le plan juridique tant par les termes de cette lettre que par les conditions générales jointes ainsi que par un tableau de répartition des obligations respectives entre votre entité et notre cabinet afin de réaliser cette mission dans des conditions optimales (voir Annexes 2 et 3).</w:t></w:r><w:r><w:t xml:space="preserve"> </w:t></w:r><w:r><w:t xml:space="preserve">Tout aménagement devant éventuellement être apporté aux missions définies ci-dessus sera préalablement arrêté d'un commun accord. </w:t></w:r></w:p><w:p><w:pPr><w:pStyle w:val="Titre1"/></w:pPr><w:r><w:t>V</w:t></w:r><w:r><w:t>. Honoraires</w:t></w:r></w:p><w:p><w:r><w:t>Les honoraires relatifs à la gestion des bulletins de salaire et des missions qui s’y rattachent sont présentés dans le tableau ci-dessous :</w:t></w:r></w:p><w:p/><w:p><w:pPr><w:jc w:val="center"/></w:pPr><w:r><w:drawing><wp:inline distT="0" distB="0" distL="0" distR="0" wp14:anchorId="1DF19E34" wp14:editId="49E8E072"><wp:extent cx="4449289" cy="4727276"/><wp:effectExtent l="0" t="0" r="8890" b="0"/><wp:docPr id="1349133554" name="Image 10"/><wp:cNvGraphicFramePr><a:graphicFrameLocks xmlns:a="http://schemas.openxmlformats.org/drawingml/2006/main" noChangeAspect="1"/></wp:cNvGraphicFramePr><a:graphic xmlns:a="http://schemas.openxmlformats.org/drawingml/2006/main"><a:graphicData uri="http://schemas.openxmlformats.org/drawingml/2006/picture"><pic:pic xmlns:pic="http://schemas.openxmlformats.org/drawingml/2006/picture"><pic:nvPicPr><pic:cNvPr id="0" name="Picture 105"/><pic:cNvPicPr><a:picLocks noChangeAspect="1" noChangeArrowheads="1"/></pic:cNvPicPr></pic:nvPicPr><pic:blipFill><a:blip r:embed="rId13"><a:extLst><a:ext uri="{28A0092B-C50C-407E-A947-70E740481C1C}"><a14:useLocalDpi xmlns:a14="http://schemas.microsoft.com/office/drawing/2010/main" val="0"/></a:ext></a:extLst></a:blip><a:srcRect/><a:stretch><a:fillRect/></a:stretch></pic:blipFill><pic:spPr bwMode="auto"><a:xfrm><a:off x="0" y="0"/><a:ext cx="4449289" cy="4727276"/></a:xfrm><a:prstGeom prst="rect"><a:avLst/></a:prstGeom><a:noFill/><a:ln><a:noFill/></a:ln></pic:spPr></pic:pic></a:graphicData></a:graphic></wp:inline></w:drawing></w:r></w:p><w:p><w:pPr><w:jc w:val="center"/></w:pPr></w:p><w:p><w:r><w:t xml:space="preserve">Attention : </w:t></w:r></w:p><w:p><w:pPr><w:numPr><w:ilvl w:val="0"/><w:numId w:val="46"/></w:numPr></w:pPr><w:r><w:t>Afin que nous puissions établir les DPAE en temps et en heure, il vous faudra nous transmettre les informations relatives à chaque nouveau salarié au moins 48 heures avant le début effectif de chaque contrat</w:t></w:r><w:r><w:t> ;</w:t></w:r></w:p><w:p><w:pPr><w:numPr><w:ilvl w:val="0"/><w:numId w:val="46"/></w:numPr></w:pPr><w:r><w:t>Si vous souhaitez que nous nous occupions des adhésions auprès des organismes complémentaires (prévoyance et mutuelle) ainsi qu’à la médecine du travail, il vous faudra nous le notifier expressément.</w:t></w:r></w:p><w:p><w:pPr><w:pStyle w:val="Titre1"/></w:pPr><w:r><w:t>VI</w:t></w:r><w:r><w:t>. Modifications apportées aux conditions générales</w:t></w:r></w:p><w:p><w:r><w:t>Les parties, après en avoir discuté, sont convenues de n'apporter aucune dérogation aux conditions générales.</w:t></w:r></w:p><w:p><w:r><w:t>Nous vous serions obligés de bien vouloir nous retourner un exemplaire de la présente et des annexes jointes, dont les conditions générales qui font partie intégrante de la lettre de mission, revêtues d’un paraphe sur chacune des pages et de votre signature sur la dernière page de la lettre de mission, attestant de votre prise de connaissance et acceptation de la lettre de mission et de ses annexes.</w:t></w:r></w:p><w:p><w:pPr><w:pStyle w:val="Titre1"/></w:pPr><w:r><w:t>VII</w:t></w:r><w:r><w:t xml:space="preserve">. </w:t></w:r><w:r><w:t xml:space="preserve">Echéancier de facturation et de </w:t></w:r><w:r><w:t>prélèvement</w:t></w:r></w:p><w:p><w:pPr><w:rPr><w:rFonts w:cstheme="majorHAnsi"/></w:rPr></w:pPr><w:r><w:rPr><w:rFonts w:cstheme="majorHAnsi"/></w:rPr><w:t xml:space="preserve">Les </w:t></w:r><w:r><w:rPr><w:rFonts w:cstheme="majorHAnsi"/></w:rPr><w:t>honoraires</w:t></w:r><w:r><w:rPr><w:rFonts w:cstheme="majorHAnsi"/></w:rPr><w:t xml:space="preserve"> prévus ci-dessus sont facturés et prélevés selon un échéancier mensuel défini.</w:t></w:r></w:p><w:p><w:pPr><w:rPr><w:rFonts w:cstheme="majorHAnsi"/></w:rPr></w:pPr></w:p><w:p><w:pPr><w:rPr><w:rFonts w:cstheme="majorHAnsi"/></w:rPr></w:pPr><w:r><w:rPr><w:rFonts w:cstheme="majorHAnsi"/></w:rPr><w:t xml:space="preserve">Votre signature de la présente emporte l’acceptation de ce mode de </w:t></w:r><w:r><w:rPr><w:rFonts w:cstheme="majorHAnsi"/></w:rPr><w:t xml:space="preserve">facturation et de </w:t></w:r><w:r><w:rPr><w:rFonts w:cstheme="majorHAnsi"/></w:rPr><w:t>paiement. Un mandat de prélèvement intégralement renseigné vous sera transmis, pour signature, concomitamment à la signature de la présente.</w:t></w:r></w:p><w:p><w:pPr><w:widowControl/><w:autoSpaceDE/><w:autoSpaceDN/><w:adjustRightInd/><w:jc w:val="left"/><w:rPr><w:rFonts w:cstheme="majorHAnsi"/></w:rPr></w:pPr></w:p><w:p><w:pPr><w:rPr><w:rFonts w:cstheme="majorHAnsi"/></w:rPr></w:pPr><w:r><w:rPr><w:rFonts w:cstheme="majorHAnsi"/><w:noProof/></w:rPr><w:t>Nous vous</w:t></w:r><w:r><w:rPr><w:rFonts w:cstheme="majorHAnsi"/></w:rPr><w:t xml:space="preserve"> </w:t></w:r><w:r><w:rPr><w:rFonts w:cstheme="majorHAnsi"/></w:rPr><w:t>remercions</w:t></w:r><w:r><w:rPr><w:rFonts w:cstheme="majorHAnsi"/></w:rPr><w:t xml:space="preserve"> de la confiance que vous voudrez bien nous témoigner</w:t></w:r><w:r><w:rPr><w:rFonts w:cstheme="majorHAnsi"/></w:rPr><w:t>.</w:t></w:r></w:p><w:p><w:pPr><w:rPr><w:rFonts w:cstheme="majorHAnsi"/></w:rPr></w:pPr></w:p><w:p><w:pPr><w:rPr><w:rFonts w:cstheme="majorHAnsi"/></w:rPr></w:pPr></w:p><w:p><w:pPr><w:rPr><w:rFonts w:cstheme="majorHAnsi"/><w:u w:val="single"/></w:rPr></w:pPr><w:r><w:rPr><w:rFonts w:cstheme="majorHAnsi"/><w:u w:val="single"/></w:rPr><w:t>Le client,</w:t></w:r></w:p><w:r><w:rPr><w:rFonts w:cstheme="majorHAnsi"/><w:b/><w:bCs/></w:rPr><w:t xml:space="preserve">{Societe}</w:t></w:r><w:p><w:pPr><w:rPr><w:rFonts w:cstheme="majorHAnsi"/></w:rPr></w:pPr><w:r><w:rPr><w:rFonts w:cstheme="majorHAnsi"/></w:rPr><w:t xml:space="preserve">{Prenom} {Nom}</w:t></w:r><w:r><w:rPr><w:rFonts w:cstheme="majorHAnsi"/></w:rPr><w:t>,</w:t></w:r></w:p><w:p><w:pPr><w:rPr><w:rFonts w:cstheme="majorHAnsi"/></w:rPr></w:pPr><w:r><w:rPr><w:rFonts w:cstheme="majorHAnsi"/></w:rPr><w:t>Dirigeant/ Représentant légal</w:t></w:r></w:p><w:p><w:pPr><w:rPr><w:rFonts w:cstheme="majorHAnsi"/></w:rPr></w:pPr></w:p><w:p><w:pPr><w:rPr><w:rFonts w:cstheme="majorHAnsi"/></w:rPr></w:pPr></w:p><w:p><w:pPr><w:rPr><w:rFonts w:cstheme="majorHAnsi"/></w:rPr></w:pPr></w:p><w:p><w:pPr><w:rPr><w:rFonts w:cstheme="majorHAnsi"/></w:rPr></w:pPr></w:p><w:p><w:pPr><w:rPr><w:rFonts w:cstheme="majorHAnsi"/></w:rPr></w:pPr></w:p><w:p><w:pPr><w:rPr><w:rFonts w:cstheme="majorHAnsi"/></w:rPr></w:pPr></w:p><w:p><w:pPr><w:rPr><w:rFonts w:cstheme="majorHAnsi"/></w:rPr></w:pPr></w:p><w:p><w:pPr><w:rPr><w:rFonts w:cstheme="majorHAnsi"/><w:u w:val="single"/></w:rPr></w:pPr><w:r><w:rPr><w:rFonts w:cstheme="majorHAnsi"/><w:u w:val="single"/></w:rPr><w:t>La structure inscrite à l’Ordre des Experts-comptables</w:t></w:r></w:p><w:p><w:pPr><w:rPr><w:rFonts w:cstheme="majorHAnsi"/><w:b/><w:bCs/></w:rPr></w:pPr><w:r><w:rPr><w:rFonts w:cstheme="majorHAnsi"/><w:b/><w:bCs/></w:rPr><w:t>MOON E</w:t></w:r><w:r><w:rPr><w:rFonts w:cstheme="majorHAnsi"/><w:b/><w:bCs/></w:rPr><w:t>xpertise</w:t></w:r></w:p><w:p><w:pPr><w:rPr><w:rFonts w:cstheme="majorHAnsi"/></w:rPr></w:pPr><w:r><w:rPr><w:rFonts w:cstheme="majorHAnsi"/></w:rPr><w:t>Benjamin PEREZ</w:t></w:r></w:p><w:p><w:pPr><w:rPr><w:rFonts w:cstheme="majorHAnsi"/></w:rPr></w:pPr><w:r><w:rPr><w:rFonts w:cstheme="majorHAnsi"/></w:rPr><w:t>Expert-comptable, Gérant</w:t></w:r></w:p><w:p><w:pPr><w:rPr><w:rFonts w:cstheme="majorHAnsi"/></w:rPr></w:pPr></w:p><w:p><w:pPr><w:rPr><w:rFonts w:cstheme="majorHAnsi"/></w:rPr></w:pPr><w:r><w:rPr><w:rFonts w:cstheme="majorHAnsi"/></w:rPr><w:br w:type="page"/></w:r></w:p><w:p><w:pPr><w:pStyle w:val="Titre2"/></w:pPr><w:r><w:lastRenderedPageBreak/><w:t>Annexe 1 – Tableau des prestations complémentaires</w:t></w:r></w:p><w:p><w:pPr><w:widowControl/><w:autoSpaceDE/><w:autoSpaceDN/><w:adjustRightInd/><w:jc w:val="left"/><w:rPr><w:rFonts w:cstheme="majorHAnsi"/></w:rPr></w:pPr></w:p><w:p><w:pPr><w:rPr><w:rFonts w:cstheme="majorHAnsi"/></w:rPr><w:sectPr><w:footerReference w:type="default" r:id="rId14"/><w:headerReference w:type="first" r:id="rId15"/><w:footerReference w:type="first" r:id="rId16"/><w:pgSz w:w="11909" w:h="16834"/><w:pgMar w:top="1417" w:right="1417" w:bottom="1417" w:left="1417" w:header="624" w:footer="0" w:gutter="0"/><w:cols w:space="425"/><w:noEndnote/><w:titlePg/><w:docGrid w:linePitch="326"/></w:sectPr></w:pPr></w:p><w:p><w:pPr><w:rPr><w:rFonts w:cstheme="majorHAnsi"/></w:rPr></w:pPr><w:r><w:drawing><wp:inline distT="0" distB="0" distL="0" distR="0" wp14:anchorId="1CA161F6" wp14:editId="052461FA"><wp:extent cx="5762625" cy="7750810"/><wp:effectExtent l="0" t="0" r="9525" b="2540"/><wp:docPr id="110811485" name="Image 11"/><wp:cNvGraphicFramePr><a:graphicFrameLocks xmlns:a="http://schemas.openxmlformats.org/drawingml/2006/main" noChangeAspect="1"/></wp:cNvGraphicFramePr><a:graphic xmlns:a="http://schemas.openxmlformats.org/drawingml/2006/main"><a:graphicData uri="http://schemas.openxmlformats.org/drawingml/2006/picture"><pic:pic xmlns:pic="http://schemas.openxmlformats.org/drawingml/2006/picture"><pic:nvPicPr><pic:cNvPr id="0" name="Picture 106"/><pic:cNvPicPr><a:picLocks noChangeAspect="1" noChangeArrowheads="1"/></pic:cNvPicPr></pic:nvPicPr><pic:blipFill><a:blip r:embed="rId17"><a:extLst><a:ext uri="{28A0092B-C50C-407E-A947-70E740481C1C}"><a14:useLocalDpi xmlns:a14="http://schemas.microsoft.com/office/drawing/2010/main" val="0"/></a:ext></a:extLst></a:blip><a:srcRect/><a:stretch><a:fillRect/></a:stretch></pic:blipFill><pic:spPr bwMode="auto"><a:xfrm><a:off x="0" y="0"/><a:ext cx="5762625" cy="7750810"/></a:xfrm><a:prstGeom prst="rect"><a:avLst/></a:prstGeom><a:noFill/><a:ln><a:noFill/></a:ln></pic:spPr></pic:pic></a:graphicData></a:graphic></wp:inline></w:drawing></w:r></w:p><w:p><w:pPr><w:widowControl/><w:autoSpaceDE/><w:autoSpaceDN/><w:adjustRightInd/><w:jc w:val="left"/><w:rPr><w:rFonts w:cstheme="majorHAnsi"/></w:rPr></w:pPr><w:r><w:rPr><w:rFonts w:cstheme="majorHAnsi"/></w:rPr><w:br w:type="page"/></w:r></w:p><w:p><w:pPr><w:pStyle w:val="Titre2"/></w:pPr><w:r><w:lastRenderedPageBreak/><w:t xml:space="preserve">Annexe 2 – </w:t></w:r><w:r><w:t>Tableau de répartition des taches</w:t></w:r></w:p><w:p><w:pPr><w:rPr><w:rFonts w:cstheme="majorHAnsi"/></w:rPr></w:pPr></w:p><w:p><w:pPr><w:widowControl/><w:autoSpaceDE/><w:autoSpaceDN/><w:adjustRightInd/><w:jc w:val="left"/><w:rPr><w:rFonts w:cstheme="majorHAnsi"/></w:rPr></w:pPr><w:r><w:rPr><w:rFonts w:cstheme="majorHAnsi"/><w:noProof/></w:rPr><w:object w:dxaOrig="0" w:dyaOrig="0" w14:anchorId="0A9908D7"><v:shapetype id="_x0000_t75" coordsize="21600,21600" o:spt="75" o:preferrelative="t" path="m@4@5l@4@11@9@11@9@5xe" filled="f" stroked="f"><v:stroke joinstyle="miter"/><v:formulas><v:f eqn="if lineDrawn pixelLineWidth 0"/><v:f eqn="sum @0 1 0"/><v:f eqn="sum 0 0 @1"/><v:f eqn="prod @2 1 2"/><v:f eqn="prod @3 21600 pixelWidth"/><v:f eqn="prod @3 21600 pixelHeight"/><v:f eqn="sum @0 0 1"/><v:f eqn="prod @6 1 2"/><v:f eqn="prod @7 21600 pixelWidth"/><v:f eqn="sum @8 21600 0"/><v:f eqn="prod @7 21600 pixelHeight"/><v:f eqn="sum @10 21600 0"/></v:formulas><v:path o:extrusionok="f" gradientshapeok="t" o:connecttype="rect"/><o:lock v:ext="edit" aspectratio="t"/></v:shapetype><v:shape id="_x0000_s2055" type="#_x0000_t75" style="position:absolute;margin-left:.05pt;margin-top:8.3pt;width:468.35pt;height:343.8pt;z-index:-251662335;mso-position-horizontal-relative:text;mso-position-vertical-relative:text"><v:imagedata r:id="rId18" o:title=""/><w10:wrap type="square"/></v:shape><o:OLEObject Type="Embed" ProgID="Excel.Sheet.12" ShapeID="_x0000_s2055" DrawAspect="Content" ObjectID="_1846328801" r:id="rId19"/></w:object></w:r><w:r><w:rPr><w:rFonts w:cstheme="majorHAnsi"/></w:rPr><w:br w:type="page"/></w:r><w:r><w:rPr><w:rFonts w:cstheme="majorHAnsi"/><w:noProof/></w:rPr><w:lastRenderedPageBreak/><w:object w:dxaOrig="0" w:dyaOrig="0" w14:anchorId="0A9908D7"><v:shape id="_x0000_s2056" type="#_x0000_t75" style="position:absolute;margin-left:.7pt;margin-top:35.5pt;width:474.55pt;height:347.5pt;z-index:-251662334;mso-position-horizontal-relative:text;mso-position-vertical-relative:text"><v:imagedata r:id="rId20" o:title=""/><w10:wrap type="square"/></v:shape><o:OLEObject Type="Embed" ProgID="Excel.Sheet.12" ShapeID="_x0000_s2056" DrawAspect="Content" ObjectID="_1846328802" r:id="rId21"/></w:object></w:r><w:r><w:rPr><w:rFonts w:cstheme="majorHAnsi"/></w:rPr><w:br w:type="page"/></w:r></w:p><w:p><w:pPr><w:spacing w:after="40"/><w:ind w:right="701"/><w:jc w:val="center"/><w:rPr><w:rFonts w:ascii="Arial" w:eastAsia="Verdana" w:hAnsi="Arial"/><w:b/><w:bCs/><w:sz w:val="20"/></w:rPr></w:pPr><w:r><w:rPr><w:rFonts w:ascii="Arial" w:eastAsia="Verdana" w:hAnsi="Arial"/><w:b/><w:bCs/><w:sz w:val="20"/></w:rPr><w:lastRenderedPageBreak/><w:t>A</w:t></w:r><w:r><w:rPr><w:rFonts w:ascii="Arial" w:eastAsia="Verdana" w:hAnsi="Arial"/><w:b/><w:bCs/><w:sz w:val="20"/></w:rPr><w:t>nnexe</w:t></w:r><w:r><w:rPr><w:rFonts w:ascii="Arial" w:eastAsia="Verdana" w:hAnsi="Arial"/><w:b/><w:bCs/><w:sz w:val="20"/></w:rPr><w:t xml:space="preserve"> </w:t></w:r><w:r><w:rPr><w:rFonts w:ascii="Arial" w:eastAsia="Verdana" w:hAnsi="Arial"/><w:b/><w:bCs/><w:sz w:val="20"/></w:rPr><w:t>3 – Conditions générales</w:t></w:r></w:p><w:p><w:pPr><w:spacing w:after="40"/><w:ind w:right="701"/><w:jc w:val="center"/><w:rPr><w:rFonts w:ascii="Arial" w:eastAsia="Verdana" w:hAnsi="Arial"/><w:b/><w:bCs/><w:sz w:val="20"/></w:rPr></w:pPr></w:p><w:p><w:pPr><w:rPr><w:rFonts w:eastAsia="Verdana"/></w:rPr></w:pPr></w:p><w:p><w:pPr><w:pStyle w:val="Titre3"/><w:sectPr><w:headerReference w:type="default" r:id="rId22"/><w:type w:val="continuous"/><w:pgSz w:w="11909" w:h="16834"/><w:pgMar w:top="1417" w:right="1417" w:bottom="1417" w:left="1417" w:header="567" w:footer="0" w:gutter="0"/><w:cols w:space="425"/><w:noEndnote/><w:docGrid w:linePitch="326"/></w:sectPr></w:pPr></w:p><w:p><w:pPr><w:pStyle w:val="Titre3"/><w:rPr><w:sz w:val="18"/><w:szCs w:val="18"/></w:rPr></w:pPr><w:r><w:rPr><w:sz w:val="18"/><w:szCs w:val="18"/></w:rPr><w:t>1- DOMAINE D’APPLICATION</w:t></w:r></w:p><w:p><w:pPr><w:rPr><w:rFonts w:eastAsia="Verdana"/><w:sz w:val="18"/><w:szCs w:val="18"/></w:rPr></w:pPr><w:r><w:rPr><w:rFonts w:eastAsia="Verdana"/><w:sz w:val="18"/><w:szCs w:val="18"/></w:rPr><w:t xml:space="preserve">Les présentes conditions sont applicables aux conventions portant sur les missions conclues entre le cabinet </w:t></w:r><w:r><w:rPr><w:rFonts w:eastAsia="Verdana"/><w:sz w:val="18"/><w:szCs w:val="18"/></w:rPr><w:t xml:space="preserve">MOON EXPERTISE </w:t></w:r><w:r><w:rPr><w:rFonts w:eastAsia="Verdana"/><w:sz w:val="18"/><w:szCs w:val="18"/></w:rPr><w:t>dénommé l’expert-comptable et son client.</w:t></w:r></w:p><w:p><w:pPr><w:rPr><w:rFonts w:eastAsia="Verdana"/><w:sz w:val="18"/><w:szCs w:val="18"/></w:rPr></w:pPr><w:r><w:rPr><w:rFonts w:eastAsia="Verdana"/><w:sz w:val="18"/><w:szCs w:val="18"/></w:rPr><w:t>Le client reconnaît qu’il contracte en qualité de professionnel</w:t></w:r><w:r><w:rPr><w:rFonts w:eastAsia="Verdana"/><w:sz w:val="18"/><w:szCs w:val="18"/><w:vertAlign w:val="superscript"/></w:rPr><w:footnoteReference w:id="2"/></w:r><w:r><w:rPr><w:rFonts w:eastAsia="Verdana"/><w:sz w:val="18"/><w:szCs w:val="18"/></w:rPr><w:t xml:space="preserve"> et que la lettre de mission annexée constitue un contrat de prestations de services en rapport direct avec ses activités professionnelles.</w:t></w:r></w:p><w:p><w:pPr><w:rPr><w:rFonts w:eastAsia="Verdana"/><w:sz w:val="18"/><w:szCs w:val="18"/></w:rPr></w:pPr></w:p><w:p><w:pPr><w:pStyle w:val="Titre3"/><w:rPr><w:sz w:val="18"/><w:szCs w:val="18"/></w:rPr></w:pPr><w:r><w:rPr><w:sz w:val="18"/><w:szCs w:val="18"/></w:rPr><w:t>2- DEFINITION DE LA MISSION</w:t></w:r></w:p><w:p><w:pPr><w:rPr><w:rFonts w:eastAsia="Verdana"/><w:sz w:val="18"/><w:szCs w:val="18"/></w:rPr></w:pPr><w:r><w:rPr><w:rFonts w:eastAsia="Verdana"/><w:sz w:val="18"/><w:szCs w:val="18"/></w:rPr><w:t>Les travaux incombant à l’expert-comptable sont détaillés dans la lettre de mission et ses annexes et sont strictement limités à son contenu.</w:t></w:r></w:p><w:p><w:pPr><w:rPr><w:rFonts w:eastAsia="Verdana"/><w:sz w:val="18"/><w:szCs w:val="18"/></w:rPr></w:pPr></w:p><w:p><w:pPr><w:rPr><w:rFonts w:eastAsia="Verdana"/><w:b/><w:bCs/><w:sz w:val="18"/><w:szCs w:val="18"/></w:rPr></w:pPr><w:r><w:rPr><w:rFonts w:eastAsia="Verdana"/><w:b/><w:bCs/><w:sz w:val="18"/><w:szCs w:val="18"/></w:rPr><w:t>3- SOUS TRAITANCE</w:t></w:r></w:p><w:p><w:pPr><w:rPr><w:rFonts w:eastAsia="Verdana"/><w:sz w:val="18"/><w:szCs w:val="18"/></w:rPr></w:pPr><w:r><w:rPr><w:rFonts w:eastAsia="Verdana"/><w:sz w:val="18"/><w:szCs w:val="18"/></w:rPr><w:t xml:space="preserve">Le </w:t></w:r><w:r><w:rPr><w:rFonts w:eastAsia="Verdana"/><w:sz w:val="18"/><w:szCs w:val="18"/></w:rPr><w:t>c</w:t></w:r><w:r><w:rPr><w:rFonts w:eastAsia="Verdana"/><w:sz w:val="18"/><w:szCs w:val="18"/></w:rPr><w:t>lient est informé et accepte que l</w:t></w:r><w:r><w:rPr><w:rFonts w:eastAsia="Verdana"/><w:sz w:val="18"/><w:szCs w:val="18"/></w:rPr><w:t xml:space="preserve">’expert-comptable </w:t></w:r><w:r><w:rPr><w:rFonts w:eastAsia="Verdana"/><w:sz w:val="18"/><w:szCs w:val="18"/></w:rPr><w:t>fasse appel, pour l’exécution de tout ou partie des prestations objet du présent contrat, au sous-traitant suivant :</w:t></w:r></w:p><w:p><w:pPr><w:rPr><w:rFonts w:eastAsia="Verdana"/><w:sz w:val="18"/><w:szCs w:val="18"/></w:rPr></w:pPr></w:p><w:p><w:pPr><w:rPr><w:rFonts w:eastAsia="Verdana"/><w:sz w:val="18"/><w:szCs w:val="18"/></w:rPr></w:pPr><w:r><w:rPr><w:rFonts w:eastAsia="Verdana"/><w:sz w:val="18"/><w:szCs w:val="18"/></w:rPr><w:t>La société EXPAND CPA, située au 3, rue Jules Lefebvre, 75009 Paris, immatriculée au RCS de Paris sous le numéro 879 971 422, représentée par Monsieur Samuel ATTALI, en sa qualité de Gérant, ci-après désignée « le Sous-traitant ».</w:t></w:r></w:p><w:p><w:pPr><w:rPr><w:rFonts w:eastAsia="Verdana"/><w:sz w:val="18"/><w:szCs w:val="18"/></w:rPr></w:pPr></w:p><w:p><w:pPr><w:rPr><w:rFonts w:eastAsia="Verdana"/><w:sz w:val="18"/><w:szCs w:val="18"/></w:rPr></w:pPr><w:r><w:rPr><w:rFonts w:eastAsia="Verdana"/><w:sz w:val="18"/><w:szCs w:val="18"/></w:rPr><w:t>L’expert-comptable s’engage à ce que le sous-traitant respecte l’ensemble des obligations mises à sa charge au titre du présent contrat.</w:t></w:r></w:p><w:p><w:pPr><w:rPr><w:rFonts w:eastAsia="Verdana"/><w:sz w:val="18"/><w:szCs w:val="18"/></w:rPr></w:pPr></w:p><w:p><w:pPr><w:pStyle w:val="Titre3"/><w:rPr><w:sz w:val="18"/><w:szCs w:val="18"/></w:rPr></w:pPr><w:r><w:rPr><w:sz w:val="18"/><w:szCs w:val="18"/></w:rPr><w:t>4</w:t></w:r><w:r><w:rPr><w:sz w:val="18"/><w:szCs w:val="18"/></w:rPr><w:t>- OBLIGATIONS DE L’EXPERT-COMPTABLE</w:t></w:r></w:p><w:p><w:pPr><w:rPr><w:rFonts w:eastAsia="Verdana"/><w:sz w:val="18"/><w:szCs w:val="18"/></w:rPr></w:pPr><w:r><w:rPr><w:rFonts w:eastAsia="Verdana"/><w:sz w:val="18"/><w:szCs w:val="18"/></w:rPr><w:t>L’expert-comptable effectue la mission qui lui est confiée conformément aux dispositions du Code de déontologie intégré au décret du 30 mars 2012 relatif à l’exercice de l’activité d’expertise comptable, de la norme professionnelle de « Maîtrise de la qualité », de la norme professionnelle relative aux obligations de la profession d’expertise comptable en matière de lutte contre le blanchiment des capitaux et le financement du terrorisme (NPLAB)  élaborée en application des dispositions du Code monétaire et financier et le cas échéant de la norme professionnelle de travail spécifique à la mission considérée. Il contracte, en raison de cette mission, une obligation de moyens.</w:t></w:r></w:p><w:p><w:pPr><w:rPr><w:rFonts w:eastAsia="Verdana"/><w:sz w:val="18"/><w:szCs w:val="18"/></w:rPr></w:pPr><w:r><w:rPr><w:rFonts w:eastAsia="Verdana"/><w:sz w:val="18"/><w:szCs w:val="18"/></w:rPr><w:t>L’expert-comptable peut se faire assister par les collaborateurs de son choix. Le nom du collaborateur principal chargé du dossier est indiqué au client.</w:t></w:r></w:p><w:p><w:pPr><w:rPr><w:rFonts w:eastAsia="Verdana"/><w:sz w:val="18"/><w:szCs w:val="18"/></w:rPr></w:pPr><w:r><w:rPr><w:rFonts w:eastAsia="Verdana"/><w:sz w:val="18"/><w:szCs w:val="18"/></w:rPr><w:t>A l’achèvement de sa mission, l’expert-comptable restitue les documents appartenant au client que ce dernier lui a confiés pour l’exécution de la mission.</w:t></w:r></w:p><w:p><w:pPr><w:rPr><w:rFonts w:eastAsia="Verdana"/><w:sz w:val="18"/><w:szCs w:val="18"/></w:rPr></w:pPr><w:r><w:rPr><w:rFonts w:eastAsia="Verdana"/><w:sz w:val="18"/><w:szCs w:val="18"/></w:rPr><w:t>L’expert-comptable est tenu :</w:t></w:r></w:p><w:p><w:pPr><w:rPr><w:rFonts w:eastAsia="Verdana"/><w:sz w:val="18"/><w:szCs w:val="18"/></w:rPr></w:pPr><w:r><w:rPr><w:rFonts w:eastAsia="Verdana"/><w:sz w:val="18"/><w:szCs w:val="18"/></w:rPr><w:t>- à une obligation au secret professionnel dans les conditions prévues à l’article 226-13 du Code pénal ;</w:t></w:r></w:p><w:p><w:pPr><w:rPr><w:rFonts w:eastAsia="Verdana"/><w:sz w:val="18"/><w:szCs w:val="18"/></w:rPr></w:pPr><w:r><w:rPr><w:rFonts w:eastAsia="Verdana"/><w:sz w:val="18"/><w:szCs w:val="18"/></w:rPr><w:t xml:space="preserve">- à une obligation de discrétion, distincte de l’obligation précédente, quant aux informations recueillies et à la diffusion des documents qu’il a établis. Ces derniers sont </w:t></w:r><w:r><w:rPr><w:rFonts w:eastAsia="Verdana"/><w:sz w:val="18"/><w:szCs w:val="18"/></w:rPr><w:t>adressés au client, à l’exclusion de tout envoi à un tiers, sauf demande du client. Les documents établis par l’expert-comptable seront en conséquence adressés au client, à l’exclusion de tout envoi direct à un tiers (sauf instruction spécifique de la part du client et exception faite des transmissions aux administrations fiscales et sociales et OGA).</w:t></w:r></w:p><w:p><w:pPr><w:rPr><w:rFonts w:eastAsia="Verdana"/><w:sz w:val="18"/><w:szCs w:val="18"/></w:rPr></w:pPr></w:p><w:p><w:pPr><w:pStyle w:val="Titre3"/><w:rPr><w:sz w:val="18"/><w:szCs w:val="18"/></w:rPr></w:pPr><w:r><w:rPr><w:sz w:val="18"/><w:szCs w:val="18"/></w:rPr><w:t>5</w:t></w:r><w:r><w:rPr><w:sz w:val="18"/><w:szCs w:val="18"/></w:rPr><w:t>- OBLIGATIONS DU CLIENT</w:t></w:r></w:p><w:p><w:pPr><w:rPr><w:rFonts w:eastAsia="Verdana"/><w:sz w:val="18"/><w:szCs w:val="18"/></w:rPr></w:pPr><w:r><w:rPr><w:rFonts w:eastAsia="Verdana"/><w:sz w:val="18"/><w:szCs w:val="18"/></w:rPr><w:t>Le client s’interdit tout acte de nature à porter atteinte à l’indépendance de l’expert-comptable ou de ses collaborateurs, notamment en s’abstenant de leur faire toutes offres d’exécuter des missions pour leur propre compte ou de devenir salarié du client.</w:t></w:r></w:p><w:p><w:pPr><w:rPr><w:rFonts w:eastAsia="Verdana"/><w:sz w:val="18"/><w:szCs w:val="18"/></w:rPr></w:pPr><w:r><w:rPr><w:rFonts w:eastAsia="Verdana"/><w:sz w:val="18"/><w:szCs w:val="18"/></w:rPr><w:t>Le client s’engage :</w:t></w:r></w:p><w:p><w:pPr><w:rPr><w:rFonts w:eastAsia="Verdana"/><w:sz w:val="18"/><w:szCs w:val="18"/></w:rPr></w:pPr><w:r><w:rPr><w:rFonts w:eastAsia="Verdana"/><w:sz w:val="18"/><w:szCs w:val="18"/></w:rPr><w:t>À fournir à l’expert-comptable, préalablement au commencement de la mission, les informations et documents d’identification requis en application des dispositions visées aux articles L 561-1 et suivants du Code monétaire et financier. Le contrat est conclu sous condition résolutoire de l’obtention de ces informations et documents. La mission ne pourra donc pas être mise en œuvre avant leur obtention. Il s’agit :</w:t></w:r></w:p><w:p><w:pPr><w:rPr><w:rFonts w:eastAsia="Verdana"/><w:sz w:val="18"/><w:szCs w:val="18"/></w:rPr></w:pPr><w:r><w:rPr><w:rFonts w:eastAsia="Verdana"/><w:sz w:val="18"/><w:szCs w:val="18"/></w:rPr><w:t>Dans le cadre de l’obligation d’identification du client :</w:t></w:r></w:p><w:p><w:pPr><w:rPr><w:rFonts w:eastAsia="Verdana"/><w:sz w:val="18"/><w:szCs w:val="18"/></w:rPr></w:pPr><w:r><w:rPr><w:rFonts w:eastAsia="Verdana"/><w:sz w:val="18"/><w:szCs w:val="18"/></w:rPr><w:t xml:space="preserve">- si le client est une personne physique, obtention d’un document d’identité officiel en cours de validité comportant sa photographie ; </w:t></w:r></w:p><w:p><w:pPr><w:rPr><w:rFonts w:eastAsia="Verdana"/><w:sz w:val="18"/><w:szCs w:val="18"/></w:rPr></w:pPr><w:r><w:rPr><w:rFonts w:eastAsia="Verdana"/><w:sz w:val="18"/><w:szCs w:val="18"/></w:rPr><w:t xml:space="preserve">- si le client est une personne morale, tout acte ou extrait de registre officiel datant de moins de trois mois constatant la dénomination, la forme juridique, l’adresse du siège social, l’identité des associés et dirigeants et la composition et la répartition du capital. </w:t></w:r></w:p><w:p><w:pPr><w:rPr><w:rFonts w:eastAsia="Verdana"/><w:sz w:val="18"/><w:szCs w:val="18"/></w:rPr></w:pPr><w:r><w:rPr><w:rFonts w:eastAsia="Verdana"/><w:sz w:val="18"/><w:szCs w:val="18"/></w:rPr><w:t>Dans le cadre de l’obligation d’identification du bénéficiaire effectif, s’il apparait qu’une personne physique remplit les conditions pour être qualifiée de bénéficiaire effectif :</w:t></w:r></w:p><w:p><w:pPr><w:rPr><w:rFonts w:eastAsia="Verdana"/><w:sz w:val="18"/><w:szCs w:val="18"/></w:rPr></w:pPr><w:r><w:rPr><w:rFonts w:eastAsia="Verdana"/><w:sz w:val="18"/><w:szCs w:val="18"/></w:rPr><w:t>- les éléments d’identification de cette personne.</w:t></w:r></w:p><w:p><w:pPr><w:rPr><w:rFonts w:eastAsia="Verdana"/><w:sz w:val="18"/><w:szCs w:val="18"/></w:rPr></w:pPr><w:r><w:rPr><w:rFonts w:eastAsia="Verdana"/><w:sz w:val="18"/><w:szCs w:val="18"/></w:rPr><w:t>À mettre à la disposition de l’expert-comptable, dans les délais convenus, l’ensemble des documents et informations nécessaires à l’exécution de la mission ;</w:t></w:r></w:p><w:p><w:pPr><w:rPr><w:rFonts w:eastAsia="Verdana"/><w:sz w:val="18"/><w:szCs w:val="18"/></w:rPr></w:pPr><w:r><w:rPr><w:rFonts w:eastAsia="Verdana"/><w:sz w:val="18"/><w:szCs w:val="18"/></w:rPr><w:t>A réaliser les travaux lui incombant conformément aux dispositions prévues dans le tableau de répartition des obligations respectives ;</w:t></w:r></w:p><w:p><w:pPr><w:rPr><w:rFonts w:eastAsia="Verdana"/><w:sz w:val="18"/><w:szCs w:val="18"/></w:rPr></w:pPr><w:r><w:rPr><w:rFonts w:eastAsia="Verdana"/><w:sz w:val="18"/><w:szCs w:val="18"/></w:rPr><w:t>À respecter les procédures mises en place pour la réalisation de la mission et notamment le planning d’intervention de l’expert-comptable figurant dans la lettre de mission ;</w:t></w:r></w:p><w:p><w:pPr><w:rPr><w:rFonts w:eastAsia="Verdana"/><w:sz w:val="18"/><w:szCs w:val="18"/></w:rPr></w:pPr><w:r><w:rPr><w:rFonts w:eastAsia="Verdana"/><w:sz w:val="18"/><w:szCs w:val="18"/></w:rPr><w:t>À porter à la connaissance de l’expert-comptable les faits nouveaux ou exceptionnels et à lui signaler également les engagements susceptibles d’affecter les résultats ou la situation patrimoniale de l’entité ;</w:t></w:r></w:p><w:p><w:pPr><w:rPr><w:rFonts w:eastAsia="Verdana"/><w:sz w:val="18"/><w:szCs w:val="18"/></w:rPr></w:pPr><w:r><w:rPr><w:rFonts w:eastAsia="Verdana"/><w:sz w:val="18"/><w:szCs w:val="18"/></w:rPr><w:t>À confirmer par écrit, si l’expert-comptable le lui demande, que les documents, renseignements et explications fournis sont exhaustifs et reflètent fidèlement la situation patrimoniale de l’entité ;</w:t></w:r></w:p><w:p><w:pPr><w:rPr><w:rFonts w:eastAsia="Verdana"/><w:sz w:val="18"/><w:szCs w:val="18"/></w:rPr></w:pPr><w:r><w:rPr><w:rFonts w:eastAsia="Verdana"/><w:sz w:val="18"/><w:szCs w:val="18"/></w:rPr><w:t>À vérifier que les états et documents produits par l’expert-</w:t></w:r><w:r><w:rPr><w:rFonts w:eastAsia="Verdana"/><w:sz w:val="18"/><w:szCs w:val="18"/></w:rPr><w:lastRenderedPageBreak/><w:t>comptable sont conformes aux demandes exprimées et aux informations fournies par lui-même et à informer sans retard le professionnel de tout manquement ou erreur.</w:t></w:r></w:p><w:p><w:pPr><w:rPr><w:rFonts w:eastAsia="Verdana"/><w:sz w:val="18"/><w:szCs w:val="18"/></w:rPr></w:pPr><w:r><w:rPr><w:rFonts w:eastAsia="Verdana"/><w:sz w:val="18"/><w:szCs w:val="18"/></w:rPr><w:t>Le client reste responsable de la bonne application de la législation et des règlements en vigueur ; l’expert-comptable ne peut être considéré comme se substituant aux obligations du client du fait de cette mission.</w:t></w:r></w:p><w:p><w:pPr><w:rPr><w:rFonts w:eastAsia="Verdana"/><w:sz w:val="18"/><w:szCs w:val="18"/></w:rPr></w:pPr><w:r><w:rPr><w:rFonts w:eastAsia="Verdana"/><w:sz w:val="18"/><w:szCs w:val="18"/></w:rPr><w:t>Conformément aux prescriptions légales, le client doit prendre toutes les mesures nécessaires pour conserver les pièces justificatives et, d’une façon générale, l’ensemble des documents produits par l’expert-comptable pendant les délais de conservation requis par la loi ou le règlement.</w:t></w:r></w:p><w:p><w:pPr><w:rPr><w:rFonts w:eastAsia="Verdana"/><w:sz w:val="18"/><w:szCs w:val="18"/></w:rPr></w:pPr><w:r><w:rPr><w:rFonts w:eastAsia="Verdana"/><w:sz w:val="18"/><w:szCs w:val="18"/></w:rPr><w:t>Dès lors que des traitements sont assurés sur le système informatique du client, ce dernier devra assurer la sauvegarde et l’archivage des données et des traitements informatisés pour en garantir la conservation, l’inviolabilité et la lecture ultérieure.</w:t></w:r></w:p><w:p><w:pPr><w:rPr><w:rFonts w:eastAsia="Verdana"/><w:sz w:val="18"/><w:szCs w:val="18"/></w:rPr></w:pPr><w:r><w:rPr><w:rFonts w:eastAsia="Verdana"/><w:sz w:val="18"/><w:szCs w:val="18"/></w:rPr><w:t>D’une façon générale, le client doit par ailleurs prendre toutes les mesures nécessaires pour assurer la protection de son système informatique.</w:t></w:r></w:p><w:p><w:pPr><w:rPr><w:rFonts w:eastAsia="Verdana"/><w:sz w:val="18"/><w:szCs w:val="18"/></w:rPr></w:pPr></w:p><w:p><w:pPr><w:pStyle w:val="Titre3"/><w:rPr><w:sz w:val="18"/><w:szCs w:val="18"/></w:rPr></w:pPr><w:r><w:rPr><w:sz w:val="18"/><w:szCs w:val="18"/></w:rPr><w:t>6</w:t></w:r><w:r><w:rPr><w:sz w:val="18"/><w:szCs w:val="18"/></w:rPr><w:t>- HONORAIRES</w:t></w:r></w:p><w:p><w:pPr><w:rPr><w:rFonts w:eastAsia="Verdana"/><w:sz w:val="18"/><w:szCs w:val="18"/></w:rPr></w:pPr><w:r><w:rPr><w:rFonts w:eastAsia="Verdana"/><w:sz w:val="18"/><w:szCs w:val="18"/></w:rPr><w:t>L’expert-comptable reçoit du client des honoraires librement convenus qui sont exclusifs de toute autre rémunération, même indirecte. Il est remboursé de ses frais de déplacement et débours.</w:t></w:r></w:p><w:p><w:pPr><w:rPr><w:rFonts w:eastAsia="Verdana"/><w:sz w:val="18"/><w:szCs w:val="18"/></w:rPr></w:pPr><w:r><w:rPr><w:rFonts w:eastAsia="Verdana"/><w:sz w:val="18"/><w:szCs w:val="18"/></w:rPr><w:t>Des acomptes sur honoraires peuvent être demandés périodiquement.</w:t></w:r></w:p><w:p><w:pPr><w:rPr><w:rFonts w:eastAsia="Verdana"/><w:sz w:val="18"/><w:szCs w:val="18"/></w:rPr></w:pPr><w:r><w:rPr><w:rFonts w:eastAsia="Verdana"/><w:sz w:val="18"/><w:szCs w:val="18"/></w:rPr><w:t>Les conditions de règlement des honoraires sont les suivantes :</w:t></w:r></w:p><w:p><w:pPr><w:rPr><w:rFonts w:eastAsia="Verdana"/><w:sz w:val="18"/><w:szCs w:val="18"/></w:rPr></w:pPr><w:r><w:rPr><w:rFonts w:eastAsia="Verdana"/><w:sz w:val="18"/><w:szCs w:val="18"/></w:rPr><w:t>Les honoraires sont payés à leur date d’échéance ; en cas de paiement anticipé, aucun escompte n’est accordé ; en cas de retard de paiement, des pénalités de retard sont exigibles le jour suivant la date de règlement figurant sur la facture ; sauf disposition contraire qui ne peut toutefois fixer un taux d’intérêt de ces pénalités inférieur à trois fois le taux d’intérêt légal, le taux d’intérêt sera égal à celui appliqué par la Banque Centrale Européenne à son opération de refinancement la plus récente majoré de 10 points de pourcentage. Les pénalités de retard sont exigibles sans qu’un rappel soit nécessaire.</w:t></w:r><w:r><w:rPr><w:rFonts w:eastAsia="Verdana"/><w:sz w:val="18"/><w:szCs w:val="18"/><w:vertAlign w:val="superscript"/></w:rPr><w:footnoteReference w:id="3"/></w:r></w:p><w:p><w:pPr><w:rPr><w:rFonts w:eastAsia="Verdana"/><w:sz w:val="18"/><w:szCs w:val="18"/></w:rPr></w:pPr><w:r><w:rPr><w:rFonts w:eastAsia="Verdana"/><w:sz w:val="18"/><w:szCs w:val="18"/></w:rPr><w:t>Une indemnité forfaitaire pour frais de recouvrement d’un montant de 40 euros est également exigible de plein droit en cas de retard de paiement</w:t></w:r><w:r><w:rPr><w:rFonts w:eastAsia="Verdana"/><w:sz w:val="18"/><w:szCs w:val="18"/><w:vertAlign w:val="superscript"/></w:rPr><w:footnoteReference w:id="4"/></w:r><w:r><w:rPr><w:rFonts w:eastAsia="Verdana"/><w:sz w:val="18"/><w:szCs w:val="18"/></w:rPr><w:t>. Lorsque les frais de recouvrement exposés sont supérieurs au montant de cette indemnité forfaitaire, une indemnisation complémentaire peut être réclamée sur justificatifs.</w:t></w:r></w:p><w:p><w:pPr><w:rPr><w:rFonts w:eastAsia="Verdana"/><w:sz w:val="18"/><w:szCs w:val="18"/></w:rPr></w:pPr><w:r><w:rPr><w:rFonts w:eastAsia="Verdana"/><w:sz w:val="18"/><w:szCs w:val="18"/></w:rPr><w:t>Toute contestation d’une facture devra être faite dès réception, préciser la prestation contestée, et être motivée ; ladite contestation ne pourra justifier le non-paiement des autres prestations non contestées, y compris celles réalisées concomitamment, simultanément, ou lorsque les conditions de recours à la facture périodique sont remplies, incluses dans la même facture.</w:t></w:r></w:p><w:p><w:pPr><w:rPr><w:rFonts w:eastAsia="Verdana"/><w:sz w:val="18"/><w:szCs w:val="18"/></w:rPr></w:pPr><w:r><w:rPr><w:rFonts w:eastAsia="Verdana"/><w:sz w:val="18"/><w:szCs w:val="18"/></w:rPr><w:t>Le non-paiement des honoraires pourra, après rappel par lettre recommandée avec accusé de réception, entraîner la suspension des travaux ou mettre fin à la mission.</w:t></w:r></w:p><w:p><w:pPr><w:rPr><w:rFonts w:eastAsia="Verdana"/><w:sz w:val="18"/><w:szCs w:val="18"/></w:rPr></w:pPr><w:r><w:rPr><w:rFonts w:eastAsia="Verdana"/><w:sz w:val="18"/><w:szCs w:val="18"/></w:rPr><w:t>En cas de changement de modalités de facturation, une information préalable sera donnée au client.</w:t></w:r></w:p><w:p><w:pPr><w:rPr><w:rFonts w:eastAsia="Verdana"/><w:sz w:val="18"/><w:szCs w:val="18"/></w:rPr></w:pPr><w:r><w:rPr><w:rFonts w:eastAsia="Verdana"/><w:sz w:val="18"/><w:szCs w:val="18"/></w:rPr><w:t xml:space="preserve">En cas de rupture du contrat par l’une ou l’autre des </w:t></w:r><w:r><w:rPr><w:rFonts w:eastAsia="Verdana"/><w:sz w:val="18"/><w:szCs w:val="18"/></w:rPr><w:t>parties, une assistance pour réaliser le transfert du dossier dans l’entreprise ou à un nouveau prestataire pourra être effectuée à la demande du client.</w:t></w:r></w:p><w:p><w:pPr><w:rPr><w:rFonts w:eastAsia="Verdana"/><w:sz w:val="18"/><w:szCs w:val="18"/></w:rPr></w:pPr><w:r><w:rPr><w:rFonts w:eastAsia="Verdana"/><w:sz w:val="18"/><w:szCs w:val="18"/></w:rPr><w:t xml:space="preserve">En cas d’usage du droit de rétention prévu à l’article 168 du Code de déontologie intégré au décret du 30 mars 2012 relatif à l’exercice de l’activité d’expertise comptable, le président du Conseil Régional de l’Ordre des experts-comptables sera informé. </w:t></w:r></w:p><w:p><w:pPr><w:rPr><w:rFonts w:eastAsia="Verdana"/><w:sz w:val="18"/><w:szCs w:val="18"/></w:rPr></w:pPr></w:p><w:p><w:pPr><w:pStyle w:val="Titre3"/><w:rPr><w:sz w:val="18"/><w:szCs w:val="18"/></w:rPr></w:pPr><w:r><w:rPr><w:sz w:val="18"/><w:szCs w:val="18"/></w:rPr><w:t>7</w:t></w:r><w:r><w:rPr><w:sz w:val="18"/><w:szCs w:val="18"/></w:rPr><w:t>- PROTECTION DES DONNEES PERSONNELLES (RGPD)</w:t></w:r></w:p><w:p><w:pPr><w:rPr><w:rFonts w:eastAsia="Verdana"/><w:sz w:val="18"/><w:szCs w:val="18"/></w:rPr></w:pPr><w:r><w:rPr><w:rFonts w:eastAsia="Verdana"/><w:sz w:val="18"/><w:szCs w:val="18"/></w:rPr><w:t xml:space="preserve">Le cabinet </w:t></w:r><w:r><w:rPr><w:rFonts w:eastAsia="Verdana"/><w:sz w:val="18"/><w:szCs w:val="18"/></w:rPr><w:t xml:space="preserve">MOON EXPERTISE </w:t></w:r><w:r><w:rPr><w:rFonts w:eastAsia="Verdana"/><w:sz w:val="18"/><w:szCs w:val="18"/></w:rPr><w:t xml:space="preserve">est qualifié de responsable conjoint de traitement. Le Client et le cabinet s’engagent à collecter et à traiter toute donnée personnelle en conformité avec toute réglementation en vigueur applicable au traitement de ces données, et notamment la loi n°78-17 du 6 janvier 1978 modifiée et le règlement européen sur la protection des données personnelles. </w:t></w:r></w:p><w:p><w:pPr><w:rPr><w:rFonts w:eastAsia="Verdana"/><w:sz w:val="18"/><w:szCs w:val="18"/></w:rPr></w:pPr><w:r><w:rPr><w:rFonts w:eastAsia="Verdana"/><w:sz w:val="18"/><w:szCs w:val="18"/></w:rPr><w:t xml:space="preserve">Le cabinet est autorisé à traiter pour le compte de son client les données personnelles nécessaires pour l’ensemble des missions dont il a la charge. </w:t></w:r></w:p><w:p><w:pPr><w:rPr><w:rFonts w:eastAsia="Verdana"/><w:sz w:val="18"/><w:szCs w:val="18"/></w:rPr></w:pPr><w:r><w:rPr><w:rFonts w:eastAsia="Verdana"/><w:sz w:val="18"/><w:szCs w:val="18"/></w:rPr><w:t xml:space="preserve">La nature des opérations réalisées sur les données est directement rattachée à ces missions. </w:t></w:r></w:p><w:p><w:pPr><w:rPr><w:rFonts w:eastAsia="Verdana"/><w:sz w:val="18"/><w:szCs w:val="18"/></w:rPr></w:pPr><w:r><w:rPr><w:rFonts w:eastAsia="Verdana"/><w:sz w:val="18"/><w:szCs w:val="18"/></w:rPr><w:t>Le client et le cabinet s’engagent à prendre toutes précautions utiles afin de préserver la sécurité des informations et notamment de les protéger contre toute destruction accidentelle ou illicite, perte accidentelle, altération, diffusion ou accès non autorisés.</w:t></w:r></w:p><w:p><w:pPr><w:rPr><w:rFonts w:eastAsia="Verdana"/><w:sz w:val="18"/><w:szCs w:val="18"/></w:rPr></w:pPr><w:r><w:rPr><w:rFonts w:eastAsia="Verdana"/><w:sz w:val="18"/><w:szCs w:val="18"/></w:rPr><w:t>Le cabinet s’engage à communiquer au Client la survenance de toute faille de sécurité ayant des conséquences directes ou indirectes sur le traitement, ainsi que toute plainte qui lui serait adressée par tout individu concerné par le traitement réalisé au titre du Contrat. Cette communication devra être effectuée dans les plus brefs délais et au maximum quarante-huit heures après la découverte de la faille de sécurité ou suivant réception d’une plainte. Le client se chargera de la notification éventuelle à l’autorité de contrôle et à la personne concernée.</w:t></w:r></w:p><w:p><w:pPr><w:rPr><w:rFonts w:eastAsia="Verdana"/><w:sz w:val="18"/><w:szCs w:val="18"/></w:rPr></w:pPr><w:r><w:rPr><w:rFonts w:eastAsia="Verdana"/><w:sz w:val="18"/><w:szCs w:val="18"/></w:rPr><w:t xml:space="preserve">Il appartient au client de fournir l’information aux personnes concernées par les opérations de traitement au moment de la collecte des données. </w:t></w:r></w:p><w:p><w:pPr><w:rPr><w:rFonts w:eastAsia="Verdana"/><w:sz w:val="18"/><w:szCs w:val="18"/></w:rPr></w:pPr><w:r><w:rPr><w:rFonts w:eastAsia="Verdana"/><w:sz w:val="18"/><w:szCs w:val="18"/></w:rPr><w:t>Le client devra également répondre aux demandes d’exercice des droits exercés par la personne concernée.</w:t></w:r></w:p><w:p><w:pPr><w:rPr><w:rFonts w:eastAsia="Verdana"/><w:sz w:val="18"/><w:szCs w:val="18"/></w:rPr></w:pPr><w:r><w:rPr><w:rFonts w:eastAsia="Verdana"/><w:sz w:val="18"/><w:szCs w:val="18"/></w:rPr><w:t>Les données qui sont susceptibles d'être conservées répondent aux obligations légales qui s’appliquent à l’expert-comptable.</w:t></w:r></w:p><w:p><w:pPr><w:rPr><w:rFonts w:eastAsia="Verdana"/><w:sz w:val="18"/><w:szCs w:val="18"/></w:rPr></w:pPr><w:r><w:rPr><w:rFonts w:eastAsia="Verdana"/><w:sz w:val="18"/><w:szCs w:val="18"/></w:rPr><w:t xml:space="preserve">Le cabinet collecte également des données d’identification dans le cadre des différentes missions confiées pour respecter ses obligations en matière de lutte contre le blanchiment des capitaux et financement du terrorisme. Dans le cadre de ce traitement, le cabinet a la qualité de responsable de traitement et conserve pendant cinq ans, à compter de la fin de la relation d’affaires, les documents et informations relatifs à l'identité des clients, des personnes agissant pour son compte et des bénéficiaires effectifs (article L 561-12 du Code monétaire et financier). Le cabinet conserve pendant cinq ans à compter de leur exécution, des documents et informations relatifs aux opérations faites ainsi que des documents consignant les caractéristiques des opérations mentionnées à l'article L. 561-10-2 du CMF. Ces données </w:t></w:r><w:r><w:rPr><w:rFonts w:eastAsia="Verdana"/><w:sz w:val="18"/><w:szCs w:val="18"/></w:rPr><w:lastRenderedPageBreak/><w:t>peuvent être communiquées aux autorités légales compétentes.</w:t></w:r></w:p><w:p><w:pPr><w:rPr><w:rFonts w:eastAsia="Verdana"/><w:sz w:val="18"/><w:szCs w:val="18"/></w:rPr></w:pPr></w:p><w:p><w:pPr><w:pStyle w:val="Titre3"/><w:rPr><w:sz w:val="18"/><w:szCs w:val="18"/></w:rPr></w:pPr><w:r><w:rPr><w:sz w:val="18"/><w:szCs w:val="18"/></w:rPr><w:t>8</w:t></w:r><w:r><w:rPr><w:sz w:val="18"/><w:szCs w:val="18"/></w:rPr><w:t>- RESPONSABILITE CIVILE PROFESSIONNELLE DE L’EXPERT-COMPTABLE</w:t></w:r></w:p><w:p><w:pPr><w:rPr><w:rFonts w:eastAsia="Verdana"/><w:sz w:val="18"/><w:szCs w:val="18"/></w:rPr></w:pPr><w:r><w:rPr><w:rFonts w:eastAsia="Verdana"/><w:sz w:val="18"/><w:szCs w:val="18"/></w:rPr><w:t xml:space="preserve">La responsabilité civile professionnelle de l’expert-comptable ne peut être mise en jeu que sur une période contractuellement définie à 3 ans à compter du jour où le client a connu ou aurait dû connaître les faits lui permettant de la mettre en cause. </w:t></w:r></w:p><w:p><w:pPr><w:rPr><w:rFonts w:eastAsia="Verdana"/><w:sz w:val="18"/><w:szCs w:val="18"/></w:rPr></w:pPr><w:r><w:rPr><w:rFonts w:eastAsia="Verdana"/><w:sz w:val="18"/><w:szCs w:val="18"/></w:rPr><w:t>Tout événement susceptible d’avoir des conséquences notamment en matière de responsabilité doit être porté sans délai par le client à la connaissance de l’expert-comptable.</w:t></w:r></w:p><w:p><w:pPr><w:rPr><w:rFonts w:eastAsia="Verdana"/><w:sz w:val="18"/><w:szCs w:val="18"/></w:rPr></w:pPr><w:r><w:rPr><w:rFonts w:eastAsia="Verdana"/><w:sz w:val="18"/><w:szCs w:val="18"/></w:rPr><w:t>La responsabilité contractuelle de l’expert-comptable à l’égard du client, pour toutes les conséquences dommageables d’une même mission, est limitée à un plafond de 5.000 euros.</w:t></w:r></w:p><w:p><w:pPr><w:rPr><w:rFonts w:eastAsia="Verdana"/><w:sz w:val="18"/><w:szCs w:val="18"/></w:rPr></w:pPr><w:r><w:rPr><w:rFonts w:eastAsia="Verdana"/><w:sz w:val="18"/><w:szCs w:val="18"/></w:rPr><w:t xml:space="preserve">La responsabilité civile professionnelle de l’expert-comptable est couverte par un contrat d’assurance souscrit auprès de la compagnie </w:t></w:r><w:r><w:rPr><w:rFonts w:eastAsia="Verdana"/><w:sz w:val="18"/><w:szCs w:val="18"/></w:rPr><w:t>MMA IARD ASSURANCES MUTUELLES, 160 rue Henri Champion 72030 le Mans cedex 9.</w:t></w:r></w:p><w:p><w:pPr><w:rPr><w:rFonts w:eastAsia="Verdana"/><w:sz w:val="18"/><w:szCs w:val="18"/></w:rPr></w:pPr><w:r><w:rPr><w:rFonts w:eastAsia="Verdana"/><w:sz w:val="18"/><w:szCs w:val="18"/></w:rPr><w:t>La responsabilité de l’expert-comptable ne peut notamment être engagée dans l’hypothèse où le préjudice subi par le client est une conséquence :</w:t></w:r></w:p><w:p><w:pPr><w:rPr><w:rFonts w:eastAsia="Verdana"/><w:sz w:val="18"/><w:szCs w:val="18"/></w:rPr></w:pPr><w:r><w:rPr><w:rFonts w:eastAsia="Verdana"/><w:sz w:val="18"/><w:szCs w:val="18"/></w:rPr><w:t>- d’une information erronée ou d’une faute ou négligence commise par le client ou par ses salariés,</w:t></w:r></w:p><w:p><w:pPr><w:rPr><w:rFonts w:eastAsia="Verdana"/><w:sz w:val="18"/><w:szCs w:val="18"/></w:rPr></w:pPr><w:r><w:rPr><w:rFonts w:eastAsia="Verdana"/><w:sz w:val="18"/><w:szCs w:val="18"/></w:rPr><w:t>- du retard ou de la carence du client à fournir une information nécessaire à l’expert-comptable,</w:t></w:r></w:p><w:p><w:pPr><w:rPr><w:rFonts w:eastAsia="Verdana"/><w:sz w:val="18"/><w:szCs w:val="18"/></w:rPr></w:pPr><w:r><w:rPr><w:rFonts w:eastAsia="Verdana"/><w:sz w:val="18"/><w:szCs w:val="18"/></w:rPr><w:t>- des fautes commises par des tiers intervenant chez le client.</w:t></w:r></w:p><w:p><w:pPr><w:rPr><w:rFonts w:eastAsia="Verdana"/><w:sz w:val="18"/><w:szCs w:val="18"/></w:rPr></w:pPr></w:p><w:p><w:pPr><w:pStyle w:val="Titre3"/><w:rPr><w:sz w:val="18"/><w:szCs w:val="18"/></w:rPr></w:pPr><w:r><w:rPr><w:sz w:val="18"/><w:szCs w:val="18"/></w:rPr><w:t>9</w:t></w:r><w:r><w:rPr><w:sz w:val="18"/><w:szCs w:val="18"/></w:rPr><w:t>- RESILIATION DE LA MISSION</w:t></w:r></w:p><w:p><w:pPr><w:rPr><w:rFonts w:eastAsia="Verdana"/><w:sz w:val="18"/><w:szCs w:val="18"/></w:rPr></w:pPr><w:r><w:rPr><w:rFonts w:eastAsia="Verdana"/><w:sz w:val="18"/><w:szCs w:val="18"/></w:rPr><w:t xml:space="preserve">En cas de résiliation par le client au cours d’un exercice comptable (ou pendant la mission en cas de mission ponctuelle), et sauf faute grave imputable à l’expert-comptable, le client devra verser à ce dernier les honoraires dus pour le travail déjà effectué, majorés d’une indemnité conventionnelle égale à 25% des honoraires annuels convenus pour l’exercice en cours ou de la dernière année d’honoraires en cas de montant incertain. </w:t></w:r></w:p><w:p><w:pPr><w:rPr><w:rFonts w:eastAsia="Verdana"/><w:sz w:val="18"/><w:szCs w:val="18"/></w:rPr></w:pPr><w:r><w:rPr><w:rFonts w:eastAsia="Verdana"/><w:sz w:val="18"/><w:szCs w:val="18"/></w:rPr><w:t>En cas de manquement du client à l’une de ses obligations, l’expert-comptable aura la faculté de mettre fin à sa mission après l’envoi d’une mise en demeure sous forme de lettre recommandée restée sans effet.</w:t></w:r></w:p><w:p><w:pPr><w:rPr><w:rFonts w:eastAsia="Verdana"/><w:sz w:val="18"/><w:szCs w:val="18"/></w:rPr></w:pPr><w:r><w:rPr><w:rFonts w:eastAsia="Verdana"/><w:sz w:val="18"/><w:szCs w:val="18"/></w:rPr><w:t xml:space="preserve">Dès la survenance d’un évènement susceptible de le placer dans une situation de conflit d’intérêts ou de porter atteinte à son indépendance, l’expert-comptable a l’obligation de dénoncer le contrat. </w:t></w:r></w:p><w:p><w:pPr><w:rPr><w:rFonts w:eastAsia="Verdana"/><w:sz w:val="18"/><w:szCs w:val="18"/></w:rPr></w:pPr></w:p><w:p><w:pPr><w:pStyle w:val="Titre3"/><w:rPr><w:sz w:val="18"/><w:szCs w:val="18"/></w:rPr></w:pPr><w:r><w:rPr><w:sz w:val="18"/><w:szCs w:val="18"/></w:rPr><w:t>10</w:t></w:r><w:r><w:rPr><w:sz w:val="18"/><w:szCs w:val="18"/></w:rPr><w:t>- SUSPENSION DE LA MISSION</w:t></w:r></w:p><w:p><w:pPr><w:rPr><w:rFonts w:eastAsia="Verdana"/><w:sz w:val="18"/><w:szCs w:val="18"/></w:rPr></w:pPr><w:r><w:rPr><w:rFonts w:eastAsia="Verdana"/><w:sz w:val="18"/><w:szCs w:val="18"/></w:rPr><w:t>Lorsque la mission est suspendue pour cause de force majeure</w:t></w:r><w:r><w:rPr><w:rFonts w:eastAsia="Verdana"/><w:sz w:val="18"/><w:szCs w:val="18"/><w:vertAlign w:val="superscript"/></w:rPr><w:footnoteReference w:id="5"/></w:r><w:r><w:rPr><w:rFonts w:eastAsia="Verdana"/><w:sz w:val="18"/><w:szCs w:val="18"/></w:rPr><w:t xml:space="preserve"> (empêchement temporaire), les délais de remise des travaux sont prolongés pour une durée égale à celle de la suspension susvisée, à moins que le retard en résultant ne justifie la résolution.</w:t></w:r></w:p><w:p><w:pPr><w:rPr><w:rFonts w:eastAsia="Verdana"/><w:sz w:val="18"/><w:szCs w:val="18"/></w:rPr></w:pPr><w:r><w:rPr><w:rFonts w:eastAsia="Verdana"/><w:sz w:val="18"/><w:szCs w:val="18"/></w:rPr><w:t>Pendant la période de suspension, toutes les dispositions du contrat demeurent applicables.</w:t></w:r></w:p><w:p><w:pPr><w:rPr><w:rFonts w:eastAsia="Verdana"/><w:sz w:val="18"/><w:szCs w:val="18"/></w:rPr></w:pPr><w:r><w:rPr><w:rFonts w:eastAsia="Verdana"/><w:sz w:val="18"/><w:szCs w:val="18"/></w:rPr><w:t>En cas de manquement du client à l’une de ses obligations (exemple : défaut de paiement des honoraires à l’échéance prévue), l’expert-comptable aura la faculté de suspendre sa mission après l’envoi d’une mise en demeure sous forme de lettre recommandée restée sans effet, et ne pourra être tenu responsable des conséquences préjudiciables pouvant découler de cette suspension.</w:t></w:r></w:p><w:p><w:pPr><w:rPr><w:rFonts w:eastAsia="Verdana"/><w:sz w:val="18"/><w:szCs w:val="18"/></w:rPr></w:pPr></w:p><w:p><w:pPr><w:pStyle w:val="Titre3"/><w:rPr><w:sz w:val="18"/><w:szCs w:val="18"/></w:rPr></w:pPr><w:r><w:rPr><w:sz w:val="18"/><w:szCs w:val="18"/></w:rPr><w:t>1</w:t></w:r><w:r><w:rPr><w:sz w:val="18"/><w:szCs w:val="18"/></w:rPr><w:t>1</w:t></w:r><w:r><w:rPr><w:sz w:val="18"/><w:szCs w:val="18"/></w:rPr><w:t>- DIFFERENDS</w:t></w:r></w:p><w:p><w:pPr><w:rPr><w:rFonts w:eastAsia="Verdana"/><w:sz w:val="18"/><w:szCs w:val="18"/></w:rPr></w:pPr><w:r><w:rPr><w:rFonts w:eastAsia="Verdana"/><w:sz w:val="18"/><w:szCs w:val="18"/></w:rPr><w:t>En cas de contestation par le client des conditions d’exercice de la mission ou de différend sur les honoraires, l’expert-comptable s’efforce de faire accepter la conciliation ou l’arbitrage du président du conseil régional de l’ordre avant toute action en justice</w:t></w:r><w:r><w:rPr><w:rFonts w:eastAsia="Verdana"/><w:sz w:val="18"/><w:szCs w:val="18"/><w:vertAlign w:val="superscript"/></w:rPr><w:footnoteReference w:id="6"/></w:r><w:r><w:rPr><w:rFonts w:eastAsia="Verdana"/><w:sz w:val="18"/><w:szCs w:val="18"/></w:rPr><w:t xml:space="preserve">. </w:t></w:r></w:p><w:p><w:pPr><w:rPr><w:rFonts w:eastAsia="Verdana"/><w:sz w:val="18"/><w:szCs w:val="18"/></w:rPr></w:pPr></w:p><w:p><w:pPr><w:pStyle w:val="Titre3"/><w:rPr><w:sz w:val="18"/><w:szCs w:val="18"/></w:rPr></w:pPr><w:r><w:rPr><w:sz w:val="18"/><w:szCs w:val="18"/></w:rPr><w:t>1</w:t></w:r><w:r><w:rPr><w:sz w:val="18"/><w:szCs w:val="18"/></w:rPr><w:t>2</w:t></w:r><w:r><w:rPr><w:sz w:val="18"/><w:szCs w:val="18"/></w:rPr><w:t>- DROIT APPLICABLE ET ATTRIBUTION DE COMPETENCE</w:t></w:r></w:p><w:p><w:pPr><w:rPr><w:rFonts w:eastAsia="Verdana"/><w:sz w:val="18"/><w:szCs w:val="18"/></w:rPr></w:pPr><w:r><w:rPr><w:rFonts w:eastAsia="Verdana"/><w:sz w:val="18"/><w:szCs w:val="18"/></w:rPr><w:t>Ce contrat de mission sera régi et interprété selon le droit français.</w:t></w:r></w:p><w:p><w:pPr><w:rPr><w:rFonts w:eastAsia="Verdana"/><w:sz w:val="18"/><w:szCs w:val="18"/></w:rPr></w:pPr><w:r><w:rPr><w:rFonts w:eastAsia="Verdana"/><w:sz w:val="18"/><w:szCs w:val="18"/></w:rPr><w:t>« TOUS LES LITIGES AUXQUELS LE CONTRAT POURRA DONNER LIEU, NOTAMMENT AU SUJET DE SA VALIDITE, DE SON INTERPRETATION, DE SON EXECUTION ET DE SA REALISATION, SERONT SOUMIS AUX TRIBUNAUX COMPETENTS DE PARIS »</w:t></w:r></w:p><w:sectPr><w:type w:val="continuous"/><w:pgSz w:w="11909" w:h="16834"/><w:pgMar w:top="1417" w:right="1417" w:bottom="1417" w:left="1417" w:header="567" w:footer="0" w:gutter="0"/><w:cols w:num="2" w:space="709"/><w:noEndnote/><w:docGrid w:linePitch="326"/></w:sectPr></w:body></w:document>
+<file path=word/document.xml><?xml version="1.0" encoding="utf-8"?>
+<w:document xmlns:wpc="http://schemas.microsoft.com/office/word/2010/wordprocessingCanvas" xmlns:cx="http://schemas.microsoft.com/office/drawing/2014/chartex" xmlns:cx1="http://schemas.microsoft.com/office/drawing/2015/9/8/chartex" xmlns:cx2="http://schemas.microsoft.com/office/drawing/2015/10/21/chartex" xmlns:cx3="http://schemas.microsoft.com/office/drawing/2016/5/9/chartex" xmlns:cx4="http://schemas.microsoft.com/office/drawing/2016/5/10/chartex" xmlns:cx5="http://schemas.microsoft.com/office/drawing/2016/5/11/chartex" xmlns:cx6="http://schemas.microsoft.com/office/drawing/2016/5/12/chartex" xmlns:cx7="http://schemas.microsoft.com/office/drawing/2016/5/13/chartex" xmlns:cx8="http://schemas.microsoft.com/office/drawing/2016/5/14/chartex" xmlns:mc="http://schemas.openxmlformats.org/markup-compatibility/2006" xmlns:aink="http://schemas.microsoft.com/office/drawing/2016/ink" xmlns:am3d="http://schemas.microsoft.com/office/drawing/2017/model3d" xmlns:o="urn:schemas-microsoft-com:office:office" xmlns:oel="http://schemas.microsoft.com/office/2019/extlst" xmlns:r="http://schemas.openxmlformats.org/officeDocument/2006/relationships" xmlns:m="http://schemas.openxmlformats.org/officeDocument/2006/math" xmlns:v="urn:schemas-microsoft-com:vml" xmlns:wp14="http://schemas.microsoft.com/office/word/2010/wordprocessingDrawing" xmlns:wp="http://schemas.openxmlformats.org/drawingml/2006/wordprocessingDrawing" xmlns:w10="urn:schemas-microsoft-com:office:word" xmlns:w="http://schemas.openxmlformats.org/wordprocessingml/2006/main" xmlns:w14="http://schemas.microsoft.com/office/word/2010/wordml" xmlns:w15="http://schemas.microsoft.com/office/word/2012/wordml" xmlns:w16cex="http://schemas.microsoft.com/office/word/2018/wordml/cex" xmlns:w16cid="http://schemas.microsoft.com/office/word/2016/wordml/cid" xmlns:w16="http://schemas.microsoft.com/office/word/2018/wordml" xmlns:w16du="http://schemas.microsoft.com/office/word/2023/wordml/word16du" xmlns:w16sdtdh="http://schemas.microsoft.com/office/word/2020/wordml/sdtdatahash" xmlns:w16sdtfl="http://schemas.microsoft.com/office/word/2024/wordml/sdtformatlock" xmlns:w16se="http://schemas.microsoft.com/office/word/2015/wordml/symex" xmlns:wpg="http://schemas.microsoft.com/office/word/2010/wordprocessingGroup" xmlns:wpi="http://schemas.microsoft.com/office/word/2010/wordprocessingInk" xmlns:wne="http://schemas.microsoft.com/office/word/2006/wordml" xmlns:wps="http://schemas.microsoft.com/office/word/2010/wordprocessingShape" mc:Ignorable="w14 w15 w16se w16cid w16 w16cex w16sdtdh w16sdtfl w16du wp14">
+  <w:body>
+    <w:p>
+      <w:pPr>
+        <w:rPr>
+          <w:rFonts w:cstheme="majorHAnsi"/>
+        </w:rPr>
+      </w:pPr>
+      <w:r>
+        <w:rPr>
+          <w:rFonts w:cstheme="majorHAnsi"/>
+          <w:noProof/>
+        </w:rPr>
+        <w:drawing>
+          <wp:anchor distT="0" distB="0" distL="114300" distR="114300" simplePos="0" relativeHeight="251655171" behindDoc="0" locked="0" layoutInCell="1" allowOverlap="1" wp14:anchorId="52F6E983" wp14:editId="36D5844A">
+            <wp:simplePos x="0" y="0"/>
+            <wp:positionH relativeFrom="column">
+              <wp:posOffset>537</wp:posOffset>
+            </wp:positionH>
+            <wp:positionV relativeFrom="paragraph">
+              <wp:posOffset>-76835</wp:posOffset>
+            </wp:positionV>
+            <wp:extent cx="971522" cy="971522"/>
+            <wp:effectExtent l="0" t="0" r="635" b="635"/>
+            <wp:wrapNone/>
+            <wp:docPr id="1981114389" name="Image 1571138217"/>
+            <wp:cNvGraphicFramePr>
+              <a:graphicFrameLocks xmlns:a="http://schemas.openxmlformats.org/drawingml/2006/main" noChangeAspect="1"/>
+            </wp:cNvGraphicFramePr>
+            <a:graphic xmlns:a="http://schemas.openxmlformats.org/drawingml/2006/main">
+              <a:graphicData uri="http://schemas.openxmlformats.org/drawingml/2006/picture">
+                <pic:pic xmlns:pic="http://schemas.openxmlformats.org/drawingml/2006/picture">
+                  <pic:nvPicPr>
+                    <pic:cNvPr id="1981114389" name="Image 1571138217"/>
+                    <pic:cNvPicPr>
+                      <a:picLocks noChangeAspect="1"/>
+                    </pic:cNvPicPr>
+                  </pic:nvPicPr>
+                  <pic:blipFill>
+                    <a:blip r:embed="rId12"/>
+                    <a:srcRect/>
+                    <a:stretch/>
+                  </pic:blipFill>
+                  <pic:spPr bwMode="auto">
+                    <a:xfrm>
+                      <a:off x="0" y="0"/>
+                      <a:ext cx="971522" cy="971522"/>
+                    </a:xfrm>
+                    <a:prstGeom prst="rect">
+                      <a:avLst/>
+                    </a:prstGeom>
+                    <a:noFill/>
+                    <a:ln>
+                      <a:noFill/>
+                    </a:ln>
+                  </pic:spPr>
+                </pic:pic>
+              </a:graphicData>
+            </a:graphic>
+          </wp:anchor>
+        </w:drawing>
+      </w:r>
+    </w:p>
+    <w:p>
+      <w:pPr>
+        <w:rPr>
+          <w:rFonts w:cstheme="majorHAnsi"/>
+        </w:rPr>
+      </w:pPr>
+    </w:p>
+    <w:p>
+      <w:pPr>
+        <w:rPr>
+          <w:rFonts w:cstheme="majorHAnsi"/>
+        </w:rPr>
+      </w:pPr>
+    </w:p>
+    <w:p>
+      <w:pPr>
+        <w:rPr>
+          <w:rFonts w:cstheme="majorHAnsi"/>
+        </w:rPr>
+      </w:pPr>
+    </w:p>
+    <w:p>
+      <w:pPr>
+        <w:rPr>
+          <w:rFonts w:cstheme="majorHAnsi"/>
+        </w:rPr>
+      </w:pPr>
+    </w:p>
+    <w:p>
+      <w:pPr>
+        <w:rPr>
+          <w:rFonts w:cstheme="majorHAnsi"/>
+        </w:rPr>
+      </w:pPr>
+    </w:p>
+    <w:p>
+      <w:pPr>
+        <w:tabs>
+          <w:tab w:val="center" w:pos="4537"/>
+        </w:tabs>
+        <w:rPr>
+          <w:rFonts w:cstheme="majorHAnsi"/>
+          <w:b/>
+          <w:bCs/>
+          <w:sz w:val="24"/>
+          <w:szCs w:val="22"/>
+        </w:rPr>
+      </w:pPr>
+      <w:r>
+        <w:rPr>
+          <w:rFonts w:cstheme="majorHAnsi"/>
+          <w:b/>
+          <w:bCs/>
+          <w:sz w:val="24"/>
+          <w:szCs w:val="22"/>
+        </w:rPr>
+        <w:t>MOON Expertise</w:t>
+      </w:r>
+      <w:r>
+        <w:rPr>
+          <w:rFonts w:cstheme="majorHAnsi"/>
+          <w:b/>
+          <w:bCs/>
+          <w:sz w:val="24"/>
+          <w:szCs w:val="22"/>
+        </w:rPr>
+        <w:tab/>
+      </w:r>
+    </w:p>
+    <w:p>
+      <w:pPr>
+        <w:rPr>
+          <w:rFonts w:cstheme="majorHAnsi"/>
+          <w:sz w:val="24"/>
+          <w:szCs w:val="22"/>
+        </w:rPr>
+      </w:pPr>
+      <w:r>
+        <w:rPr>
+          <w:rFonts w:cstheme="majorHAnsi"/>
+          <w:sz w:val="24"/>
+          <w:szCs w:val="22"/>
+        </w:rPr>
+        <w:t xml:space="preserve">6 rue Adolphe Yvon, </w:t>
+      </w:r>
+    </w:p>
+    <w:p>
+      <w:pPr>
+        <w:rPr>
+          <w:rFonts w:cstheme="majorHAnsi"/>
+          <w:sz w:val="24"/>
+          <w:szCs w:val="22"/>
+        </w:rPr>
+      </w:pPr>
+      <w:r>
+        <w:rPr>
+          <w:rFonts w:cstheme="majorHAnsi"/>
+          <w:sz w:val="24"/>
+          <w:szCs w:val="22"/>
+        </w:rPr>
+        <w:t>75116 Paris</w:t>
+      </w:r>
+    </w:p>
+    <w:p>
+      <w:pPr>
+        <w:rPr>
+          <w:rFonts w:cstheme="majorHAnsi"/>
+        </w:rPr>
+      </w:pPr>
+    </w:p>
+    <w:p>
+      <w:pPr>
+        <w:ind w:left="3600" w:firstLine="720"/>
+        <w:rPr>
+          <w:rFonts w:cstheme="majorHAnsi"/>
+          <w:b/>
+          <w:bCs/>
+        </w:rPr>
+      </w:pPr>
+      <w:r>
+        <w:rPr>
+          <w:rFonts w:cstheme="majorHAnsi"/>
+          <w:b/>
+          <w:bCs/>
+        </w:rPr>
+        <w:t xml:space="preserve">{Societe}</w:t>
+      </w:r>
+    </w:p>
+    <w:p>
+      <w:pPr>
+        <w:rPr>
+          <w:rFonts w:cstheme="majorHAnsi"/>
+          <w:b/>
+          <w:bCs/>
+        </w:rPr>
+      </w:pPr>
+      <w:r>
+        <w:rPr>
+          <w:rFonts w:cstheme="majorHAnsi"/>
+        </w:rPr>
+        <w:tab/>
+      </w:r>
+      <w:r>
+        <w:rPr>
+          <w:rFonts w:cstheme="majorHAnsi"/>
+        </w:rPr>
+        <w:tab/>
+      </w:r>
+      <w:r>
+        <w:rPr>
+          <w:rFonts w:cstheme="majorHAnsi"/>
+        </w:rPr>
+        <w:tab/>
+      </w:r>
+      <w:r>
+        <w:rPr>
+          <w:rFonts w:cstheme="majorHAnsi"/>
+        </w:rPr>
+        <w:tab/>
+      </w:r>
+      <w:r>
+        <w:rPr>
+          <w:rFonts w:cstheme="majorHAnsi"/>
+        </w:rPr>
+        <w:tab/>
+      </w:r>
+      <w:r>
+        <w:rPr>
+          <w:rFonts w:cstheme="majorHAnsi"/>
+        </w:rPr>
+        <w:tab/>
+      </w:r>
+      <w:r>
+        <w:rPr>
+          <w:rFonts w:cstheme="majorHAnsi"/>
+          <w:b/>
+          <w:bCs/>
+        </w:rPr>
+        <w:t xml:space="preserve">{Prenom} {Nom}</w:t>
+      </w:r>
+      <w:r>
+        <w:rPr>
+          <w:rFonts w:cstheme="majorHAnsi"/>
+          <w:b/>
+          <w:bCs/>
+        </w:rPr>
+        <w:t>,</w:t>
+      </w:r>
+    </w:p>
+    <w:p>
+      <w:pPr>
+        <w:rPr>
+          <w:rFonts w:cstheme="majorHAnsi"/>
+        </w:rPr>
+      </w:pPr>
+      <w:r>
+        <w:rPr>
+          <w:rFonts w:cstheme="majorHAnsi"/>
+        </w:rPr>
+        <w:tab/>
+      </w:r>
+      <w:r>
+        <w:rPr>
+          <w:rFonts w:cstheme="majorHAnsi"/>
+        </w:rPr>
+        <w:tab/>
+      </w:r>
+      <w:r>
+        <w:rPr>
+          <w:rFonts w:cstheme="majorHAnsi"/>
+        </w:rPr>
+        <w:tab/>
+      </w:r>
+      <w:r>
+        <w:rPr>
+          <w:rFonts w:cstheme="majorHAnsi"/>
+        </w:rPr>
+        <w:tab/>
+      </w:r>
+      <w:r>
+        <w:rPr>
+          <w:rFonts w:cstheme="majorHAnsi"/>
+        </w:rPr>
+        <w:tab/>
+      </w:r>
+      <w:r>
+        <w:rPr>
+          <w:rFonts w:cstheme="majorHAnsi"/>
+        </w:rPr>
+        <w:tab/>
+      </w:r>
+      <w:r>
+        <w:rPr>
+          <w:rFonts w:cstheme="majorHAnsi"/>
+        </w:rPr>
+        <w:t xml:space="preserve">{Adresse_Siege},</w:t>
+      </w:r>
+    </w:p>
+    <w:p>
+      <w:pPr>
+        <w:rPr>
+          <w:rFonts w:cstheme="majorHAnsi"/>
+        </w:rPr>
+      </w:pPr>
+      <w:r>
+        <w:rPr>
+          <w:rFonts w:cstheme="majorHAnsi"/>
+        </w:rPr>
+        <w:tab/>
+      </w:r>
+      <w:r>
+        <w:rPr>
+          <w:rFonts w:cstheme="majorHAnsi"/>
+        </w:rPr>
+        <w:tab/>
+      </w:r>
+      <w:r>
+        <w:rPr>
+          <w:rFonts w:cstheme="majorHAnsi"/>
+        </w:rPr>
+        <w:tab/>
+      </w:r>
+      <w:r>
+        <w:rPr>
+          <w:rFonts w:cstheme="majorHAnsi"/>
+        </w:rPr>
+        <w:tab/>
+      </w:r>
+      <w:r>
+        <w:rPr>
+          <w:rFonts w:cstheme="majorHAnsi"/>
+        </w:rPr>
+        <w:tab/>
+      </w:r>
+      <w:r>
+        <w:rPr>
+          <w:rFonts w:cstheme="majorHAnsi"/>
+        </w:rPr>
+        <w:tab/>
+      </w:r>
+      <w:r>
+        <w:rPr>
+          <w:rFonts w:cstheme="majorHAnsi"/>
+        </w:rPr>
+        <w:t xml:space="preserve">{Code_postal} {Ville}</w:t>
+      </w:r>
+    </w:p>
+    <w:p>
+      <w:pPr>
+        <w:rPr>
+          <w:rFonts w:cstheme="majorHAnsi"/>
+        </w:rPr>
+      </w:pPr>
+    </w:p>
+    <w:p>
+      <w:pPr>
+        <w:rPr>
+          <w:rFonts w:cstheme="majorHAnsi"/>
+        </w:rPr>
+      </w:pPr>
+      <w:r>
+        <w:rPr>
+          <w:rFonts w:cstheme="majorHAnsi"/>
+        </w:rPr>
+        <w:tab/>
+      </w:r>
+      <w:r>
+        <w:rPr>
+          <w:rFonts w:cstheme="majorHAnsi"/>
+        </w:rPr>
+        <w:tab/>
+      </w:r>
+      <w:r>
+        <w:rPr>
+          <w:rFonts w:cstheme="majorHAnsi"/>
+        </w:rPr>
+        <w:tab/>
+      </w:r>
+      <w:r>
+        <w:rPr>
+          <w:rFonts w:cstheme="majorHAnsi"/>
+        </w:rPr>
+        <w:tab/>
+      </w:r>
+      <w:r>
+        <w:rPr>
+          <w:rFonts w:cstheme="majorHAnsi"/>
+        </w:rPr>
+        <w:tab/>
+      </w:r>
+      <w:r>
+        <w:rPr>
+          <w:rFonts w:cstheme="majorHAnsi"/>
+        </w:rPr>
+        <w:tab/>
+      </w:r>
+      <w:r>
+        <w:rPr>
+          <w:rFonts w:cstheme="majorHAnsi"/>
+        </w:rPr>
+        <w:t>A Paris</w:t>
+      </w:r>
+      <w:r>
+        <w:rPr>
+          <w:rFonts w:cstheme="majorHAnsi"/>
+        </w:rPr>
+        <w:t xml:space="preserve">, le </w:t>
+      </w:r>
+      <w:r>
+        <w:rPr>
+          <w:rFonts w:cstheme="majorHAnsi"/>
+        </w:rPr>
+        <w:fldChar w:fldCharType="begin"/>
+      </w:r>
+      <w:r>
+        <w:rPr>
+          <w:rFonts w:cstheme="majorHAnsi"/>
+        </w:rPr>
+        <w:instrText xml:space="preserve"> DATE  \@ "d MMMM yyyy"  \* MERGEFORMAT </w:instrText>
+      </w:r>
+      <w:r>
+        <w:rPr>
+          <w:rFonts w:cstheme="majorHAnsi"/>
+        </w:rPr>
+        <w:fldChar w:fldCharType="separate"/>
+      </w:r>
+      <w:r>
+        <w:rPr>
+          <w:rFonts w:cstheme="majorHAnsi"/>
+          <w:noProof/>
+        </w:rPr>
+        <w:t>23 juillet 2026</w:t>
+      </w:r>
+      <w:r>
+        <w:rPr>
+          <w:rFonts w:cstheme="majorHAnsi"/>
+        </w:rPr>
+        <w:fldChar w:fldCharType="end"/>
+      </w:r>
+      <w:r>
+        <w:rPr>
+          <w:rFonts w:cstheme="majorHAnsi"/>
+        </w:rPr>
+        <w:t>,</w:t>
+      </w:r>
+    </w:p>
+    <w:p>
+      <w:pPr>
+        <w:rPr>
+          <w:rFonts w:cstheme="majorHAnsi"/>
+        </w:rPr>
+      </w:pPr>
+    </w:p>
+    <w:p>
+      <w:pPr>
+        <w:rPr>
+          <w:rFonts w:cstheme="majorHAnsi"/>
+        </w:rPr>
+      </w:pPr>
+    </w:p>
+    <w:p>
+      <w:pPr>
+        <w:rPr>
+          <w:rFonts w:cstheme="majorHAnsi"/>
+        </w:rPr>
+      </w:pPr>
+      <w:r>
+        <w:rPr>
+          <w:rFonts w:cstheme="majorHAnsi"/>
+        </w:rPr>
+        <w:t>{Cher}</w:t>
+      </w:r>
+      <w:r>
+        <w:rPr>
+          <w:rFonts w:cstheme="majorHAnsi"/>
+        </w:rPr>
+        <w:t xml:space="preserve"> </w:t>
+      </w:r>
+      <w:r>
+        <w:rPr>
+          <w:rFonts w:cstheme="majorHAnsi"/>
+        </w:rPr>
+        <w:t xml:space="preserve">{Titre}</w:t>
+      </w:r>
+      <w:r>
+        <w:rPr>
+          <w:rFonts w:cstheme="majorHAnsi"/>
+        </w:rPr>
+        <w:t> </w:t>
+      </w:r>
+      <w:r>
+        <w:rPr>
+          <w:rFonts w:cstheme="majorHAnsi"/>
+        </w:rPr>
+        <w:t xml:space="preserve">{Prenom} {Nom}</w:t>
+      </w:r>
+      <w:r>
+        <w:rPr>
+          <w:rFonts w:cstheme="majorHAnsi"/>
+        </w:rPr>
+        <w:t>,</w:t>
+      </w:r>
+    </w:p>
+    <w:p>
+      <w:pPr>
+        <w:rPr>
+          <w:rFonts w:cstheme="majorHAnsi"/>
+        </w:rPr>
+      </w:pPr>
+    </w:p>
+    <w:p>
+      <w:pPr>
+        <w:rPr>
+          <w:rFonts w:cstheme="majorHAnsi"/>
+        </w:rPr>
+      </w:pPr>
+      <w:r>
+        <w:rPr>
+          <w:rFonts w:cstheme="majorHAnsi"/>
+        </w:rPr>
+        <w:t>Pour donner suite</w:t>
+      </w:r>
+      <w:r>
+        <w:rPr>
+          <w:rFonts w:cstheme="majorHAnsi"/>
+        </w:rPr>
+        <w:t xml:space="preserve"> à no</w:t>
+      </w:r>
+      <w:r>
+        <w:rPr>
+          <w:rFonts w:cstheme="majorHAnsi"/>
+        </w:rPr>
+        <w:t>s différents échanges</w:t>
+      </w:r>
+      <w:r>
+        <w:rPr>
+          <w:rFonts w:cstheme="majorHAnsi"/>
+        </w:rPr>
+        <w:t>, je vous adresse cette lettre de mission qui a pour objet de définir les diverses interventions que nous serions amenés à effectuer, et de préciser d’un commun accord les conditions de notre collaboration.</w:t>
+      </w:r>
+    </w:p>
+    <w:p>
+      <w:pPr>
+        <w:rPr>
+          <w:rFonts w:cstheme="majorHAnsi"/>
+        </w:rPr>
+      </w:pPr>
+    </w:p>
+    <w:p>
+      <w:pPr>
+        <w:rPr>
+          <w:rFonts w:cstheme="majorHAnsi"/>
+        </w:rPr>
+      </w:pPr>
+      <w:r>
+        <w:rPr>
+          <w:rFonts w:cstheme="majorHAnsi"/>
+        </w:rPr>
+        <w:t>Il est bien entendu que la mission ainsi fixée pourra, sur votre demande, être étendue à des interventions complémentaires.</w:t>
+      </w:r>
+    </w:p>
+    <w:p>
+      <w:pPr>
+        <w:rPr>
+          <w:rFonts w:cstheme="majorHAnsi"/>
+        </w:rPr>
+      </w:pPr>
+    </w:p>
+    <w:p>
+      <w:pPr>
+        <w:pBdr>
+          <w:bottom w:val="single" w:sz="4" w:space="1" w:color="auto"/>
+        </w:pBdr>
+        <w:rPr>
+          <w:rFonts w:cstheme="majorHAnsi"/>
+        </w:rPr>
+      </w:pPr>
+      <w:r>
+        <w:rPr>
+          <w:rFonts w:cstheme="majorHAnsi"/>
+          <w:b/>
+          <w:bCs/>
+          <w:color w:val="0D1122"/>
+          <w:sz w:val="72"/>
+          <w:szCs w:val="56"/>
+        </w:rPr>
+        <w:t>LETTRE DE MISSION</w:t>
+      </w:r>
+    </w:p>
+    <w:p>
+      <w:pPr>
+        <w:pStyle w:val="Titre1"/>
+      </w:pPr>
+      <w:r>
+        <w:t>I. OBJET DE LA MISSION</w:t>
+      </w:r>
+    </w:p>
+    <w:p>
+      <w:r>
+        <w:t>La mission que vous envisagez de nous confier est une mission de gestion de la Paie. Celle-ci comprend l’établissement des bulletins de salaires et les déclarations auprès des différents organismes sociaux (URSSAF, Retraite, Prévoyance, Mutuelle, DGFIP) par le biais des déclarations sociales nominatives (DSN).</w:t>
+      </w:r>
+    </w:p>
+    <w:p/>
+    <w:p>
+      <w:r>
+        <w:t>Cette mission comporte :</w:t>
+      </w:r>
+    </w:p>
+    <w:p>
+      <w:r>
+        <w:t>- De notre part, des obligations de moyens et de diligences ;</w:t>
+      </w:r>
+    </w:p>
+    <w:p>
+      <w:r>
+        <w:t>- De votre part, un devoir d’information et de coopération.</w:t>
+      </w:r>
+    </w:p>
+    <w:p/>
+    <w:p>
+      <w:r>
+        <w:t>Les obligations réciproques sont résumées dans le tableau figurant en annexe.</w:t>
+      </w:r>
+    </w:p>
+    <w:p>
+      <w:pPr>
+        <w:pStyle w:val="Titre1"/>
+      </w:pPr>
+      <w:r>
+        <w:t>II</w:t>
+      </w:r>
+      <w:r>
+        <w:t>. Durée de la mission</w:t>
+      </w:r>
+    </w:p>
+    <w:p>
+      <w:pPr>
+        <w:rPr>
+          <w:rFonts w:eastAsia="Verdana" w:cs="Nadeem"/>
+          <w:b/>
+          <w:bCs/>
+          <w:color w:val="C4BEB2"/>
+        </w:rPr>
+      </w:pPr>
+      <w:r>
+        <w:t>La mission est conclue pour la durée de l’année civile. Pour cette première année, la mission couvre la période comprise entre la date d’effet de la lettre de mission et la date de clôture de l’année civile, date d’échéance du contrat.</w:t>
+      </w:r>
+      <w:r>
+        <w:t xml:space="preserve"> </w:t>
+      </w:r>
+      <w:r>
+        <w:t>La mission est renouvelée par tacite reconduction, à chaque fois pour l’exercice suivant, sauf dénonciation par lettre recommandée avec accusé de réception 3 mois avant la date de clôture de l’année civile.</w:t>
+      </w:r>
+      <w:r>
+        <w:br w:type="page"/>
+      </w:r>
+    </w:p>
+    <w:p>
+      <w:pPr>
+        <w:pStyle w:val="Titre1"/>
+      </w:pPr>
+      <w:r>
+        <w:lastRenderedPageBreak/>
+        <w:t>III</w:t>
+      </w:r>
+      <w:r>
+        <w:t xml:space="preserve">. </w:t>
+      </w:r>
+      <w:r>
+        <w:t>Missions complémentaires</w:t>
+      </w:r>
+    </w:p>
+    <w:p>
+      <w:r>
+        <w:t>Cette mission pourra être étendue à des missions complémentaires, de conseil et d’assistance, qui pourront porter notamment, sur l’établissement de projets de contrats de travail, le suivi de procédures de rupture de contrat de travail (Rupture conventionnelle, licenciement, démission, départ à la retraite,...), la définition et le choix d’une politique salariale, l’assistance et la représentation en cas de contrôle administrative d’organismes sociaux.</w:t>
+      </w:r>
+    </w:p>
+    <w:p/>
+    <w:p>
+      <w:r>
+        <w:t>Ces travaux seront réalisés dans les conditions définies au sein de l’Annexe 1.</w:t>
+      </w:r>
+      <w:r>
+        <w:t xml:space="preserve"> </w:t>
+      </w:r>
+      <w:r>
+        <w:t>Ils ne feront pas l’objet, d’une lettre de mission spécifique.</w:t>
+      </w:r>
+    </w:p>
+    <w:p>
+      <w:pPr>
+        <w:pStyle w:val="Titre1"/>
+      </w:pPr>
+      <w:r>
+        <w:t>IV</w:t>
+      </w:r>
+      <w:r>
+        <w:t>. Modalités relationnelles</w:t>
+      </w:r>
+    </w:p>
+    <w:p>
+      <w:r>
+        <w:t>Nos relations seront réglées sur le plan juridique tant par les termes de cette lettre que par les conditions générales jointes ainsi que par un tableau de répartition des obligations respectives entre votre entité et notre cabinet afin de réaliser cette mission dans des conditions optimales (voir Annexes 2 et 3).</w:t>
+      </w:r>
+      <w:r>
+        <w:t xml:space="preserve"> </w:t>
+      </w:r>
+      <w:r>
+        <w:t xml:space="preserve">Tout aménagement devant éventuellement être apporté aux missions définies ci-dessus sera préalablement arrêté d'un commun accord. </w:t>
+      </w:r>
+    </w:p>
+    <w:p>
+      <w:pPr>
+        <w:pStyle w:val="Titre1"/>
+      </w:pPr>
+      <w:r>
+        <w:t>V</w:t>
+      </w:r>
+      <w:r>
+        <w:t>. Honoraires</w:t>
+      </w:r>
+    </w:p>
+    <w:p>
+      <w:r>
+        <w:t>Les honoraires relatifs à la gestion des bulletins de salaire et des missions qui s’y rattachent sont présentés dans le tableau ci-dessous :</w:t>
+      </w:r>
+    </w:p>
+    <w:p/>
+    <w:p>
+      <w:pPr>
+        <w:jc w:val="center"/>
+      </w:pPr>
+      <w:r>
+        <w:drawing>
+          <wp:inline distT="0" distB="0" distL="0" distR="0" wp14:anchorId="1DF19E34" wp14:editId="49E8E072">
+            <wp:extent cx="4449289" cy="4727276"/>
+            <wp:effectExtent l="0" t="0" r="8890" b="0"/>
+            <wp:docPr id="1349133554" name="Image 10"/>
+            <wp:cNvGraphicFramePr>
+              <a:graphicFrameLocks xmlns:a="http://schemas.openxmlformats.org/drawingml/2006/main" noChangeAspect="1"/>
+            </wp:cNvGraphicFramePr>
+            <a:graphic xmlns:a="http://schemas.openxmlformats.org/drawingml/2006/main">
+              <a:graphicData uri="http://schemas.openxmlformats.org/drawingml/2006/picture">
+                <pic:pic xmlns:pic="http://schemas.openxmlformats.org/drawingml/2006/picture">
+                  <pic:nvPicPr>
+                    <pic:cNvPr id="0" name="Picture 105"/>
+                    <pic:cNvPicPr>
+                      <a:picLocks noChangeAspect="1" noChangeArrowheads="1"/>
+                    </pic:cNvPicPr>
+                  </pic:nvPicPr>
+                  <pic:blipFill>
+                    <a:blip r:embed="rId13">
+                      <a:extLst>
+                        <a:ext uri="{28A0092B-C50C-407E-A947-70E740481C1C}">
+                          <a14:useLocalDpi xmlns:a14="http://schemas.microsoft.com/office/drawing/2010/main" val="0"/>
+                        </a:ext>
+                      </a:extLst>
+                    </a:blip>
+                    <a:srcRect/>
+                    <a:stretch>
+                      <a:fillRect/>
+                    </a:stretch>
+                  </pic:blipFill>
+                  <pic:spPr bwMode="auto">
+                    <a:xfrm>
+                      <a:off x="0" y="0"/>
+                      <a:ext cx="4449289" cy="4727276"/>
+                    </a:xfrm>
+                    <a:prstGeom prst="rect">
+                      <a:avLst/>
+                    </a:prstGeom>
+                    <a:noFill/>
+                    <a:ln>
+                      <a:noFill/>
+                    </a:ln>
+                  </pic:spPr>
+                </pic:pic>
+              </a:graphicData>
+            </a:graphic>
+          </wp:inline>
+        </w:drawing>
+      </w:r>
+    </w:p>
+    <w:p>
+      <w:pPr>
+        <w:jc w:val="center"/>
+      </w:pPr>
+    </w:p>
+    <w:p>
+      <w:r>
+        <w:t xml:space="preserve">Attention : </w:t>
+      </w:r>
+    </w:p>
+    <w:p>
+      <w:pPr>
+        <w:numPr>
+          <w:ilvl w:val="0"/>
+          <w:numId w:val="46"/>
+        </w:numPr>
+      </w:pPr>
+      <w:r>
+        <w:t>Afin que nous puissions établir les DPAE en temps et en heure, il vous faudra nous transmettre les informations relatives à chaque nouveau salarié au moins 48 heures avant le début effectif de chaque contrat</w:t>
+      </w:r>
+      <w:r>
+        <w:t> ;</w:t>
+      </w:r>
+    </w:p>
+    <w:p>
+      <w:pPr>
+        <w:numPr>
+          <w:ilvl w:val="0"/>
+          <w:numId w:val="46"/>
+        </w:numPr>
+      </w:pPr>
+      <w:r>
+        <w:t>Si vous souhaitez que nous nous occupions des adhésions auprès des organismes complémentaires (prévoyance et mutuelle) ainsi qu’à la médecine du travail, il vous faudra nous le notifier expressément.</w:t>
+      </w:r>
+    </w:p>
+    <w:p>
+      <w:pPr>
+        <w:pStyle w:val="Titre1"/>
+      </w:pPr>
+      <w:r>
+        <w:t>VI</w:t>
+      </w:r>
+      <w:r>
+        <w:t>. Modifications apportées aux conditions générales</w:t>
+      </w:r>
+    </w:p>
+    <w:p>
+      <w:r>
+        <w:t>Les parties, après en avoir discuté, sont convenues de n'apporter aucune dérogation aux conditions générales.</w:t>
+      </w:r>
+    </w:p>
+    <w:p>
+      <w:r>
+        <w:t>Nous vous serions obligés de bien vouloir nous retourner un exemplaire de la présente et des annexes jointes, dont les conditions générales qui font partie intégrante de la lettre de mission, revêtues d’un paraphe sur chacune des pages et de votre signature sur la dernière page de la lettre de mission, attestant de votre prise de connaissance et acceptation de la lettre de mission et de ses annexes.</w:t>
+      </w:r>
+    </w:p>
+    <w:p>
+      <w:pPr>
+        <w:pStyle w:val="Titre1"/>
+      </w:pPr>
+      <w:r>
+        <w:t>VII</w:t>
+      </w:r>
+      <w:r>
+        <w:t xml:space="preserve">. </w:t>
+      </w:r>
+      <w:r>
+        <w:t xml:space="preserve">Echéancier de facturation et de </w:t>
+      </w:r>
+      <w:r>
+        <w:t>prélèvement</w:t>
+      </w:r>
+    </w:p>
+    <w:p>
+      <w:pPr>
+        <w:rPr>
+          <w:rFonts w:cstheme="majorHAnsi"/>
+        </w:rPr>
+      </w:pPr>
+      <w:r>
+        <w:rPr>
+          <w:rFonts w:cstheme="majorHAnsi"/>
+        </w:rPr>
+        <w:t xml:space="preserve">Les </w:t>
+      </w:r>
+      <w:r>
+        <w:rPr>
+          <w:rFonts w:cstheme="majorHAnsi"/>
+        </w:rPr>
+        <w:t>honoraires</w:t>
+      </w:r>
+      <w:r>
+        <w:rPr>
+          <w:rFonts w:cstheme="majorHAnsi"/>
+        </w:rPr>
+        <w:t xml:space="preserve"> prévus ci-dessus sont facturés et prélevés selon un échéancier mensuel défini.</w:t>
+      </w:r>
+    </w:p>
+    <w:p>
+      <w:pPr>
+        <w:rPr>
+          <w:rFonts w:cstheme="majorHAnsi"/>
+        </w:rPr>
+      </w:pPr>
+    </w:p>
+    <w:p>
+      <w:pPr>
+        <w:rPr>
+          <w:rFonts w:cstheme="majorHAnsi"/>
+        </w:rPr>
+      </w:pPr>
+      <w:r>
+        <w:rPr>
+          <w:rFonts w:cstheme="majorHAnsi"/>
+        </w:rPr>
+        <w:t xml:space="preserve">Votre signature de la présente emporte l’acceptation de ce mode de </w:t>
+      </w:r>
+      <w:r>
+        <w:rPr>
+          <w:rFonts w:cstheme="majorHAnsi"/>
+        </w:rPr>
+        <w:t xml:space="preserve">facturation et de </w:t>
+      </w:r>
+      <w:r>
+        <w:rPr>
+          <w:rFonts w:cstheme="majorHAnsi"/>
+        </w:rPr>
+        <w:t>paiement. Un mandat de prélèvement intégralement renseigné vous sera transmis, pour signature, concomitamment à la signature de la présente.</w:t>
+      </w:r>
+    </w:p>
+    <w:p>
+      <w:pPr>
+        <w:widowControl/>
+        <w:autoSpaceDE/>
+        <w:autoSpaceDN/>
+        <w:adjustRightInd/>
+        <w:jc w:val="left"/>
+        <w:rPr>
+          <w:rFonts w:cstheme="majorHAnsi"/>
+        </w:rPr>
+      </w:pPr>
+    </w:p>
+    <w:p>
+      <w:pPr>
+        <w:rPr>
+          <w:rFonts w:cstheme="majorHAnsi"/>
+        </w:rPr>
+      </w:pPr>
+      <w:r>
+        <w:rPr>
+          <w:rFonts w:cstheme="majorHAnsi"/>
+          <w:noProof/>
+        </w:rPr>
+        <w:t>Nous vous</w:t>
+      </w:r>
+      <w:r>
+        <w:rPr>
+          <w:rFonts w:cstheme="majorHAnsi"/>
+        </w:rPr>
+        <w:t xml:space="preserve"> </w:t>
+      </w:r>
+      <w:r>
+        <w:rPr>
+          <w:rFonts w:cstheme="majorHAnsi"/>
+        </w:rPr>
+        <w:t>remercions</w:t>
+      </w:r>
+      <w:r>
+        <w:rPr>
+          <w:rFonts w:cstheme="majorHAnsi"/>
+        </w:rPr>
+        <w:t xml:space="preserve"> de la confiance que vous voudrez bien nous témoigner</w:t>
+      </w:r>
+      <w:r>
+        <w:rPr>
+          <w:rFonts w:cstheme="majorHAnsi"/>
+        </w:rPr>
+        <w:t>.</w:t>
+      </w:r>
+    </w:p>
+    <w:p>
+      <w:pPr>
+        <w:rPr>
+          <w:rFonts w:cstheme="majorHAnsi"/>
+        </w:rPr>
+      </w:pPr>
+    </w:p>
+    <w:p>
+      <w:pPr>
+        <w:rPr>
+          <w:rFonts w:cstheme="majorHAnsi"/>
+        </w:rPr>
+      </w:pPr>
+    </w:p>
+    <w:p>
+      <w:pPr>
+        <w:rPr>
+          <w:rFonts w:cstheme="majorHAnsi"/>
+          <w:u w:val="single"/>
+        </w:rPr>
+      </w:pPr>
+      <w:r>
+        <w:rPr>
+          <w:rFonts w:cstheme="majorHAnsi"/>
+          <w:u w:val="single"/>
+        </w:rPr>
+        <w:t>Le client,</w:t>
+      </w:r>
+    </w:p>
+    <w:p>
+      <w:pPr>
+        <w:jc w:val="left"/>
+        <w:rPr>
+          <w:rFonts w:cstheme="majorHAnsi"/>
+          <w:b/>
+          <w:bCs/>
+        </w:rPr>
+      </w:pPr>
+      <w:r>
+        <w:rPr>
+          <w:rFonts w:cstheme="majorHAnsi"/>
+          <w:b/>
+          <w:bCs/>
+        </w:rPr>
+        <w:t xml:space="preserve">{Societe}</w:t>
+      </w:r>
+    </w:p>
+    <w:p>
+      <w:pPr>
+        <w:rPr>
+          <w:rFonts w:cstheme="majorHAnsi"/>
+        </w:rPr>
+      </w:pPr>
+      <w:r>
+        <w:rPr>
+          <w:rFonts w:cstheme="majorHAnsi"/>
+        </w:rPr>
+        <w:t xml:space="preserve">{Prenom} {Nom}</w:t>
+      </w:r>
+      <w:r>
+        <w:rPr>
+          <w:rFonts w:cstheme="majorHAnsi"/>
+        </w:rPr>
+        <w:t>,</w:t>
+      </w:r>
+    </w:p>
+    <w:p>
+      <w:pPr>
+        <w:rPr>
+          <w:rFonts w:cstheme="majorHAnsi"/>
+        </w:rPr>
+      </w:pPr>
+      <w:r>
+        <w:rPr>
+          <w:rFonts w:cstheme="majorHAnsi"/>
+        </w:rPr>
+        <w:t>Dirigeant/ Représentant légal</w:t>
+      </w:r>
+    </w:p>
+    <w:p>
+      <w:pPr>
+        <w:rPr>
+          <w:rFonts w:cstheme="majorHAnsi"/>
+        </w:rPr>
+      </w:pPr>
+    </w:p>
+    <w:p>
+      <w:pPr>
+        <w:rPr>
+          <w:rFonts w:cstheme="majorHAnsi"/>
+        </w:rPr>
+      </w:pPr>
+    </w:p>
+    <w:p>
+      <w:pPr>
+        <w:rPr>
+          <w:rFonts w:cstheme="majorHAnsi"/>
+        </w:rPr>
+      </w:pPr>
+    </w:p>
+    <w:p>
+      <w:pPr>
+        <w:rPr>
+          <w:rFonts w:cstheme="majorHAnsi"/>
+        </w:rPr>
+      </w:pPr>
+    </w:p>
+    <w:p>
+      <w:pPr>
+        <w:rPr>
+          <w:rFonts w:cstheme="majorHAnsi"/>
+        </w:rPr>
+      </w:pPr>
+    </w:p>
+    <w:p>
+      <w:pPr>
+        <w:rPr>
+          <w:rFonts w:cstheme="majorHAnsi"/>
+        </w:rPr>
+      </w:pPr>
+    </w:p>
+    <w:p>
+      <w:pPr>
+        <w:rPr>
+          <w:rFonts w:cstheme="majorHAnsi"/>
+        </w:rPr>
+      </w:pPr>
+    </w:p>
+    <w:p>
+      <w:pPr>
+        <w:rPr>
+          <w:rFonts w:cstheme="majorHAnsi"/>
+          <w:u w:val="single"/>
+        </w:rPr>
+      </w:pPr>
+      <w:r>
+        <w:rPr>
+          <w:rFonts w:cstheme="majorHAnsi"/>
+          <w:u w:val="single"/>
+        </w:rPr>
+        <w:t>La structure inscrite à l’Ordre des Experts-comptables</w:t>
+      </w:r>
+    </w:p>
+    <w:p>
+      <w:pPr>
+        <w:rPr>
+          <w:rFonts w:cstheme="majorHAnsi"/>
+          <w:b/>
+          <w:bCs/>
+        </w:rPr>
+      </w:pPr>
+      <w:r>
+        <w:rPr>
+          <w:rFonts w:cstheme="majorHAnsi"/>
+          <w:b/>
+          <w:bCs/>
+        </w:rPr>
+        <w:t>MOON E</w:t>
+      </w:r>
+      <w:r>
+        <w:rPr>
+          <w:rFonts w:cstheme="majorHAnsi"/>
+          <w:b/>
+          <w:bCs/>
+        </w:rPr>
+        <w:t>xpertise</w:t>
+      </w:r>
+    </w:p>
+    <w:p>
+      <w:pPr>
+        <w:rPr>
+          <w:rFonts w:cstheme="majorHAnsi"/>
+        </w:rPr>
+      </w:pPr>
+      <w:r>
+        <w:rPr>
+          <w:rFonts w:cstheme="majorHAnsi"/>
+        </w:rPr>
+        <w:t>Benjamin PEREZ</w:t>
+      </w:r>
+    </w:p>
+    <w:p>
+      <w:pPr>
+        <w:rPr>
+          <w:rFonts w:cstheme="majorHAnsi"/>
+        </w:rPr>
+      </w:pPr>
+      <w:r>
+        <w:rPr>
+          <w:rFonts w:cstheme="majorHAnsi"/>
+        </w:rPr>
+        <w:t>Expert-comptable, Gérant</w:t>
+      </w:r>
+    </w:p>
+    <w:p>
+      <w:pPr>
+        <w:rPr>
+          <w:rFonts w:cstheme="majorHAnsi"/>
+        </w:rPr>
+      </w:pPr>
+    </w:p>
+    <w:p>
+      <w:pPr>
+        <w:rPr>
+          <w:rFonts w:cstheme="majorHAnsi"/>
+        </w:rPr>
+      </w:pPr>
+      <w:r>
+        <w:rPr>
+          <w:rFonts w:cstheme="majorHAnsi"/>
+        </w:rPr>
+        <w:br w:type="page"/>
+      </w:r>
+    </w:p>
+    <w:p>
+      <w:pPr>
+        <w:pStyle w:val="Titre2"/>
+      </w:pPr>
+      <w:r>
+        <w:lastRenderedPageBreak/>
+        <w:t>Annexe 1 – Tableau des prestations complémentaires</w:t>
+      </w:r>
+    </w:p>
+    <w:p>
+      <w:pPr>
+        <w:widowControl/>
+        <w:autoSpaceDE/>
+        <w:autoSpaceDN/>
+        <w:adjustRightInd/>
+        <w:jc w:val="left"/>
+        <w:rPr>
+          <w:rFonts w:cstheme="majorHAnsi"/>
+        </w:rPr>
+      </w:pPr>
+    </w:p>
+    <w:p>
+      <w:pPr>
+        <w:rPr>
+          <w:rFonts w:cstheme="majorHAnsi"/>
+        </w:rPr>
+        <w:sectPr>
+          <w:footerReference w:type="default" r:id="rId14"/>
+          <w:headerReference w:type="first" r:id="rId15"/>
+          <w:footerReference w:type="first" r:id="rId16"/>
+          <w:pgSz w:w="11909" w:h="16834"/>
+          <w:pgMar w:top="1417" w:right="1417" w:bottom="1417" w:left="1417" w:header="624" w:footer="0" w:gutter="0"/>
+          <w:cols w:space="425"/>
+          <w:noEndnote/>
+          <w:titlePg/>
+          <w:docGrid w:linePitch="326"/>
+        </w:sectPr>
+      </w:pPr>
+    </w:p>
+    <w:p>
+      <w:pPr>
+        <w:rPr>
+          <w:rFonts w:cstheme="majorHAnsi"/>
+        </w:rPr>
+      </w:pPr>
+      <w:r>
+        <w:drawing>
+          <wp:inline distT="0" distB="0" distL="0" distR="0" wp14:anchorId="1CA161F6" wp14:editId="052461FA">
+            <wp:extent cx="5762625" cy="7750810"/>
+            <wp:effectExtent l="0" t="0" r="9525" b="2540"/>
+            <wp:docPr id="110811485" name="Image 11"/>
+            <wp:cNvGraphicFramePr>
+              <a:graphicFrameLocks xmlns:a="http://schemas.openxmlformats.org/drawingml/2006/main" noChangeAspect="1"/>
+            </wp:cNvGraphicFramePr>
+            <a:graphic xmlns:a="http://schemas.openxmlformats.org/drawingml/2006/main">
+              <a:graphicData uri="http://schemas.openxmlformats.org/drawingml/2006/picture">
+                <pic:pic xmlns:pic="http://schemas.openxmlformats.org/drawingml/2006/picture">
+                  <pic:nvPicPr>
+                    <pic:cNvPr id="0" name="Picture 106"/>
+                    <pic:cNvPicPr>
+                      <a:picLocks noChangeAspect="1" noChangeArrowheads="1"/>
+                    </pic:cNvPicPr>
+                  </pic:nvPicPr>
+                  <pic:blipFill>
+                    <a:blip r:embed="rId17">
+                      <a:extLst>
+                        <a:ext uri="{28A0092B-C50C-407E-A947-70E740481C1C}">
+                          <a14:useLocalDpi xmlns:a14="http://schemas.microsoft.com/office/drawing/2010/main" val="0"/>
+                        </a:ext>
+                      </a:extLst>
+                    </a:blip>
+                    <a:srcRect/>
+                    <a:stretch>
+                      <a:fillRect/>
+                    </a:stretch>
+                  </pic:blipFill>
+                  <pic:spPr bwMode="auto">
+                    <a:xfrm>
+                      <a:off x="0" y="0"/>
+                      <a:ext cx="5762625" cy="7750810"/>
+                    </a:xfrm>
+                    <a:prstGeom prst="rect">
+                      <a:avLst/>
+                    </a:prstGeom>
+                    <a:noFill/>
+                    <a:ln>
+                      <a:noFill/>
+                    </a:ln>
+                  </pic:spPr>
+                </pic:pic>
+              </a:graphicData>
+            </a:graphic>
+          </wp:inline>
+        </w:drawing>
+      </w:r>
+    </w:p>
+    <w:p>
+      <w:pPr>
+        <w:widowControl/>
+        <w:autoSpaceDE/>
+        <w:autoSpaceDN/>
+        <w:adjustRightInd/>
+        <w:jc w:val="left"/>
+        <w:rPr>
+          <w:rFonts w:cstheme="majorHAnsi"/>
+        </w:rPr>
+      </w:pPr>
+      <w:r>
+        <w:rPr>
+          <w:rFonts w:cstheme="majorHAnsi"/>
+        </w:rPr>
+        <w:br w:type="page"/>
+      </w:r>
+    </w:p>
+    <w:p>
+      <w:pPr>
+        <w:pStyle w:val="Titre2"/>
+      </w:pPr>
+      <w:r>
+        <w:lastRenderedPageBreak/>
+        <w:t xml:space="preserve">Annexe 2 – </w:t>
+      </w:r>
+      <w:r>
+        <w:t>Tableau de répartition des taches</w:t>
+      </w:r>
+    </w:p>
+    <w:p>
+      <w:pPr>
+        <w:rPr>
+          <w:rFonts w:cstheme="majorHAnsi"/>
+        </w:rPr>
+      </w:pPr>
+    </w:p>
+    <w:p>
+      <w:pPr>
+        <w:widowControl/>
+        <w:autoSpaceDE/>
+        <w:autoSpaceDN/>
+        <w:adjustRightInd/>
+        <w:jc w:val="left"/>
+        <w:rPr>
+          <w:rFonts w:cstheme="majorHAnsi"/>
+        </w:rPr>
+      </w:pPr>
+      <w:r>
+        <w:rPr>
+          <w:rFonts w:cstheme="majorHAnsi"/>
+          <w:noProof/>
+        </w:rPr>
+        <w:object w:dxaOrig="0" w:dyaOrig="0" w14:anchorId="0A9908D7">
+          <v:shapetype id="_x0000_t75" coordsize="21600,21600" o:spt="75" o:preferrelative="t" path="m@4@5l@4@11@9@11@9@5xe" filled="f" stroked="f">
+            <v:stroke joinstyle="miter"/>
+            <v:formulas>
+              <v:f eqn="if lineDrawn pixelLineWidth 0"/>
+              <v:f eqn="sum @0 1 0"/>
+              <v:f eqn="sum 0 0 @1"/>
+              <v:f eqn="prod @2 1 2"/>
+              <v:f eqn="prod @3 21600 pixelWidth"/>
+              <v:f eqn="prod @3 21600 pixelHeight"/>
+              <v:f eqn="sum @0 0 1"/>
+              <v:f eqn="prod @6 1 2"/>
+              <v:f eqn="prod @7 21600 pixelWidth"/>
+              <v:f eqn="sum @8 21600 0"/>
+              <v:f eqn="prod @7 21600 pixelHeight"/>
+              <v:f eqn="sum @10 21600 0"/>
+            </v:formulas>
+            <v:path o:extrusionok="f" gradientshapeok="t" o:connecttype="rect"/>
+            <o:lock v:ext="edit" aspectratio="t"/>
+          </v:shapetype>
+          <v:shape id="_x0000_s2055" type="#_x0000_t75" style="position:absolute;margin-left:.05pt;margin-top:8.3pt;width:468.35pt;height:343.8pt;z-index:-251662335;mso-position-horizontal-relative:text;mso-position-vertical-relative:text">
+            <v:imagedata r:id="rId18" o:title=""/>
+            <w10:wrap type="square"/>
+          </v:shape>
+          <o:OLEObject Type="Embed" ProgID="Excel.Sheet.12" ShapeID="_x0000_s2055" DrawAspect="Content" ObjectID="_1846328801" r:id="rId19"/>
+        </w:object>
+      </w:r>
+      <w:r>
+        <w:rPr>
+          <w:rFonts w:cstheme="majorHAnsi"/>
+        </w:rPr>
+        <w:br w:type="page"/>
+      </w:r>
+      <w:r>
+        <w:rPr>
+          <w:rFonts w:cstheme="majorHAnsi"/>
+          <w:noProof/>
+        </w:rPr>
+        <w:lastRenderedPageBreak/>
+        <w:object w:dxaOrig="0" w:dyaOrig="0" w14:anchorId="0A9908D7">
+          <v:shape id="_x0000_s2056" type="#_x0000_t75" style="position:absolute;margin-left:.7pt;margin-top:35.5pt;width:474.55pt;height:347.5pt;z-index:-251662334;mso-position-horizontal-relative:text;mso-position-vertical-relative:text">
+            <v:imagedata r:id="rId20" o:title=""/>
+            <w10:wrap type="square"/>
+          </v:shape>
+          <o:OLEObject Type="Embed" ProgID="Excel.Sheet.12" ShapeID="_x0000_s2056" DrawAspect="Content" ObjectID="_1846328802" r:id="rId21"/>
+        </w:object>
+      </w:r>
+      <w:r>
+        <w:rPr>
+          <w:rFonts w:cstheme="majorHAnsi"/>
+        </w:rPr>
+        <w:br w:type="page"/>
+      </w:r>
+    </w:p>
+    <w:p>
+      <w:pPr>
+        <w:spacing w:after="40"/>
+        <w:ind w:right="701"/>
+        <w:jc w:val="center"/>
+        <w:rPr>
+          <w:rFonts w:ascii="Arial" w:eastAsia="Verdana" w:hAnsi="Arial"/>
+          <w:b/>
+          <w:bCs/>
+          <w:sz w:val="20"/>
+        </w:rPr>
+      </w:pPr>
+      <w:r>
+        <w:rPr>
+          <w:rFonts w:ascii="Arial" w:eastAsia="Verdana" w:hAnsi="Arial"/>
+          <w:b/>
+          <w:bCs/>
+          <w:sz w:val="20"/>
+        </w:rPr>
+        <w:lastRenderedPageBreak/>
+        <w:t>A</w:t>
+      </w:r>
+      <w:r>
+        <w:rPr>
+          <w:rFonts w:ascii="Arial" w:eastAsia="Verdana" w:hAnsi="Arial"/>
+          <w:b/>
+          <w:bCs/>
+          <w:sz w:val="20"/>
+        </w:rPr>
+        <w:t>nnexe</w:t>
+      </w:r>
+      <w:r>
+        <w:rPr>
+          <w:rFonts w:ascii="Arial" w:eastAsia="Verdana" w:hAnsi="Arial"/>
+          <w:b/>
+          <w:bCs/>
+          <w:sz w:val="20"/>
+        </w:rPr>
+        <w:t xml:space="preserve"> </w:t>
+      </w:r>
+      <w:r>
+        <w:rPr>
+          <w:rFonts w:ascii="Arial" w:eastAsia="Verdana" w:hAnsi="Arial"/>
+          <w:b/>
+          <w:bCs/>
+          <w:sz w:val="20"/>
+        </w:rPr>
+        <w:t>3 – Conditions générales</w:t>
+      </w:r>
+    </w:p>
+    <w:p>
+      <w:pPr>
+        <w:spacing w:after="40"/>
+        <w:ind w:right="701"/>
+        <w:jc w:val="center"/>
+        <w:rPr>
+          <w:rFonts w:ascii="Arial" w:eastAsia="Verdana" w:hAnsi="Arial"/>
+          <w:b/>
+          <w:bCs/>
+          <w:sz w:val="20"/>
+        </w:rPr>
+      </w:pPr>
+    </w:p>
+    <w:p>
+      <w:pPr>
+        <w:rPr>
+          <w:rFonts w:eastAsia="Verdana"/>
+        </w:rPr>
+      </w:pPr>
+    </w:p>
+    <w:p>
+      <w:pPr>
+        <w:pStyle w:val="Titre3"/>
+        <w:sectPr>
+          <w:headerReference w:type="default" r:id="rId22"/>
+          <w:type w:val="continuous"/>
+          <w:pgSz w:w="11909" w:h="16834"/>
+          <w:pgMar w:top="1417" w:right="1417" w:bottom="1417" w:left="1417" w:header="567" w:footer="0" w:gutter="0"/>
+          <w:cols w:space="425"/>
+          <w:noEndnote/>
+          <w:docGrid w:linePitch="326"/>
+        </w:sectPr>
+      </w:pPr>
+    </w:p>
+    <w:p>
+      <w:pPr>
+        <w:pStyle w:val="Titre3"/>
+        <w:rPr>
+          <w:sz w:val="18"/>
+          <w:szCs w:val="18"/>
+        </w:rPr>
+      </w:pPr>
+      <w:r>
+        <w:rPr>
+          <w:sz w:val="18"/>
+          <w:szCs w:val="18"/>
+        </w:rPr>
+        <w:t>1- DOMAINE D’APPLICATION</w:t>
+      </w:r>
+    </w:p>
+    <w:p>
+      <w:pPr>
+        <w:rPr>
+          <w:rFonts w:eastAsia="Verdana"/>
+          <w:sz w:val="18"/>
+          <w:szCs w:val="18"/>
+        </w:rPr>
+      </w:pPr>
+      <w:r>
+        <w:rPr>
+          <w:rFonts w:eastAsia="Verdana"/>
+          <w:sz w:val="18"/>
+          <w:szCs w:val="18"/>
+        </w:rPr>
+        <w:t xml:space="preserve">Les présentes conditions sont applicables aux conventions portant sur les missions conclues entre le cabinet </w:t>
+      </w:r>
+      <w:r>
+        <w:rPr>
+          <w:rFonts w:eastAsia="Verdana"/>
+          <w:sz w:val="18"/>
+          <w:szCs w:val="18"/>
+        </w:rPr>
+        <w:t xml:space="preserve">MOON EXPERTISE </w:t>
+      </w:r>
+      <w:r>
+        <w:rPr>
+          <w:rFonts w:eastAsia="Verdana"/>
+          <w:sz w:val="18"/>
+          <w:szCs w:val="18"/>
+        </w:rPr>
+        <w:t>dénommé l’expert-comptable et son client.</w:t>
+      </w:r>
+    </w:p>
+    <w:p>
+      <w:pPr>
+        <w:rPr>
+          <w:rFonts w:eastAsia="Verdana"/>
+          <w:sz w:val="18"/>
+          <w:szCs w:val="18"/>
+        </w:rPr>
+      </w:pPr>
+      <w:r>
+        <w:rPr>
+          <w:rFonts w:eastAsia="Verdana"/>
+          <w:sz w:val="18"/>
+          <w:szCs w:val="18"/>
+        </w:rPr>
+        <w:t>Le client reconnaît qu’il contracte en qualité de professionnel</w:t>
+      </w:r>
+      <w:r>
+        <w:rPr>
+          <w:rFonts w:eastAsia="Verdana"/>
+          <w:sz w:val="18"/>
+          <w:szCs w:val="18"/>
+          <w:vertAlign w:val="superscript"/>
+        </w:rPr>
+        <w:footnoteReference w:id="2"/>
+      </w:r>
+      <w:r>
+        <w:rPr>
+          <w:rFonts w:eastAsia="Verdana"/>
+          <w:sz w:val="18"/>
+          <w:szCs w:val="18"/>
+        </w:rPr>
+        <w:t xml:space="preserve"> et que la lettre de mission annexée constitue un contrat de prestations de services en rapport direct avec ses activités professionnelles.</w:t>
+      </w:r>
+    </w:p>
+    <w:p>
+      <w:pPr>
+        <w:rPr>
+          <w:rFonts w:eastAsia="Verdana"/>
+          <w:sz w:val="18"/>
+          <w:szCs w:val="18"/>
+        </w:rPr>
+      </w:pPr>
+    </w:p>
+    <w:p>
+      <w:pPr>
+        <w:pStyle w:val="Titre3"/>
+        <w:rPr>
+          <w:sz w:val="18"/>
+          <w:szCs w:val="18"/>
+        </w:rPr>
+      </w:pPr>
+      <w:r>
+        <w:rPr>
+          <w:sz w:val="18"/>
+          <w:szCs w:val="18"/>
+        </w:rPr>
+        <w:t>2- DEFINITION DE LA MISSION</w:t>
+      </w:r>
+    </w:p>
+    <w:p>
+      <w:pPr>
+        <w:rPr>
+          <w:rFonts w:eastAsia="Verdana"/>
+          <w:sz w:val="18"/>
+          <w:szCs w:val="18"/>
+        </w:rPr>
+      </w:pPr>
+      <w:r>
+        <w:rPr>
+          <w:rFonts w:eastAsia="Verdana"/>
+          <w:sz w:val="18"/>
+          <w:szCs w:val="18"/>
+        </w:rPr>
+        <w:t>Les travaux incombant à l’expert-comptable sont détaillés dans la lettre de mission et ses annexes et sont strictement limités à son contenu.</w:t>
+      </w:r>
+    </w:p>
+    <w:p>
+      <w:pPr>
+        <w:rPr>
+          <w:rFonts w:eastAsia="Verdana"/>
+          <w:sz w:val="18"/>
+          <w:szCs w:val="18"/>
+        </w:rPr>
+      </w:pPr>
+    </w:p>
+    <w:p>
+      <w:pPr>
+        <w:rPr>
+          <w:rFonts w:eastAsia="Verdana"/>
+          <w:b/>
+          <w:bCs/>
+          <w:sz w:val="18"/>
+          <w:szCs w:val="18"/>
+        </w:rPr>
+      </w:pPr>
+      <w:r>
+        <w:rPr>
+          <w:rFonts w:eastAsia="Verdana"/>
+          <w:b/>
+          <w:bCs/>
+          <w:sz w:val="18"/>
+          <w:szCs w:val="18"/>
+        </w:rPr>
+        <w:t>3- SOUS TRAITANCE</w:t>
+      </w:r>
+    </w:p>
+    <w:p>
+      <w:pPr>
+        <w:rPr>
+          <w:rFonts w:eastAsia="Verdana"/>
+          <w:sz w:val="18"/>
+          <w:szCs w:val="18"/>
+        </w:rPr>
+      </w:pPr>
+      <w:r>
+        <w:rPr>
+          <w:rFonts w:eastAsia="Verdana"/>
+          <w:sz w:val="18"/>
+          <w:szCs w:val="18"/>
+        </w:rPr>
+        <w:t xml:space="preserve">Le </w:t>
+      </w:r>
+      <w:r>
+        <w:rPr>
+          <w:rFonts w:eastAsia="Verdana"/>
+          <w:sz w:val="18"/>
+          <w:szCs w:val="18"/>
+        </w:rPr>
+        <w:t>c</w:t>
+      </w:r>
+      <w:r>
+        <w:rPr>
+          <w:rFonts w:eastAsia="Verdana"/>
+          <w:sz w:val="18"/>
+          <w:szCs w:val="18"/>
+        </w:rPr>
+        <w:t>lient est informé et accepte que l</w:t>
+      </w:r>
+      <w:r>
+        <w:rPr>
+          <w:rFonts w:eastAsia="Verdana"/>
+          <w:sz w:val="18"/>
+          <w:szCs w:val="18"/>
+        </w:rPr>
+        <w:t xml:space="preserve">’expert-comptable </w:t>
+      </w:r>
+      <w:r>
+        <w:rPr>
+          <w:rFonts w:eastAsia="Verdana"/>
+          <w:sz w:val="18"/>
+          <w:szCs w:val="18"/>
+        </w:rPr>
+        <w:t>fasse appel, pour l’exécution de tout ou partie des prestations objet du présent contrat, au sous-traitant suivant :</w:t>
+      </w:r>
+    </w:p>
+    <w:p>
+      <w:pPr>
+        <w:rPr>
+          <w:rFonts w:eastAsia="Verdana"/>
+          <w:sz w:val="18"/>
+          <w:szCs w:val="18"/>
+        </w:rPr>
+      </w:pPr>
+    </w:p>
+    <w:p>
+      <w:pPr>
+        <w:rPr>
+          <w:rFonts w:eastAsia="Verdana"/>
+          <w:sz w:val="18"/>
+          <w:szCs w:val="18"/>
+        </w:rPr>
+      </w:pPr>
+      <w:r>
+        <w:rPr>
+          <w:rFonts w:eastAsia="Verdana"/>
+          <w:sz w:val="18"/>
+          <w:szCs w:val="18"/>
+        </w:rPr>
+        <w:t>La société EXPAND CPA, située au 3, rue Jules Lefebvre, 75009 Paris, immatriculée au RCS de Paris sous le numéro 879 971 422, représentée par Monsieur Samuel ATTALI, en sa qualité de Gérant, ci-après désignée « le Sous-traitant ».</w:t>
+      </w:r>
+    </w:p>
+    <w:p>
+      <w:pPr>
+        <w:rPr>
+          <w:rFonts w:eastAsia="Verdana"/>
+          <w:sz w:val="18"/>
+          <w:szCs w:val="18"/>
+        </w:rPr>
+      </w:pPr>
+    </w:p>
+    <w:p>
+      <w:pPr>
+        <w:rPr>
+          <w:rFonts w:eastAsia="Verdana"/>
+          <w:sz w:val="18"/>
+          <w:szCs w:val="18"/>
+        </w:rPr>
+      </w:pPr>
+      <w:r>
+        <w:rPr>
+          <w:rFonts w:eastAsia="Verdana"/>
+          <w:sz w:val="18"/>
+          <w:szCs w:val="18"/>
+        </w:rPr>
+        <w:t>L’expert-comptable s’engage à ce que le sous-traitant respecte l’ensemble des obligations mises à sa charge au titre du présent contrat.</w:t>
+      </w:r>
+    </w:p>
+    <w:p>
+      <w:pPr>
+        <w:rPr>
+          <w:rFonts w:eastAsia="Verdana"/>
+          <w:sz w:val="18"/>
+          <w:szCs w:val="18"/>
+        </w:rPr>
+      </w:pPr>
+    </w:p>
+    <w:p>
+      <w:pPr>
+        <w:pStyle w:val="Titre3"/>
+        <w:rPr>
+          <w:sz w:val="18"/>
+          <w:szCs w:val="18"/>
+        </w:rPr>
+      </w:pPr>
+      <w:r>
+        <w:rPr>
+          <w:sz w:val="18"/>
+          <w:szCs w:val="18"/>
+        </w:rPr>
+        <w:t>4</w:t>
+      </w:r>
+      <w:r>
+        <w:rPr>
+          <w:sz w:val="18"/>
+          <w:szCs w:val="18"/>
+        </w:rPr>
+        <w:t>- OBLIGATIONS DE L’EXPERT-COMPTABLE</w:t>
+      </w:r>
+    </w:p>
+    <w:p>
+      <w:pPr>
+        <w:rPr>
+          <w:rFonts w:eastAsia="Verdana"/>
+          <w:sz w:val="18"/>
+          <w:szCs w:val="18"/>
+        </w:rPr>
+      </w:pPr>
+      <w:r>
+        <w:rPr>
+          <w:rFonts w:eastAsia="Verdana"/>
+          <w:sz w:val="18"/>
+          <w:szCs w:val="18"/>
+        </w:rPr>
+        <w:t>L’expert-comptable effectue la mission qui lui est confiée conformément aux dispositions du Code de déontologie intégré au décret du 30 mars 2012 relatif à l’exercice de l’activité d’expertise comptable, de la norme professionnelle de « Maîtrise de la qualité », de la norme professionnelle relative aux obligations de la profession d’expertise comptable en matière de lutte contre le blanchiment des capitaux et le financement du terrorisme (NPLAB)  élaborée en application des dispositions du Code monétaire et financier et le cas échéant de la norme professionnelle de travail spécifique à la mission considérée. Il contracte, en raison de cette mission, une obligation de moyens.</w:t>
+      </w:r>
+    </w:p>
+    <w:p>
+      <w:pPr>
+        <w:rPr>
+          <w:rFonts w:eastAsia="Verdana"/>
+          <w:sz w:val="18"/>
+          <w:szCs w:val="18"/>
+        </w:rPr>
+      </w:pPr>
+      <w:r>
+        <w:rPr>
+          <w:rFonts w:eastAsia="Verdana"/>
+          <w:sz w:val="18"/>
+          <w:szCs w:val="18"/>
+        </w:rPr>
+        <w:t>L’expert-comptable peut se faire assister par les collaborateurs de son choix. Le nom du collaborateur principal chargé du dossier est indiqué au client.</w:t>
+      </w:r>
+    </w:p>
+    <w:p>
+      <w:pPr>
+        <w:rPr>
+          <w:rFonts w:eastAsia="Verdana"/>
+          <w:sz w:val="18"/>
+          <w:szCs w:val="18"/>
+        </w:rPr>
+      </w:pPr>
+      <w:r>
+        <w:rPr>
+          <w:rFonts w:eastAsia="Verdana"/>
+          <w:sz w:val="18"/>
+          <w:szCs w:val="18"/>
+        </w:rPr>
+        <w:t>A l’achèvement de sa mission, l’expert-comptable restitue les documents appartenant au client que ce dernier lui a confiés pour l’exécution de la mission.</w:t>
+      </w:r>
+    </w:p>
+    <w:p>
+      <w:pPr>
+        <w:rPr>
+          <w:rFonts w:eastAsia="Verdana"/>
+          <w:sz w:val="18"/>
+          <w:szCs w:val="18"/>
+        </w:rPr>
+      </w:pPr>
+      <w:r>
+        <w:rPr>
+          <w:rFonts w:eastAsia="Verdana"/>
+          <w:sz w:val="18"/>
+          <w:szCs w:val="18"/>
+        </w:rPr>
+        <w:t>L’expert-comptable est tenu :</w:t>
+      </w:r>
+    </w:p>
+    <w:p>
+      <w:pPr>
+        <w:rPr>
+          <w:rFonts w:eastAsia="Verdana"/>
+          <w:sz w:val="18"/>
+          <w:szCs w:val="18"/>
+        </w:rPr>
+      </w:pPr>
+      <w:r>
+        <w:rPr>
+          <w:rFonts w:eastAsia="Verdana"/>
+          <w:sz w:val="18"/>
+          <w:szCs w:val="18"/>
+        </w:rPr>
+        <w:t>- à une obligation au secret professionnel dans les conditions prévues à l’article 226-13 du Code pénal ;</w:t>
+      </w:r>
+    </w:p>
+    <w:p>
+      <w:pPr>
+        <w:rPr>
+          <w:rFonts w:eastAsia="Verdana"/>
+          <w:sz w:val="18"/>
+          <w:szCs w:val="18"/>
+        </w:rPr>
+      </w:pPr>
+      <w:r>
+        <w:rPr>
+          <w:rFonts w:eastAsia="Verdana"/>
+          <w:sz w:val="18"/>
+          <w:szCs w:val="18"/>
+        </w:rPr>
+        <w:t xml:space="preserve">- à une obligation de discrétion, distincte de l’obligation précédente, quant aux informations recueillies et à la diffusion des documents qu’il a établis. Ces derniers sont </w:t>
+      </w:r>
+      <w:r>
+        <w:rPr>
+          <w:rFonts w:eastAsia="Verdana"/>
+          <w:sz w:val="18"/>
+          <w:szCs w:val="18"/>
+        </w:rPr>
+        <w:t>adressés au client, à l’exclusion de tout envoi à un tiers, sauf demande du client. Les documents établis par l’expert-comptable seront en conséquence adressés au client, à l’exclusion de tout envoi direct à un tiers (sauf instruction spécifique de la part du client et exception faite des transmissions aux administrations fiscales et sociales et OGA).</w:t>
+      </w:r>
+    </w:p>
+    <w:p>
+      <w:pPr>
+        <w:rPr>
+          <w:rFonts w:eastAsia="Verdana"/>
+          <w:sz w:val="18"/>
+          <w:szCs w:val="18"/>
+        </w:rPr>
+      </w:pPr>
+    </w:p>
+    <w:p>
+      <w:pPr>
+        <w:pStyle w:val="Titre3"/>
+        <w:rPr>
+          <w:sz w:val="18"/>
+          <w:szCs w:val="18"/>
+        </w:rPr>
+      </w:pPr>
+      <w:r>
+        <w:rPr>
+          <w:sz w:val="18"/>
+          <w:szCs w:val="18"/>
+        </w:rPr>
+        <w:t>5</w:t>
+      </w:r>
+      <w:r>
+        <w:rPr>
+          <w:sz w:val="18"/>
+          <w:szCs w:val="18"/>
+        </w:rPr>
+        <w:t>- OBLIGATIONS DU CLIENT</w:t>
+      </w:r>
+    </w:p>
+    <w:p>
+      <w:pPr>
+        <w:rPr>
+          <w:rFonts w:eastAsia="Verdana"/>
+          <w:sz w:val="18"/>
+          <w:szCs w:val="18"/>
+        </w:rPr>
+      </w:pPr>
+      <w:r>
+        <w:rPr>
+          <w:rFonts w:eastAsia="Verdana"/>
+          <w:sz w:val="18"/>
+          <w:szCs w:val="18"/>
+        </w:rPr>
+        <w:t>Le client s’interdit tout acte de nature à porter atteinte à l’indépendance de l’expert-comptable ou de ses collaborateurs, notamment en s’abstenant de leur faire toutes offres d’exécuter des missions pour leur propre compte ou de devenir salarié du client.</w:t>
+      </w:r>
+    </w:p>
+    <w:p>
+      <w:pPr>
+        <w:rPr>
+          <w:rFonts w:eastAsia="Verdana"/>
+          <w:sz w:val="18"/>
+          <w:szCs w:val="18"/>
+        </w:rPr>
+      </w:pPr>
+      <w:r>
+        <w:rPr>
+          <w:rFonts w:eastAsia="Verdana"/>
+          <w:sz w:val="18"/>
+          <w:szCs w:val="18"/>
+        </w:rPr>
+        <w:t>Le client s’engage :</w:t>
+      </w:r>
+    </w:p>
+    <w:p>
+      <w:pPr>
+        <w:rPr>
+          <w:rFonts w:eastAsia="Verdana"/>
+          <w:sz w:val="18"/>
+          <w:szCs w:val="18"/>
+        </w:rPr>
+      </w:pPr>
+      <w:r>
+        <w:rPr>
+          <w:rFonts w:eastAsia="Verdana"/>
+          <w:sz w:val="18"/>
+          <w:szCs w:val="18"/>
+        </w:rPr>
+        <w:t>À fournir à l’expert-comptable, préalablement au commencement de la mission, les informations et documents d’identification requis en application des dispositions visées aux articles L 561-1 et suivants du Code monétaire et financier. Le contrat est conclu sous condition résolutoire de l’obtention de ces informations et documents. La mission ne pourra donc pas être mise en œuvre avant leur obtention. Il s’agit :</w:t>
+      </w:r>
+    </w:p>
+    <w:p>
+      <w:pPr>
+        <w:rPr>
+          <w:rFonts w:eastAsia="Verdana"/>
+          <w:sz w:val="18"/>
+          <w:szCs w:val="18"/>
+        </w:rPr>
+      </w:pPr>
+      <w:r>
+        <w:rPr>
+          <w:rFonts w:eastAsia="Verdana"/>
+          <w:sz w:val="18"/>
+          <w:szCs w:val="18"/>
+        </w:rPr>
+        <w:t>Dans le cadre de l’obligation d’identification du client :</w:t>
+      </w:r>
+    </w:p>
+    <w:p>
+      <w:pPr>
+        <w:rPr>
+          <w:rFonts w:eastAsia="Verdana"/>
+          <w:sz w:val="18"/>
+          <w:szCs w:val="18"/>
+        </w:rPr>
+      </w:pPr>
+      <w:r>
+        <w:rPr>
+          <w:rFonts w:eastAsia="Verdana"/>
+          <w:sz w:val="18"/>
+          <w:szCs w:val="18"/>
+        </w:rPr>
+        <w:t xml:space="preserve">- si le client est une personne physique, obtention d’un document d’identité officiel en cours de validité comportant sa photographie ; </w:t>
+      </w:r>
+    </w:p>
+    <w:p>
+      <w:pPr>
+        <w:rPr>
+          <w:rFonts w:eastAsia="Verdana"/>
+          <w:sz w:val="18"/>
+          <w:szCs w:val="18"/>
+        </w:rPr>
+      </w:pPr>
+      <w:r>
+        <w:rPr>
+          <w:rFonts w:eastAsia="Verdana"/>
+          <w:sz w:val="18"/>
+          <w:szCs w:val="18"/>
+        </w:rPr>
+        <w:t xml:space="preserve">- si le client est une personne morale, tout acte ou extrait de registre officiel datant de moins de trois mois constatant la dénomination, la forme juridique, l’adresse du siège social, l’identité des associés et dirigeants et la composition et la répartition du capital. </w:t>
+      </w:r>
+    </w:p>
+    <w:p>
+      <w:pPr>
+        <w:rPr>
+          <w:rFonts w:eastAsia="Verdana"/>
+          <w:sz w:val="18"/>
+          <w:szCs w:val="18"/>
+        </w:rPr>
+      </w:pPr>
+      <w:r>
+        <w:rPr>
+          <w:rFonts w:eastAsia="Verdana"/>
+          <w:sz w:val="18"/>
+          <w:szCs w:val="18"/>
+        </w:rPr>
+        <w:t>Dans le cadre de l’obligation d’identification du bénéficiaire effectif, s’il apparait qu’une personne physique remplit les conditions pour être qualifiée de bénéficiaire effectif :</w:t>
+      </w:r>
+    </w:p>
+    <w:p>
+      <w:pPr>
+        <w:rPr>
+          <w:rFonts w:eastAsia="Verdana"/>
+          <w:sz w:val="18"/>
+          <w:szCs w:val="18"/>
+        </w:rPr>
+      </w:pPr>
+      <w:r>
+        <w:rPr>
+          <w:rFonts w:eastAsia="Verdana"/>
+          <w:sz w:val="18"/>
+          <w:szCs w:val="18"/>
+        </w:rPr>
+        <w:t>- les éléments d’identification de cette personne.</w:t>
+      </w:r>
+    </w:p>
+    <w:p>
+      <w:pPr>
+        <w:rPr>
+          <w:rFonts w:eastAsia="Verdana"/>
+          <w:sz w:val="18"/>
+          <w:szCs w:val="18"/>
+        </w:rPr>
+      </w:pPr>
+      <w:r>
+        <w:rPr>
+          <w:rFonts w:eastAsia="Verdana"/>
+          <w:sz w:val="18"/>
+          <w:szCs w:val="18"/>
+        </w:rPr>
+        <w:t>À mettre à la disposition de l’expert-comptable, dans les délais convenus, l’ensemble des documents et informations nécessaires à l’exécution de la mission ;</w:t>
+      </w:r>
+    </w:p>
+    <w:p>
+      <w:pPr>
+        <w:rPr>
+          <w:rFonts w:eastAsia="Verdana"/>
+          <w:sz w:val="18"/>
+          <w:szCs w:val="18"/>
+        </w:rPr>
+      </w:pPr>
+      <w:r>
+        <w:rPr>
+          <w:rFonts w:eastAsia="Verdana"/>
+          <w:sz w:val="18"/>
+          <w:szCs w:val="18"/>
+        </w:rPr>
+        <w:t>A réaliser les travaux lui incombant conformément aux dispositions prévues dans le tableau de répartition des obligations respectives ;</w:t>
+      </w:r>
+    </w:p>
+    <w:p>
+      <w:pPr>
+        <w:rPr>
+          <w:rFonts w:eastAsia="Verdana"/>
+          <w:sz w:val="18"/>
+          <w:szCs w:val="18"/>
+        </w:rPr>
+      </w:pPr>
+      <w:r>
+        <w:rPr>
+          <w:rFonts w:eastAsia="Verdana"/>
+          <w:sz w:val="18"/>
+          <w:szCs w:val="18"/>
+        </w:rPr>
+        <w:t>À respecter les procédures mises en place pour la réalisation de la mission et notamment le planning d’intervention de l’expert-comptable figurant dans la lettre de mission ;</w:t>
+      </w:r>
+    </w:p>
+    <w:p>
+      <w:pPr>
+        <w:rPr>
+          <w:rFonts w:eastAsia="Verdana"/>
+          <w:sz w:val="18"/>
+          <w:szCs w:val="18"/>
+        </w:rPr>
+      </w:pPr>
+      <w:r>
+        <w:rPr>
+          <w:rFonts w:eastAsia="Verdana"/>
+          <w:sz w:val="18"/>
+          <w:szCs w:val="18"/>
+        </w:rPr>
+        <w:t>À porter à la connaissance de l’expert-comptable les faits nouveaux ou exceptionnels et à lui signaler également les engagements susceptibles d’affecter les résultats ou la situation patrimoniale de l’entité ;</w:t>
+      </w:r>
+    </w:p>
+    <w:p>
+      <w:pPr>
+        <w:rPr>
+          <w:rFonts w:eastAsia="Verdana"/>
+          <w:sz w:val="18"/>
+          <w:szCs w:val="18"/>
+        </w:rPr>
+      </w:pPr>
+      <w:r>
+        <w:rPr>
+          <w:rFonts w:eastAsia="Verdana"/>
+          <w:sz w:val="18"/>
+          <w:szCs w:val="18"/>
+        </w:rPr>
+        <w:t>À confirmer par écrit, si l’expert-comptable le lui demande, que les documents, renseignements et explications fournis sont exhaustifs et reflètent fidèlement la situation patrimoniale de l’entité ;</w:t>
+      </w:r>
+    </w:p>
+    <w:p>
+      <w:pPr>
+        <w:rPr>
+          <w:rFonts w:eastAsia="Verdana"/>
+          <w:sz w:val="18"/>
+          <w:szCs w:val="18"/>
+        </w:rPr>
+      </w:pPr>
+      <w:r>
+        <w:rPr>
+          <w:rFonts w:eastAsia="Verdana"/>
+          <w:sz w:val="18"/>
+          <w:szCs w:val="18"/>
+        </w:rPr>
+        <w:t>À vérifier que les états et documents produits par l’expert-</w:t>
+      </w:r>
+      <w:r>
+        <w:rPr>
+          <w:rFonts w:eastAsia="Verdana"/>
+          <w:sz w:val="18"/>
+          <w:szCs w:val="18"/>
+        </w:rPr>
+        <w:lastRenderedPageBreak/>
+        <w:t>comptable sont conformes aux demandes exprimées et aux informations fournies par lui-même et à informer sans retard le professionnel de tout manquement ou erreur.</w:t>
+      </w:r>
+    </w:p>
+    <w:p>
+      <w:pPr>
+        <w:rPr>
+          <w:rFonts w:eastAsia="Verdana"/>
+          <w:sz w:val="18"/>
+          <w:szCs w:val="18"/>
+        </w:rPr>
+      </w:pPr>
+      <w:r>
+        <w:rPr>
+          <w:rFonts w:eastAsia="Verdana"/>
+          <w:sz w:val="18"/>
+          <w:szCs w:val="18"/>
+        </w:rPr>
+        <w:t>Le client reste responsable de la bonne application de la législation et des règlements en vigueur ; l’expert-comptable ne peut être considéré comme se substituant aux obligations du client du fait de cette mission.</w:t>
+      </w:r>
+    </w:p>
+    <w:p>
+      <w:pPr>
+        <w:rPr>
+          <w:rFonts w:eastAsia="Verdana"/>
+          <w:sz w:val="18"/>
+          <w:szCs w:val="18"/>
+        </w:rPr>
+      </w:pPr>
+      <w:r>
+        <w:rPr>
+          <w:rFonts w:eastAsia="Verdana"/>
+          <w:sz w:val="18"/>
+          <w:szCs w:val="18"/>
+        </w:rPr>
+        <w:t>Conformément aux prescriptions légales, le client doit prendre toutes les mesures nécessaires pour conserver les pièces justificatives et, d’une façon générale, l’ensemble des documents produits par l’expert-comptable pendant les délais de conservation requis par la loi ou le règlement.</w:t>
+      </w:r>
+    </w:p>
+    <w:p>
+      <w:pPr>
+        <w:rPr>
+          <w:rFonts w:eastAsia="Verdana"/>
+          <w:sz w:val="18"/>
+          <w:szCs w:val="18"/>
+        </w:rPr>
+      </w:pPr>
+      <w:r>
+        <w:rPr>
+          <w:rFonts w:eastAsia="Verdana"/>
+          <w:sz w:val="18"/>
+          <w:szCs w:val="18"/>
+        </w:rPr>
+        <w:t>Dès lors que des traitements sont assurés sur le système informatique du client, ce dernier devra assurer la sauvegarde et l’archivage des données et des traitements informatisés pour en garantir la conservation, l’inviolabilité et la lecture ultérieure.</w:t>
+      </w:r>
+    </w:p>
+    <w:p>
+      <w:pPr>
+        <w:rPr>
+          <w:rFonts w:eastAsia="Verdana"/>
+          <w:sz w:val="18"/>
+          <w:szCs w:val="18"/>
+        </w:rPr>
+      </w:pPr>
+      <w:r>
+        <w:rPr>
+          <w:rFonts w:eastAsia="Verdana"/>
+          <w:sz w:val="18"/>
+          <w:szCs w:val="18"/>
+        </w:rPr>
+        <w:t>D’une façon générale, le client doit par ailleurs prendre toutes les mesures nécessaires pour assurer la protection de son système informatique.</w:t>
+      </w:r>
+    </w:p>
+    <w:p>
+      <w:pPr>
+        <w:rPr>
+          <w:rFonts w:eastAsia="Verdana"/>
+          <w:sz w:val="18"/>
+          <w:szCs w:val="18"/>
+        </w:rPr>
+      </w:pPr>
+    </w:p>
+    <w:p>
+      <w:pPr>
+        <w:pStyle w:val="Titre3"/>
+        <w:rPr>
+          <w:sz w:val="18"/>
+          <w:szCs w:val="18"/>
+        </w:rPr>
+      </w:pPr>
+      <w:r>
+        <w:rPr>
+          <w:sz w:val="18"/>
+          <w:szCs w:val="18"/>
+        </w:rPr>
+        <w:t>6</w:t>
+      </w:r>
+      <w:r>
+        <w:rPr>
+          <w:sz w:val="18"/>
+          <w:szCs w:val="18"/>
+        </w:rPr>
+        <w:t>- HONORAIRES</w:t>
+      </w:r>
+    </w:p>
+    <w:p>
+      <w:pPr>
+        <w:rPr>
+          <w:rFonts w:eastAsia="Verdana"/>
+          <w:sz w:val="18"/>
+          <w:szCs w:val="18"/>
+        </w:rPr>
+      </w:pPr>
+      <w:r>
+        <w:rPr>
+          <w:rFonts w:eastAsia="Verdana"/>
+          <w:sz w:val="18"/>
+          <w:szCs w:val="18"/>
+        </w:rPr>
+        <w:t>L’expert-comptable reçoit du client des honoraires librement convenus qui sont exclusifs de toute autre rémunération, même indirecte. Il est remboursé de ses frais de déplacement et débours.</w:t>
+      </w:r>
+    </w:p>
+    <w:p>
+      <w:pPr>
+        <w:rPr>
+          <w:rFonts w:eastAsia="Verdana"/>
+          <w:sz w:val="18"/>
+          <w:szCs w:val="18"/>
+        </w:rPr>
+      </w:pPr>
+      <w:r>
+        <w:rPr>
+          <w:rFonts w:eastAsia="Verdana"/>
+          <w:sz w:val="18"/>
+          <w:szCs w:val="18"/>
+        </w:rPr>
+        <w:t>Des acomptes sur honoraires peuvent être demandés périodiquement.</w:t>
+      </w:r>
+    </w:p>
+    <w:p>
+      <w:pPr>
+        <w:rPr>
+          <w:rFonts w:eastAsia="Verdana"/>
+          <w:sz w:val="18"/>
+          <w:szCs w:val="18"/>
+        </w:rPr>
+      </w:pPr>
+      <w:r>
+        <w:rPr>
+          <w:rFonts w:eastAsia="Verdana"/>
+          <w:sz w:val="18"/>
+          <w:szCs w:val="18"/>
+        </w:rPr>
+        <w:t>Les conditions de règlement des honoraires sont les suivantes :</w:t>
+      </w:r>
+    </w:p>
+    <w:p>
+      <w:pPr>
+        <w:rPr>
+          <w:rFonts w:eastAsia="Verdana"/>
+          <w:sz w:val="18"/>
+          <w:szCs w:val="18"/>
+        </w:rPr>
+      </w:pPr>
+      <w:r>
+        <w:rPr>
+          <w:rFonts w:eastAsia="Verdana"/>
+          <w:sz w:val="18"/>
+          <w:szCs w:val="18"/>
+        </w:rPr>
+        <w:t>Les honoraires sont payés à leur date d’échéance ; en cas de paiement anticipé, aucun escompte n’est accordé ; en cas de retard de paiement, des pénalités de retard sont exigibles le jour suivant la date de règlement figurant sur la facture ; sauf disposition contraire qui ne peut toutefois fixer un taux d’intérêt de ces pénalités inférieur à trois fois le taux d’intérêt légal, le taux d’intérêt sera égal à celui appliqué par la Banque Centrale Européenne à son opération de refinancement la plus récente majoré de 10 points de pourcentage. Les pénalités de retard sont exigibles sans qu’un rappel soit nécessaire.</w:t>
+      </w:r>
+      <w:r>
+        <w:rPr>
+          <w:rFonts w:eastAsia="Verdana"/>
+          <w:sz w:val="18"/>
+          <w:szCs w:val="18"/>
+          <w:vertAlign w:val="superscript"/>
+        </w:rPr>
+        <w:footnoteReference w:id="3"/>
+      </w:r>
+    </w:p>
+    <w:p>
+      <w:pPr>
+        <w:rPr>
+          <w:rFonts w:eastAsia="Verdana"/>
+          <w:sz w:val="18"/>
+          <w:szCs w:val="18"/>
+        </w:rPr>
+      </w:pPr>
+      <w:r>
+        <w:rPr>
+          <w:rFonts w:eastAsia="Verdana"/>
+          <w:sz w:val="18"/>
+          <w:szCs w:val="18"/>
+        </w:rPr>
+        <w:t>Une indemnité forfaitaire pour frais de recouvrement d’un montant de 40 euros est également exigible de plein droit en cas de retard de paiement</w:t>
+      </w:r>
+      <w:r>
+        <w:rPr>
+          <w:rFonts w:eastAsia="Verdana"/>
+          <w:sz w:val="18"/>
+          <w:szCs w:val="18"/>
+          <w:vertAlign w:val="superscript"/>
+        </w:rPr>
+        <w:footnoteReference w:id="4"/>
+      </w:r>
+      <w:r>
+        <w:rPr>
+          <w:rFonts w:eastAsia="Verdana"/>
+          <w:sz w:val="18"/>
+          <w:szCs w:val="18"/>
+        </w:rPr>
+        <w:t>. Lorsque les frais de recouvrement exposés sont supérieurs au montant de cette indemnité forfaitaire, une indemnisation complémentaire peut être réclamée sur justificatifs.</w:t>
+      </w:r>
+    </w:p>
+    <w:p>
+      <w:pPr>
+        <w:rPr>
+          <w:rFonts w:eastAsia="Verdana"/>
+          <w:sz w:val="18"/>
+          <w:szCs w:val="18"/>
+        </w:rPr>
+      </w:pPr>
+      <w:r>
+        <w:rPr>
+          <w:rFonts w:eastAsia="Verdana"/>
+          <w:sz w:val="18"/>
+          <w:szCs w:val="18"/>
+        </w:rPr>
+        <w:t>Toute contestation d’une facture devra être faite dès réception, préciser la prestation contestée, et être motivée ; ladite contestation ne pourra justifier le non-paiement des autres prestations non contestées, y compris celles réalisées concomitamment, simultanément, ou lorsque les conditions de recours à la facture périodique sont remplies, incluses dans la même facture.</w:t>
+      </w:r>
+    </w:p>
+    <w:p>
+      <w:pPr>
+        <w:rPr>
+          <w:rFonts w:eastAsia="Verdana"/>
+          <w:sz w:val="18"/>
+          <w:szCs w:val="18"/>
+        </w:rPr>
+      </w:pPr>
+      <w:r>
+        <w:rPr>
+          <w:rFonts w:eastAsia="Verdana"/>
+          <w:sz w:val="18"/>
+          <w:szCs w:val="18"/>
+        </w:rPr>
+        <w:t>Le non-paiement des honoraires pourra, après rappel par lettre recommandée avec accusé de réception, entraîner la suspension des travaux ou mettre fin à la mission.</w:t>
+      </w:r>
+    </w:p>
+    <w:p>
+      <w:pPr>
+        <w:rPr>
+          <w:rFonts w:eastAsia="Verdana"/>
+          <w:sz w:val="18"/>
+          <w:szCs w:val="18"/>
+        </w:rPr>
+      </w:pPr>
+      <w:r>
+        <w:rPr>
+          <w:rFonts w:eastAsia="Verdana"/>
+          <w:sz w:val="18"/>
+          <w:szCs w:val="18"/>
+        </w:rPr>
+        <w:t>En cas de changement de modalités de facturation, une information préalable sera donnée au client.</w:t>
+      </w:r>
+    </w:p>
+    <w:p>
+      <w:pPr>
+        <w:rPr>
+          <w:rFonts w:eastAsia="Verdana"/>
+          <w:sz w:val="18"/>
+          <w:szCs w:val="18"/>
+        </w:rPr>
+      </w:pPr>
+      <w:r>
+        <w:rPr>
+          <w:rFonts w:eastAsia="Verdana"/>
+          <w:sz w:val="18"/>
+          <w:szCs w:val="18"/>
+        </w:rPr>
+        <w:t xml:space="preserve">En cas de rupture du contrat par l’une ou l’autre des </w:t>
+      </w:r>
+      <w:r>
+        <w:rPr>
+          <w:rFonts w:eastAsia="Verdana"/>
+          <w:sz w:val="18"/>
+          <w:szCs w:val="18"/>
+        </w:rPr>
+        <w:t>parties, une assistance pour réaliser le transfert du dossier dans l’entreprise ou à un nouveau prestataire pourra être effectuée à la demande du client.</w:t>
+      </w:r>
+    </w:p>
+    <w:p>
+      <w:pPr>
+        <w:rPr>
+          <w:rFonts w:eastAsia="Verdana"/>
+          <w:sz w:val="18"/>
+          <w:szCs w:val="18"/>
+        </w:rPr>
+      </w:pPr>
+      <w:r>
+        <w:rPr>
+          <w:rFonts w:eastAsia="Verdana"/>
+          <w:sz w:val="18"/>
+          <w:szCs w:val="18"/>
+        </w:rPr>
+        <w:t xml:space="preserve">En cas d’usage du droit de rétention prévu à l’article 168 du Code de déontologie intégré au décret du 30 mars 2012 relatif à l’exercice de l’activité d’expertise comptable, le président du Conseil Régional de l’Ordre des experts-comptables sera informé. </w:t>
+      </w:r>
+    </w:p>
+    <w:p>
+      <w:pPr>
+        <w:rPr>
+          <w:rFonts w:eastAsia="Verdana"/>
+          <w:sz w:val="18"/>
+          <w:szCs w:val="18"/>
+        </w:rPr>
+      </w:pPr>
+    </w:p>
+    <w:p>
+      <w:pPr>
+        <w:pStyle w:val="Titre3"/>
+        <w:rPr>
+          <w:sz w:val="18"/>
+          <w:szCs w:val="18"/>
+        </w:rPr>
+      </w:pPr>
+      <w:r>
+        <w:rPr>
+          <w:sz w:val="18"/>
+          <w:szCs w:val="18"/>
+        </w:rPr>
+        <w:t>7</w:t>
+      </w:r>
+      <w:r>
+        <w:rPr>
+          <w:sz w:val="18"/>
+          <w:szCs w:val="18"/>
+        </w:rPr>
+        <w:t>- PROTECTION DES DONNEES PERSONNELLES (RGPD)</w:t>
+      </w:r>
+    </w:p>
+    <w:p>
+      <w:pPr>
+        <w:rPr>
+          <w:rFonts w:eastAsia="Verdana"/>
+          <w:sz w:val="18"/>
+          <w:szCs w:val="18"/>
+        </w:rPr>
+      </w:pPr>
+      <w:r>
+        <w:rPr>
+          <w:rFonts w:eastAsia="Verdana"/>
+          <w:sz w:val="18"/>
+          <w:szCs w:val="18"/>
+        </w:rPr>
+        <w:t xml:space="preserve">Le cabinet </w:t>
+      </w:r>
+      <w:r>
+        <w:rPr>
+          <w:rFonts w:eastAsia="Verdana"/>
+          <w:sz w:val="18"/>
+          <w:szCs w:val="18"/>
+        </w:rPr>
+        <w:t xml:space="preserve">MOON EXPERTISE </w:t>
+      </w:r>
+      <w:r>
+        <w:rPr>
+          <w:rFonts w:eastAsia="Verdana"/>
+          <w:sz w:val="18"/>
+          <w:szCs w:val="18"/>
+        </w:rPr>
+        <w:t xml:space="preserve">est qualifié de responsable conjoint de traitement. Le Client et le cabinet s’engagent à collecter et à traiter toute donnée personnelle en conformité avec toute réglementation en vigueur applicable au traitement de ces données, et notamment la loi n°78-17 du 6 janvier 1978 modifiée et le règlement européen sur la protection des données personnelles. </w:t>
+      </w:r>
+    </w:p>
+    <w:p>
+      <w:pPr>
+        <w:rPr>
+          <w:rFonts w:eastAsia="Verdana"/>
+          <w:sz w:val="18"/>
+          <w:szCs w:val="18"/>
+        </w:rPr>
+      </w:pPr>
+      <w:r>
+        <w:rPr>
+          <w:rFonts w:eastAsia="Verdana"/>
+          <w:sz w:val="18"/>
+          <w:szCs w:val="18"/>
+        </w:rPr>
+        <w:t xml:space="preserve">Le cabinet est autorisé à traiter pour le compte de son client les données personnelles nécessaires pour l’ensemble des missions dont il a la charge. </w:t>
+      </w:r>
+    </w:p>
+    <w:p>
+      <w:pPr>
+        <w:rPr>
+          <w:rFonts w:eastAsia="Verdana"/>
+          <w:sz w:val="18"/>
+          <w:szCs w:val="18"/>
+        </w:rPr>
+      </w:pPr>
+      <w:r>
+        <w:rPr>
+          <w:rFonts w:eastAsia="Verdana"/>
+          <w:sz w:val="18"/>
+          <w:szCs w:val="18"/>
+        </w:rPr>
+        <w:t xml:space="preserve">La nature des opérations réalisées sur les données est directement rattachée à ces missions. </w:t>
+      </w:r>
+    </w:p>
+    <w:p>
+      <w:pPr>
+        <w:rPr>
+          <w:rFonts w:eastAsia="Verdana"/>
+          <w:sz w:val="18"/>
+          <w:szCs w:val="18"/>
+        </w:rPr>
+      </w:pPr>
+      <w:r>
+        <w:rPr>
+          <w:rFonts w:eastAsia="Verdana"/>
+          <w:sz w:val="18"/>
+          <w:szCs w:val="18"/>
+        </w:rPr>
+        <w:t>Le client et le cabinet s’engagent à prendre toutes précautions utiles afin de préserver la sécurité des informations et notamment de les protéger contre toute destruction accidentelle ou illicite, perte accidentelle, altération, diffusion ou accès non autorisés.</w:t>
+      </w:r>
+    </w:p>
+    <w:p>
+      <w:pPr>
+        <w:rPr>
+          <w:rFonts w:eastAsia="Verdana"/>
+          <w:sz w:val="18"/>
+          <w:szCs w:val="18"/>
+        </w:rPr>
+      </w:pPr>
+      <w:r>
+        <w:rPr>
+          <w:rFonts w:eastAsia="Verdana"/>
+          <w:sz w:val="18"/>
+          <w:szCs w:val="18"/>
+        </w:rPr>
+        <w:t>Le cabinet s’engage à communiquer au Client la survenance de toute faille de sécurité ayant des conséquences directes ou indirectes sur le traitement, ainsi que toute plainte qui lui serait adressée par tout individu concerné par le traitement réalisé au titre du Contrat. Cette communication devra être effectuée dans les plus brefs délais et au maximum quarante-huit heures après la découverte de la faille de sécurité ou suivant réception d’une plainte. Le client se chargera de la notification éventuelle à l’autorité de contrôle et à la personne concernée.</w:t>
+      </w:r>
+    </w:p>
+    <w:p>
+      <w:pPr>
+        <w:rPr>
+          <w:rFonts w:eastAsia="Verdana"/>
+          <w:sz w:val="18"/>
+          <w:szCs w:val="18"/>
+        </w:rPr>
+      </w:pPr>
+      <w:r>
+        <w:rPr>
+          <w:rFonts w:eastAsia="Verdana"/>
+          <w:sz w:val="18"/>
+          <w:szCs w:val="18"/>
+        </w:rPr>
+        <w:t xml:space="preserve">Il appartient au client de fournir l’information aux personnes concernées par les opérations de traitement au moment de la collecte des données. </w:t>
+      </w:r>
+    </w:p>
+    <w:p>
+      <w:pPr>
+        <w:rPr>
+          <w:rFonts w:eastAsia="Verdana"/>
+          <w:sz w:val="18"/>
+          <w:szCs w:val="18"/>
+        </w:rPr>
+      </w:pPr>
+      <w:r>
+        <w:rPr>
+          <w:rFonts w:eastAsia="Verdana"/>
+          <w:sz w:val="18"/>
+          <w:szCs w:val="18"/>
+        </w:rPr>
+        <w:t>Le client devra également répondre aux demandes d’exercice des droits exercés par la personne concernée.</w:t>
+      </w:r>
+    </w:p>
+    <w:p>
+      <w:pPr>
+        <w:rPr>
+          <w:rFonts w:eastAsia="Verdana"/>
+          <w:sz w:val="18"/>
+          <w:szCs w:val="18"/>
+        </w:rPr>
+      </w:pPr>
+      <w:r>
+        <w:rPr>
+          <w:rFonts w:eastAsia="Verdana"/>
+          <w:sz w:val="18"/>
+          <w:szCs w:val="18"/>
+        </w:rPr>
+        <w:t>Les données qui sont susceptibles d'être conservées répondent aux obligations légales qui s’appliquent à l’expert-comptable.</w:t>
+      </w:r>
+    </w:p>
+    <w:p>
+      <w:pPr>
+        <w:rPr>
+          <w:rFonts w:eastAsia="Verdana"/>
+          <w:sz w:val="18"/>
+          <w:szCs w:val="18"/>
+        </w:rPr>
+      </w:pPr>
+      <w:r>
+        <w:rPr>
+          <w:rFonts w:eastAsia="Verdana"/>
+          <w:sz w:val="18"/>
+          <w:szCs w:val="18"/>
+        </w:rPr>
+        <w:t xml:space="preserve">Le cabinet collecte également des données d’identification dans le cadre des différentes missions confiées pour respecter ses obligations en matière de lutte contre le blanchiment des capitaux et financement du terrorisme. Dans le cadre de ce traitement, le cabinet a la qualité de responsable de traitement et conserve pendant cinq ans, à compter de la fin de la relation d’affaires, les documents et informations relatifs à l'identité des clients, des personnes agissant pour son compte et des bénéficiaires effectifs (article L 561-12 du Code monétaire et financier). Le cabinet conserve pendant cinq ans à compter de leur exécution, des documents et informations relatifs aux opérations faites ainsi que des documents consignant les caractéristiques des opérations mentionnées à l'article L. 561-10-2 du CMF. Ces données </w:t>
+      </w:r>
+      <w:r>
+        <w:rPr>
+          <w:rFonts w:eastAsia="Verdana"/>
+          <w:sz w:val="18"/>
+          <w:szCs w:val="18"/>
+        </w:rPr>
+        <w:lastRenderedPageBreak/>
+        <w:t>peuvent être communiquées aux autorités légales compétentes.</w:t>
+      </w:r>
+    </w:p>
+    <w:p>
+      <w:pPr>
+        <w:rPr>
+          <w:rFonts w:eastAsia="Verdana"/>
+          <w:sz w:val="18"/>
+          <w:szCs w:val="18"/>
+        </w:rPr>
+      </w:pPr>
+    </w:p>
+    <w:p>
+      <w:pPr>
+        <w:pStyle w:val="Titre3"/>
+        <w:rPr>
+          <w:sz w:val="18"/>
+          <w:szCs w:val="18"/>
+        </w:rPr>
+      </w:pPr>
+      <w:r>
+        <w:rPr>
+          <w:sz w:val="18"/>
+          <w:szCs w:val="18"/>
+        </w:rPr>
+        <w:t>8</w:t>
+      </w:r>
+      <w:r>
+        <w:rPr>
+          <w:sz w:val="18"/>
+          <w:szCs w:val="18"/>
+        </w:rPr>
+        <w:t>- RESPONSABILITE CIVILE PROFESSIONNELLE DE L’EXPERT-COMPTABLE</w:t>
+      </w:r>
+    </w:p>
+    <w:p>
+      <w:pPr>
+        <w:rPr>
+          <w:rFonts w:eastAsia="Verdana"/>
+          <w:sz w:val="18"/>
+          <w:szCs w:val="18"/>
+        </w:rPr>
+      </w:pPr>
+      <w:r>
+        <w:rPr>
+          <w:rFonts w:eastAsia="Verdana"/>
+          <w:sz w:val="18"/>
+          <w:szCs w:val="18"/>
+        </w:rPr>
+        <w:t xml:space="preserve">La responsabilité civile professionnelle de l’expert-comptable ne peut être mise en jeu que sur une période contractuellement définie à 3 ans à compter du jour où le client a connu ou aurait dû connaître les faits lui permettant de la mettre en cause. </w:t>
+      </w:r>
+    </w:p>
+    <w:p>
+      <w:pPr>
+        <w:rPr>
+          <w:rFonts w:eastAsia="Verdana"/>
+          <w:sz w:val="18"/>
+          <w:szCs w:val="18"/>
+        </w:rPr>
+      </w:pPr>
+      <w:r>
+        <w:rPr>
+          <w:rFonts w:eastAsia="Verdana"/>
+          <w:sz w:val="18"/>
+          <w:szCs w:val="18"/>
+        </w:rPr>
+        <w:t>Tout événement susceptible d’avoir des conséquences notamment en matière de responsabilité doit être porté sans délai par le client à la connaissance de l’expert-comptable.</w:t>
+      </w:r>
+    </w:p>
+    <w:p>
+      <w:pPr>
+        <w:rPr>
+          <w:rFonts w:eastAsia="Verdana"/>
+          <w:sz w:val="18"/>
+          <w:szCs w:val="18"/>
+        </w:rPr>
+      </w:pPr>
+      <w:r>
+        <w:rPr>
+          <w:rFonts w:eastAsia="Verdana"/>
+          <w:sz w:val="18"/>
+          <w:szCs w:val="18"/>
+        </w:rPr>
+        <w:t>La responsabilité contractuelle de l’expert-comptable à l’égard du client, pour toutes les conséquences dommageables d’une même mission, est limitée à un plafond de 5.000 euros.</w:t>
+      </w:r>
+    </w:p>
+    <w:p>
+      <w:pPr>
+        <w:rPr>
+          <w:rFonts w:eastAsia="Verdana"/>
+          <w:sz w:val="18"/>
+          <w:szCs w:val="18"/>
+        </w:rPr>
+      </w:pPr>
+      <w:r>
+        <w:rPr>
+          <w:rFonts w:eastAsia="Verdana"/>
+          <w:sz w:val="18"/>
+          <w:szCs w:val="18"/>
+        </w:rPr>
+        <w:t xml:space="preserve">La responsabilité civile professionnelle de l’expert-comptable est couverte par un contrat d’assurance souscrit auprès de la compagnie </w:t>
+      </w:r>
+      <w:r>
+        <w:rPr>
+          <w:rFonts w:eastAsia="Verdana"/>
+          <w:sz w:val="18"/>
+          <w:szCs w:val="18"/>
+        </w:rPr>
+        <w:t>MMA IARD ASSURANCES MUTUELLES, 160 rue Henri Champion 72030 le Mans cedex 9.</w:t>
+      </w:r>
+    </w:p>
+    <w:p>
+      <w:pPr>
+        <w:rPr>
+          <w:rFonts w:eastAsia="Verdana"/>
+          <w:sz w:val="18"/>
+          <w:szCs w:val="18"/>
+        </w:rPr>
+      </w:pPr>
+      <w:r>
+        <w:rPr>
+          <w:rFonts w:eastAsia="Verdana"/>
+          <w:sz w:val="18"/>
+          <w:szCs w:val="18"/>
+        </w:rPr>
+        <w:t>La responsabilité de l’expert-comptable ne peut notamment être engagée dans l’hypothèse où le préjudice subi par le client est une conséquence :</w:t>
+      </w:r>
+    </w:p>
+    <w:p>
+      <w:pPr>
+        <w:rPr>
+          <w:rFonts w:eastAsia="Verdana"/>
+          <w:sz w:val="18"/>
+          <w:szCs w:val="18"/>
+        </w:rPr>
+      </w:pPr>
+      <w:r>
+        <w:rPr>
+          <w:rFonts w:eastAsia="Verdana"/>
+          <w:sz w:val="18"/>
+          <w:szCs w:val="18"/>
+        </w:rPr>
+        <w:t>- d’une information erronée ou d’une faute ou négligence commise par le client ou par ses salariés,</w:t>
+      </w:r>
+    </w:p>
+    <w:p>
+      <w:pPr>
+        <w:rPr>
+          <w:rFonts w:eastAsia="Verdana"/>
+          <w:sz w:val="18"/>
+          <w:szCs w:val="18"/>
+        </w:rPr>
+      </w:pPr>
+      <w:r>
+        <w:rPr>
+          <w:rFonts w:eastAsia="Verdana"/>
+          <w:sz w:val="18"/>
+          <w:szCs w:val="18"/>
+        </w:rPr>
+        <w:t>- du retard ou de la carence du client à fournir une information nécessaire à l’expert-comptable,</w:t>
+      </w:r>
+    </w:p>
+    <w:p>
+      <w:pPr>
+        <w:rPr>
+          <w:rFonts w:eastAsia="Verdana"/>
+          <w:sz w:val="18"/>
+          <w:szCs w:val="18"/>
+        </w:rPr>
+      </w:pPr>
+      <w:r>
+        <w:rPr>
+          <w:rFonts w:eastAsia="Verdana"/>
+          <w:sz w:val="18"/>
+          <w:szCs w:val="18"/>
+        </w:rPr>
+        <w:t>- des fautes commises par des tiers intervenant chez le client.</w:t>
+      </w:r>
+    </w:p>
+    <w:p>
+      <w:pPr>
+        <w:rPr>
+          <w:rFonts w:eastAsia="Verdana"/>
+          <w:sz w:val="18"/>
+          <w:szCs w:val="18"/>
+        </w:rPr>
+      </w:pPr>
+    </w:p>
+    <w:p>
+      <w:pPr>
+        <w:pStyle w:val="Titre3"/>
+        <w:rPr>
+          <w:sz w:val="18"/>
+          <w:szCs w:val="18"/>
+        </w:rPr>
+      </w:pPr>
+      <w:r>
+        <w:rPr>
+          <w:sz w:val="18"/>
+          <w:szCs w:val="18"/>
+        </w:rPr>
+        <w:t>9</w:t>
+      </w:r>
+      <w:r>
+        <w:rPr>
+          <w:sz w:val="18"/>
+          <w:szCs w:val="18"/>
+        </w:rPr>
+        <w:t>- RESILIATION DE LA MISSION</w:t>
+      </w:r>
+    </w:p>
+    <w:p>
+      <w:pPr>
+        <w:rPr>
+          <w:rFonts w:eastAsia="Verdana"/>
+          <w:sz w:val="18"/>
+          <w:szCs w:val="18"/>
+        </w:rPr>
+      </w:pPr>
+      <w:r>
+        <w:rPr>
+          <w:rFonts w:eastAsia="Verdana"/>
+          <w:sz w:val="18"/>
+          <w:szCs w:val="18"/>
+        </w:rPr>
+        <w:t xml:space="preserve">En cas de résiliation par le client au cours d’un exercice comptable (ou pendant la mission en cas de mission ponctuelle), et sauf faute grave imputable à l’expert-comptable, le client devra verser à ce dernier les honoraires dus pour le travail déjà effectué, majorés d’une indemnité conventionnelle égale à 25% des honoraires annuels convenus pour l’exercice en cours ou de la dernière année d’honoraires en cas de montant incertain. </w:t>
+      </w:r>
+    </w:p>
+    <w:p>
+      <w:pPr>
+        <w:rPr>
+          <w:rFonts w:eastAsia="Verdana"/>
+          <w:sz w:val="18"/>
+          <w:szCs w:val="18"/>
+        </w:rPr>
+      </w:pPr>
+      <w:r>
+        <w:rPr>
+          <w:rFonts w:eastAsia="Verdana"/>
+          <w:sz w:val="18"/>
+          <w:szCs w:val="18"/>
+        </w:rPr>
+        <w:t>En cas de manquement du client à l’une de ses obligations, l’expert-comptable aura la faculté de mettre fin à sa mission après l’envoi d’une mise en demeure sous forme de lettre recommandée restée sans effet.</w:t>
+      </w:r>
+    </w:p>
+    <w:p>
+      <w:pPr>
+        <w:rPr>
+          <w:rFonts w:eastAsia="Verdana"/>
+          <w:sz w:val="18"/>
+          <w:szCs w:val="18"/>
+        </w:rPr>
+      </w:pPr>
+      <w:r>
+        <w:rPr>
+          <w:rFonts w:eastAsia="Verdana"/>
+          <w:sz w:val="18"/>
+          <w:szCs w:val="18"/>
+        </w:rPr>
+        <w:t xml:space="preserve">Dès la survenance d’un évènement susceptible de le placer dans une situation de conflit d’intérêts ou de porter atteinte à son indépendance, l’expert-comptable a l’obligation de dénoncer le contrat. </w:t>
+      </w:r>
+    </w:p>
+    <w:p>
+      <w:pPr>
+        <w:rPr>
+          <w:rFonts w:eastAsia="Verdana"/>
+          <w:sz w:val="18"/>
+          <w:szCs w:val="18"/>
+        </w:rPr>
+      </w:pPr>
+    </w:p>
+    <w:p>
+      <w:pPr>
+        <w:pStyle w:val="Titre3"/>
+        <w:rPr>
+          <w:sz w:val="18"/>
+          <w:szCs w:val="18"/>
+        </w:rPr>
+      </w:pPr>
+      <w:r>
+        <w:rPr>
+          <w:sz w:val="18"/>
+          <w:szCs w:val="18"/>
+        </w:rPr>
+        <w:t>10</w:t>
+      </w:r>
+      <w:r>
+        <w:rPr>
+          <w:sz w:val="18"/>
+          <w:szCs w:val="18"/>
+        </w:rPr>
+        <w:t>- SUSPENSION DE LA MISSION</w:t>
+      </w:r>
+    </w:p>
+    <w:p>
+      <w:pPr>
+        <w:rPr>
+          <w:rFonts w:eastAsia="Verdana"/>
+          <w:sz w:val="18"/>
+          <w:szCs w:val="18"/>
+        </w:rPr>
+      </w:pPr>
+      <w:r>
+        <w:rPr>
+          <w:rFonts w:eastAsia="Verdana"/>
+          <w:sz w:val="18"/>
+          <w:szCs w:val="18"/>
+        </w:rPr>
+        <w:t>Lorsque la mission est suspendue pour cause de force majeure</w:t>
+      </w:r>
+      <w:r>
+        <w:rPr>
+          <w:rFonts w:eastAsia="Verdana"/>
+          <w:sz w:val="18"/>
+          <w:szCs w:val="18"/>
+          <w:vertAlign w:val="superscript"/>
+        </w:rPr>
+        <w:footnoteReference w:id="5"/>
+      </w:r>
+      <w:r>
+        <w:rPr>
+          <w:rFonts w:eastAsia="Verdana"/>
+          <w:sz w:val="18"/>
+          <w:szCs w:val="18"/>
+        </w:rPr>
+        <w:t xml:space="preserve"> (empêchement temporaire), les délais de remise des travaux sont prolongés pour une durée égale à celle de la suspension susvisée, à moins que le retard en résultant ne justifie la résolution.</w:t>
+      </w:r>
+    </w:p>
+    <w:p>
+      <w:pPr>
+        <w:rPr>
+          <w:rFonts w:eastAsia="Verdana"/>
+          <w:sz w:val="18"/>
+          <w:szCs w:val="18"/>
+        </w:rPr>
+      </w:pPr>
+      <w:r>
+        <w:rPr>
+          <w:rFonts w:eastAsia="Verdana"/>
+          <w:sz w:val="18"/>
+          <w:szCs w:val="18"/>
+        </w:rPr>
+        <w:t>Pendant la période de suspension, toutes les dispositions du contrat demeurent applicables.</w:t>
+      </w:r>
+    </w:p>
+    <w:p>
+      <w:pPr>
+        <w:rPr>
+          <w:rFonts w:eastAsia="Verdana"/>
+          <w:sz w:val="18"/>
+          <w:szCs w:val="18"/>
+        </w:rPr>
+      </w:pPr>
+      <w:r>
+        <w:rPr>
+          <w:rFonts w:eastAsia="Verdana"/>
+          <w:sz w:val="18"/>
+          <w:szCs w:val="18"/>
+        </w:rPr>
+        <w:t>En cas de manquement du client à l’une de ses obligations (exemple : défaut de paiement des honoraires à l’échéance prévue), l’expert-comptable aura la faculté de suspendre sa mission après l’envoi d’une mise en demeure sous forme de lettre recommandée restée sans effet, et ne pourra être tenu responsable des conséquences préjudiciables pouvant découler de cette suspension.</w:t>
+      </w:r>
+    </w:p>
+    <w:p>
+      <w:pPr>
+        <w:rPr>
+          <w:rFonts w:eastAsia="Verdana"/>
+          <w:sz w:val="18"/>
+          <w:szCs w:val="18"/>
+        </w:rPr>
+      </w:pPr>
+    </w:p>
+    <w:p>
+      <w:pPr>
+        <w:pStyle w:val="Titre3"/>
+        <w:rPr>
+          <w:sz w:val="18"/>
+          <w:szCs w:val="18"/>
+        </w:rPr>
+      </w:pPr>
+      <w:r>
+        <w:rPr>
+          <w:sz w:val="18"/>
+          <w:szCs w:val="18"/>
+        </w:rPr>
+        <w:t>1</w:t>
+      </w:r>
+      <w:r>
+        <w:rPr>
+          <w:sz w:val="18"/>
+          <w:szCs w:val="18"/>
+        </w:rPr>
+        <w:t>1</w:t>
+      </w:r>
+      <w:r>
+        <w:rPr>
+          <w:sz w:val="18"/>
+          <w:szCs w:val="18"/>
+        </w:rPr>
+        <w:t>- DIFFERENDS</w:t>
+      </w:r>
+    </w:p>
+    <w:p>
+      <w:pPr>
+        <w:rPr>
+          <w:rFonts w:eastAsia="Verdana"/>
+          <w:sz w:val="18"/>
+          <w:szCs w:val="18"/>
+        </w:rPr>
+      </w:pPr>
+      <w:r>
+        <w:rPr>
+          <w:rFonts w:eastAsia="Verdana"/>
+          <w:sz w:val="18"/>
+          <w:szCs w:val="18"/>
+        </w:rPr>
+        <w:t>En cas de contestation par le client des conditions d’exercice de la mission ou de différend sur les honoraires, l’expert-comptable s’efforce de faire accepter la conciliation ou l’arbitrage du président du conseil régional de l’ordre avant toute action en justice</w:t>
+      </w:r>
+      <w:r>
+        <w:rPr>
+          <w:rFonts w:eastAsia="Verdana"/>
+          <w:sz w:val="18"/>
+          <w:szCs w:val="18"/>
+          <w:vertAlign w:val="superscript"/>
+        </w:rPr>
+        <w:footnoteReference w:id="6"/>
+      </w:r>
+      <w:r>
+        <w:rPr>
+          <w:rFonts w:eastAsia="Verdana"/>
+          <w:sz w:val="18"/>
+          <w:szCs w:val="18"/>
+        </w:rPr>
+        <w:t xml:space="preserve">. </w:t>
+      </w:r>
+    </w:p>
+    <w:p>
+      <w:pPr>
+        <w:rPr>
+          <w:rFonts w:eastAsia="Verdana"/>
+          <w:sz w:val="18"/>
+          <w:szCs w:val="18"/>
+        </w:rPr>
+      </w:pPr>
+    </w:p>
+    <w:p>
+      <w:pPr>
+        <w:pStyle w:val="Titre3"/>
+        <w:rPr>
+          <w:sz w:val="18"/>
+          <w:szCs w:val="18"/>
+        </w:rPr>
+      </w:pPr>
+      <w:r>
+        <w:rPr>
+          <w:sz w:val="18"/>
+          <w:szCs w:val="18"/>
+        </w:rPr>
+        <w:t>1</w:t>
+      </w:r>
+      <w:r>
+        <w:rPr>
+          <w:sz w:val="18"/>
+          <w:szCs w:val="18"/>
+        </w:rPr>
+        <w:t>2</w:t>
+      </w:r>
+      <w:r>
+        <w:rPr>
+          <w:sz w:val="18"/>
+          <w:szCs w:val="18"/>
+        </w:rPr>
+        <w:t>- DROIT APPLICABLE ET ATTRIBUTION DE COMPETENCE</w:t>
+      </w:r>
+    </w:p>
+    <w:p>
+      <w:pPr>
+        <w:rPr>
+          <w:rFonts w:eastAsia="Verdana"/>
+          <w:sz w:val="18"/>
+          <w:szCs w:val="18"/>
+        </w:rPr>
+      </w:pPr>
+      <w:r>
+        <w:rPr>
+          <w:rFonts w:eastAsia="Verdana"/>
+          <w:sz w:val="18"/>
+          <w:szCs w:val="18"/>
+        </w:rPr>
+        <w:t>Ce contrat de mission sera régi et interprété selon le droit français.</w:t>
+      </w:r>
+    </w:p>
+    <w:p>
+      <w:pPr>
+        <w:rPr>
+          <w:rFonts w:eastAsia="Verdana"/>
+          <w:sz w:val="18"/>
+          <w:szCs w:val="18"/>
+        </w:rPr>
+      </w:pPr>
+      <w:r>
+        <w:rPr>
+          <w:rFonts w:eastAsia="Verdana"/>
+          <w:sz w:val="18"/>
+          <w:szCs w:val="18"/>
+        </w:rPr>
+        <w:t>« TOUS LES LITIGES AUXQUELS LE CONTRAT POURRA DONNER LIEU, NOTAMMENT AU SUJET DE SA VALIDITE, DE SON INTERPRETATION, DE SON EXECUTION ET DE SA REALISATION, SERONT SOUMIS AUX TRIBUNAUX COMPETENTS DE PARIS »</w:t>
+      </w:r>
+    </w:p>
+    <w:sectPr>
+      <w:type w:val="continuous"/>
+      <w:pgSz w:w="11909" w:h="16834"/>
+      <w:pgMar w:top="1417" w:right="1417" w:bottom="1417" w:left="1417" w:header="567" w:footer="0" w:gutter="0"/>
+      <w:cols w:num="2" w:space="709"/>
+      <w:noEndnote/>
+      <w:docGrid w:linePitch="326"/>
+    </w:sectPr>
+  </w:body>
+</w:document>
 </file>
 
 <file path=word/endnotes.xml><?xml version="1.0" encoding="utf-8"?>

</xml_diff>